<commit_message>
results local runs PSCRS
</commit_message>
<xml_diff>
--- a/Single-cell miRNA activity inference progress report and tool comparison.docx
+++ b/Single-cell miRNA activity inference progress report and tool comparison.docx
@@ -1,25 +1,18 @@
 
 <file path=word/document.xml><?xml version="1.0" encoding="utf-8"?>
-<w:document xmlns:w="http://schemas.openxmlformats.org/wordprocessingml/2006/main" xmlns:r="http://schemas.openxmlformats.org/officeDocument/2006/relationships" xmlns:wp="http://schemas.openxmlformats.org/drawingml/2006/wordprocessingDrawing" xmlns:a="http://schemas.openxmlformats.org/drawingml/2006/main" xmlns:pic="http://schemas.openxmlformats.org/drawingml/2006/picture">
+<w:document xmlns:wpc="http://schemas.microsoft.com/office/word/2010/wordprocessingCanvas" xmlns:cx="http://schemas.microsoft.com/office/drawing/2014/chartex" xmlns:cx1="http://schemas.microsoft.com/office/drawing/2015/9/8/chartex" xmlns:cx2="http://schemas.microsoft.com/office/drawing/2015/10/21/chartex" xmlns:cx3="http://schemas.microsoft.com/office/drawing/2016/5/9/chartex" xmlns:cx4="http://schemas.microsoft.com/office/drawing/2016/5/10/chartex" xmlns:cx5="http://schemas.microsoft.com/office/drawing/2016/5/11/chartex" xmlns:cx6="http://schemas.microsoft.com/office/drawing/2016/5/12/chartex" xmlns:cx7="http://schemas.microsoft.com/office/drawing/2016/5/13/chartex" xmlns:cx8="http://schemas.microsoft.com/office/drawing/2016/5/14/chartex" xmlns:mc="http://schemas.openxmlformats.org/markup-compatibility/2006" xmlns:m="http://schemas.openxmlformats.org/officeDocument/2006/math" xmlns:aink="http://schemas.microsoft.com/office/drawing/2016/ink" xmlns:am3d="http://schemas.microsoft.com/office/drawing/2017/model3d" xmlns:oel="http://schemas.microsoft.com/office/2019/extlst" xmlns:r="http://schemas.openxmlformats.org/officeDocument/2006/relationships" xmlns:wp14="http://schemas.microsoft.com/office/word/2010/wordprocessingDrawing" xmlns:wp="http://schemas.openxmlformats.org/drawingml/2006/wordprocessingDrawing" xmlns:wpg="http://schemas.microsoft.com/office/word/2010/wordprocessingGroup" xmlns:wpi="http://schemas.microsoft.com/office/word/2010/wordprocessingInk" xmlns:wps="http://schemas.microsoft.com/office/word/2010/wordprocessingShape" xmlns:o="urn:schemas-microsoft-com:office:office" xmlns:v="urn:schemas-microsoft-com:vml" xmlns:w10="urn:schemas-microsoft-com:office:word" xmlns:w="http://schemas.openxmlformats.org/wordprocessingml/2006/main" xmlns:w14="http://schemas.microsoft.com/office/word/2010/wordml" xmlns:w15="http://schemas.microsoft.com/office/word/2012/wordml" xmlns:w16cex="http://schemas.microsoft.com/office/word/2018/wordml/cex" xmlns:w16cid="http://schemas.microsoft.com/office/word/2016/wordml/cid" xmlns:w16="http://schemas.microsoft.com/office/word/2018/wordml" xmlns:w16sdtdh="http://schemas.microsoft.com/office/word/2020/wordml/sdtdatahash" xmlns:w16sdtfl="http://schemas.microsoft.com/office/word/2024/wordml/sdtformatlock" xmlns:w16se="http://schemas.microsoft.com/office/word/2015/wordml/symex" xmlns:w16du="http://schemas.microsoft.com/office/word/2023/wordml/word16du" xmlns:wne="http://schemas.microsoft.com/office/word/2006/wordml" mc:Ignorable="w14 w15 w16se w16cid w16 w16cex w16sdtdh w16sdtfl w16du wp14">
   <w:body>
     <w:p>
       <w:pPr>
         <w:pStyle w:val="Heading1"/>
       </w:pPr>
       <w:r>
-        <w:t xml:space="preserve">Single-cell miRNA activity inference: progress report and tool comparison</w:t>
-      </w:r>
-    </w:p>
-    <w:p>
-      <w:pPr/>
-      <w:r>
-        <w:t xml:space="preserve">Sep 28, 2026</w:t>
-      </w:r>
-      <w:r>
-        <w:t xml:space="preserve"> · </w:t>
-      </w:r>
-      <w:r>
-        <w:t xml:space="preserve">@Panos</w:t>
+        <w:t>Single-cell miRNA activity inference: progress report and tool comparison</w:t>
+      </w:r>
+    </w:p>
+    <w:p>
+      <w:r>
+        <w:t>Sep 28, 2026 · @Panos</w:t>
       </w:r>
     </w:p>
     <w:p>
@@ -27,22 +20,89 @@
         <w:pStyle w:val="Heading2"/>
       </w:pPr>
       <w:r>
-        <w:t xml:space="preserve">Summary and current status</w:t>
-      </w:r>
-    </w:p>
-    <w:p>
-      <w:pPr/>
-      <w:r>
-        <w:t xml:space="preserve">On the in-house HEK293 Smart-seq3 data, our aggregative miR-124-3p score reaches Spearman rho 0.767 against eGFP expression. That is close to miReact in TarBase mode (0.736), but only with scran normalization and a well-ranked target list. We benchmarked it against three published tools (miReact, bayesReact, miTEA-HiRes) and repeated the test on mouse ESC Drosha-knockout data. Results for bayesReact, miReact motif mode and miTEA-HiRes are computed but not yet reviewed, so numbers appear below only where we have seen them.</w:t>
-      </w:r>
-    </w:p>
-    <w:p>
-      <w:pPr/>
+        <w:t xml:space="preserve">Summary and </w:t>
+      </w:r>
+      <w:proofErr w:type="gramStart"/>
+      <w:r>
+        <w:t>current status</w:t>
+      </w:r>
+      <w:proofErr w:type="gramEnd"/>
+    </w:p>
+    <w:p>
+      <w:r>
+        <w:t xml:space="preserve">On the in-house HEK293 Smart-seq3 data, our aggregative miR-124-3p score reaches Spearman rho 0.767 against </w:t>
+      </w:r>
+      <w:proofErr w:type="spellStart"/>
+      <w:r>
+        <w:t>eGFP</w:t>
+      </w:r>
+      <w:proofErr w:type="spellEnd"/>
+      <w:r>
+        <w:t xml:space="preserve"> expression. That is close to </w:t>
+      </w:r>
+      <w:proofErr w:type="spellStart"/>
+      <w:r>
+        <w:t>miReact</w:t>
+      </w:r>
+      <w:proofErr w:type="spellEnd"/>
+      <w:r>
+        <w:t xml:space="preserve"> in TarBase mode (0.736), but only with scran normalization and a well-ranked target list. We benchmarked it against three published tools (</w:t>
+      </w:r>
+      <w:proofErr w:type="spellStart"/>
+      <w:r>
+        <w:t>miReact</w:t>
+      </w:r>
+      <w:proofErr w:type="spellEnd"/>
+      <w:r>
+        <w:t xml:space="preserve">, </w:t>
+      </w:r>
+      <w:proofErr w:type="spellStart"/>
+      <w:r>
+        <w:t>bayesReact</w:t>
+      </w:r>
+      <w:proofErr w:type="spellEnd"/>
+      <w:r>
+        <w:t xml:space="preserve">, </w:t>
+      </w:r>
+      <w:proofErr w:type="spellStart"/>
+      <w:r>
+        <w:t>miTEA-HiRes</w:t>
+      </w:r>
+      <w:proofErr w:type="spellEnd"/>
+      <w:r>
+        <w:t xml:space="preserve">) and repeated the test on mouse ESC Drosha-knockout data. Results for </w:t>
+      </w:r>
+      <w:proofErr w:type="spellStart"/>
+      <w:r>
+        <w:t>bayesReact</w:t>
+      </w:r>
+      <w:proofErr w:type="spellEnd"/>
+      <w:r>
+        <w:t xml:space="preserve">, </w:t>
+      </w:r>
+      <w:proofErr w:type="spellStart"/>
+      <w:r>
+        <w:t>miReact</w:t>
+      </w:r>
+      <w:proofErr w:type="spellEnd"/>
+      <w:r>
+        <w:t xml:space="preserve"> motif mode and </w:t>
+      </w:r>
+      <w:proofErr w:type="spellStart"/>
+      <w:r>
+        <w:t>miTEA-HiRes</w:t>
+      </w:r>
+      <w:proofErr w:type="spellEnd"/>
+      <w:r>
+        <w:t xml:space="preserve"> are computed but not yet reviewed, so numbers appear below only where we have seen them.</w:t>
+      </w:r>
+    </w:p>
+    <w:p>
       <w:r>
         <w:rPr>
           <w:b/>
         </w:rPr>
-        <w:t xml:space="preserve">Established</w:t>
+        <w:t>Established</w:t>
       </w:r>
     </w:p>
     <w:p>
@@ -54,7 +114,7 @@
         </w:numPr>
       </w:pPr>
       <w:r>
-        <w:t xml:space="preserve">CPM normalization inflated correlations: random gene sets correlated with GFP at a median rho of 0.39, versus 0.05 after scran normalization, while real targets stayed strong (roughly 0.72 to 0.77).</w:t>
+        <w:t>CPM normalization inflated correlations: random gene sets correlated with GFP at a median rho of 0.39, versus 0.05 after scran normalization, while real targets stayed strong (roughly 0.72 to 0.77).</w:t>
       </w:r>
     </w:p>
     <w:p>
@@ -66,7 +126,23 @@
         </w:numPr>
       </w:pPr>
       <w:r>
-        <w:t xml:space="preserve">Our summation-based score depends on target-list quality: the top 200 TargetScan targets give rho 0.767, the full unranked TarBase list gives 0.156. miReact stays at 0.736 on that same TarBase list.</w:t>
+        <w:t xml:space="preserve">Our summation-based score depends on target-list quality: the top 200 </w:t>
+      </w:r>
+      <w:proofErr w:type="spellStart"/>
+      <w:r>
+        <w:t>TargetScan</w:t>
+      </w:r>
+      <w:proofErr w:type="spellEnd"/>
+      <w:r>
+        <w:t xml:space="preserve"> targets give rho 0.767, the full unranked TarBase list gives 0.156. </w:t>
+      </w:r>
+      <w:proofErr w:type="spellStart"/>
+      <w:r>
+        <w:t>miReact</w:t>
+      </w:r>
+      <w:proofErr w:type="spellEnd"/>
+      <w:r>
+        <w:t xml:space="preserve"> stays at 0.736 on that same TarBase list.</w:t>
       </w:r>
     </w:p>
     <w:p>
@@ -78,16 +154,15 @@
         </w:numPr>
       </w:pPr>
       <w:r>
-        <w:t xml:space="preserve">Accuracy rises smoothly with sequencing depth and flattens above about 50,000 reads per cell (median rho about 0.77 at 50,000 and 0.80 at 100,000 reads).</w:t>
-      </w:r>
-    </w:p>
-    <w:p>
-      <w:pPr/>
+        <w:t>Accuracy rises smoothly with sequencing depth and flattens above about 50,000 reads per cell (median rho about 0.77 at 50,000 and 0.80 at 100,000 reads).</w:t>
+      </w:r>
+    </w:p>
+    <w:p>
       <w:r>
         <w:rPr>
           <w:b/>
         </w:rPr>
-        <w:t xml:space="preserve">Preliminary</w:t>
+        <w:t>Preliminary</w:t>
       </w:r>
     </w:p>
     <w:p>
@@ -99,7 +174,15 @@
         </w:numPr>
       </w:pPr>
       <w:r>
-        <w:t xml:space="preserve">Filtering targets by co-expression (35 genes kept) gave rho 0.762, near the top-200 result. A rank-tie bug was found in the correlation code, and the random-gene control has not been run.</w:t>
+        <w:t xml:space="preserve">Filtering targets by co-expression (35 genes kept) gave rho 0.762, near the </w:t>
+      </w:r>
+      <w:proofErr w:type="gramStart"/>
+      <w:r>
+        <w:t>top-200</w:t>
+      </w:r>
+      <w:proofErr w:type="gramEnd"/>
+      <w:r>
+        <w:t xml:space="preserve"> result. A rank-tie bug was found in the correlation code, and the random-gene control has not been run.</w:t>
       </w:r>
     </w:p>
     <w:p>
@@ -111,16 +194,15 @@
         </w:numPr>
       </w:pPr>
       <w:r>
-        <w:t xml:space="preserve">The mouse ESC Drosha-KO comparison across all four methods is scripted; its numbers are not reviewed here.</w:t>
-      </w:r>
-    </w:p>
-    <w:p>
-      <w:pPr/>
+        <w:t>The mouse ESC Drosha-KO comparison across all four methods is scripted; its numbers are not reviewed here.</w:t>
+      </w:r>
+    </w:p>
+    <w:p>
       <w:r>
         <w:rPr>
           <w:b/>
         </w:rPr>
-        <w:t xml:space="preserve">Open</w:t>
+        <w:t>Open</w:t>
       </w:r>
     </w:p>
     <w:p>
@@ -132,7 +214,7 @@
         </w:numPr>
       </w:pPr>
       <w:r>
-        <w:t xml:space="preserve">Whether rank-based tools are more prone to false positives than our score. A negative-control test is designed but not run.</w:t>
+        <w:t>Whether rank-based tools are more prone to false positives than our score. A negative-control test is designed but not run.</w:t>
       </w:r>
     </w:p>
     <w:p>
@@ -144,7 +226,7 @@
         </w:numPr>
       </w:pPr>
       <w:r>
-        <w:t xml:space="preserve">The per-cell comparison with real single-cell miRNA sequencing, blocked on matching FACS and mRNA data to the 96-well plate.</w:t>
+        <w:t>The per-cell comparison with real single-cell miRNA sequencing, blocked on matching FACS and mRNA data to the 96-well plate.</w:t>
       </w:r>
     </w:p>
     <w:p>
@@ -156,7 +238,23 @@
         </w:numPr>
       </w:pPr>
       <w:r>
-        <w:t xml:space="preserve">Two further tools (miDGD, miRSCAPE) were investigated and set aside.</w:t>
+        <w:t>Two further tools (</w:t>
+      </w:r>
+      <w:proofErr w:type="spellStart"/>
+      <w:r>
+        <w:t>miDGD</w:t>
+      </w:r>
+      <w:proofErr w:type="spellEnd"/>
+      <w:r>
+        <w:t xml:space="preserve">, </w:t>
+      </w:r>
+      <w:proofErr w:type="spellStart"/>
+      <w:r>
+        <w:t>miRSCAPE</w:t>
+      </w:r>
+      <w:proofErr w:type="spellEnd"/>
+      <w:r>
+        <w:t>) were investigated and set aside.</w:t>
       </w:r>
     </w:p>
     <w:p>
@@ -164,41 +262,144 @@
         <w:pStyle w:val="Heading2"/>
       </w:pPr>
       <w:r>
-        <w:t xml:space="preserve">Background, goal, and our aggregative method</w:t>
-      </w:r>
-    </w:p>
-    <w:p>
-      <w:pPr/>
-      <w:r>
-        <w:t xml:space="preserve">miRNAs repress their target mRNAs, so a cell's miRNA activity should leave a footprint in its own transcriptome. One miRNA can target hundreds of genes, and together miRNAs regulate around 60% of mRNAs. Direct single-cell miRNA sequencing detects only about 1% of molecules because of sampling noise, whereas scRNA-seq detects about 60% of mRNAs, so inferring activity from target repression is attractive.</w:t>
-      </w:r>
-    </w:p>
-    <w:p>
-      <w:pPr/>
-      <w:r>
-        <w:t xml:space="preserve">Our method scores each cell by the total expression of a miRNA's predicted targets. Targets come from TargetScan, ranked by cumulative weighted context++ score (more negative means stronger predicted repression). With target set T, expression x, and the mean over all cells written as S-bar:</w:t>
+        <w:t>Background, goal, and our aggregative method</w:t>
+      </w:r>
+    </w:p>
+    <w:p>
+      <w:r>
+        <w:t xml:space="preserve">miRNAs repress their target mRNAs, so a cell's miRNA activity should leave a footprint in its own transcriptome. One miRNA can target hundreds of genes, and together miRNAs regulate around 60% of mRNAs. Direct single-cell miRNA sequencing detects only about 1% of molecules because of sampling </w:t>
+      </w:r>
+      <w:r>
+        <w:lastRenderedPageBreak/>
+        <w:t xml:space="preserve">noise, whereas </w:t>
+      </w:r>
+      <w:proofErr w:type="spellStart"/>
+      <w:r>
+        <w:t>scRNA</w:t>
+      </w:r>
+      <w:proofErr w:type="spellEnd"/>
+      <w:r>
+        <w:t>-seq detects about 60% of mRNAs, so inferring activity from target repression is attractive.</w:t>
+      </w:r>
+    </w:p>
+    <w:p>
+      <w:r>
+        <w:t xml:space="preserve">Our method scores each cell by the total expression of a miRNA's predicted targets. Targets come from </w:t>
+      </w:r>
+      <w:proofErr w:type="spellStart"/>
+      <w:r>
+        <w:t>TargetScan</w:t>
+      </w:r>
+      <w:proofErr w:type="spellEnd"/>
+      <w:r>
+        <w:t>, ranked by cumulative weighted context++ score (more negative means stronger predicted repression). With target set T, expression x, and the mean over all cells written as S-bar:</w:t>
       </w:r>
     </w:p>
     <w:p>
       <w:pPr>
         <w:pStyle w:val="Code"/>
       </w:pPr>
-      <w:bookmarkStart w:id="1" w:name="bongo_lang_latex_1"/>
-      <w:bookmarkEnd w:id="1"/>
-      <w:r>
-        <w:t xml:space="preserve">S_c = \sum_{g \in T} x_{g,c}, \qquad \mathrm{activity}_c = -\log_2\!\left(\frac{S_c}{\bar{S}}\right) + 1</w:t>
-      </w:r>
-    </w:p>
-    <w:p>
-      <w:pPr/>
-      <w:r>
-        <w:t xml:space="preserve">Higher activity means lower target expression, that is, more repression. In the mESC knockout analysis the denominator is instead the mean over knockout cells, which serve as a de-repressed baseline, and the +1 offset is dropped (it does not change group separation).</w:t>
-      </w:r>
-    </w:p>
-    <w:p>
-      <w:pPr/>
-      <w:r>
-        <w:t xml:space="preserve">The original manuscript draft validated the idea in mESCs with and without Drosha, a K562 split-cell dataset (19 cells, miR-92), a shallow 10x HEK293 reporter dataset (miR-199), and simulated Poisson-limited direct sequencing. The current work adds a new in-house HEK293 Smart-seq3 reporter experiment and a systematic comparison with other tools.</w:t>
+      <w:bookmarkStart w:id="0" w:name="bongo_lang_latex_1"/>
+      <w:bookmarkEnd w:id="0"/>
+      <w:proofErr w:type="spellStart"/>
+      <w:r>
+        <w:t>S_c</w:t>
+      </w:r>
+      <w:proofErr w:type="spellEnd"/>
+      <w:r>
+        <w:t xml:space="preserve"> = \sum</w:t>
+      </w:r>
+      <w:proofErr w:type="gramStart"/>
+      <w:r>
+        <w:t>_{</w:t>
+      </w:r>
+      <w:proofErr w:type="gramEnd"/>
+      <w:r>
+        <w:t>g \in T} x_{</w:t>
+      </w:r>
+      <w:proofErr w:type="spellStart"/>
+      <w:proofErr w:type="gramStart"/>
+      <w:r>
+        <w:t>g,c</w:t>
+      </w:r>
+      <w:proofErr w:type="spellEnd"/>
+      <w:proofErr w:type="gramEnd"/>
+      <w:r>
+        <w:t>}, \</w:t>
+      </w:r>
+      <w:proofErr w:type="spellStart"/>
+      <w:r>
+        <w:t>qquad</w:t>
+      </w:r>
+      <w:proofErr w:type="spellEnd"/>
+      <w:r>
+        <w:t xml:space="preserve"> \</w:t>
+      </w:r>
+      <w:proofErr w:type="spellStart"/>
+      <w:r>
+        <w:t>mathrm</w:t>
+      </w:r>
+      <w:proofErr w:type="spellEnd"/>
+      <w:r>
+        <w:t>{activity}_c = -</w:t>
+      </w:r>
+      <w:proofErr w:type="gramStart"/>
+      <w:r>
+        <w:t>\log_2\!\</w:t>
+      </w:r>
+      <w:proofErr w:type="gramEnd"/>
+      <w:r>
+        <w:t>left(\frac{</w:t>
+      </w:r>
+      <w:proofErr w:type="spellStart"/>
+      <w:r>
+        <w:t>S_</w:t>
+      </w:r>
+      <w:proofErr w:type="gramStart"/>
+      <w:r>
+        <w:t>c</w:t>
+      </w:r>
+      <w:proofErr w:type="spellEnd"/>
+      <w:r>
+        <w:t>}{</w:t>
+      </w:r>
+      <w:proofErr w:type="gramEnd"/>
+      <w:r>
+        <w:t>\bar{S</w:t>
+      </w:r>
+      <w:proofErr w:type="gramStart"/>
+      <w:r>
+        <w:t>}}\</w:t>
+      </w:r>
+      <w:proofErr w:type="gramEnd"/>
+      <w:r>
+        <w:t>right) + 1</w:t>
+      </w:r>
+    </w:p>
+    <w:p>
+      <w:r>
+        <w:t xml:space="preserve">Higher activity means lower target expression, that is, more repression. In the </w:t>
+      </w:r>
+      <w:proofErr w:type="spellStart"/>
+      <w:r>
+        <w:t>mESC</w:t>
+      </w:r>
+      <w:proofErr w:type="spellEnd"/>
+      <w:r>
+        <w:t xml:space="preserve"> knockout analysis the denominator is instead the mean over knockout cells, which serve as a de-repressed baseline, and the +1 offset is dropped (it does not change group separation).</w:t>
+      </w:r>
+    </w:p>
+    <w:p>
+      <w:r>
+        <w:t xml:space="preserve">The original manuscript draft validated the idea in </w:t>
+      </w:r>
+      <w:proofErr w:type="spellStart"/>
+      <w:r>
+        <w:t>mESCs</w:t>
+      </w:r>
+      <w:proofErr w:type="spellEnd"/>
+      <w:r>
+        <w:t xml:space="preserve"> with and without Drosha, a K562 split-cell dataset (19 cells, miR-92), a shallow 10x HEK293 reporter dataset (miR-199), and simulated Poisson-limited direct sequencing. The current work adds a new in-house HEK293 Smart-seq3 reporter experiment and a systematic comparison with other tools.</w:t>
       </w:r>
     </w:p>
     <w:p>
@@ -206,25 +407,54 @@
         <w:pStyle w:val="Heading2"/>
       </w:pPr>
       <w:r>
-        <w:t xml:space="preserve">Data and ground truth</w:t>
-      </w:r>
-    </w:p>
-    <w:p>
-      <w:pPr/>
-      <w:r>
-        <w:t xml:space="preserve">The main dataset is 753 HEK293 cells sequenced with Smart-seq3 across three plates (101, 103, 105), expressing miR-124 and eGFP from a bidirectional promoter. Counts are UMI-deduplicated intron-plus-exon counts from zUMIs. After scran normalization, restricted to protein-coding genes with under 75% zeros, the matrix holds 10,785 genes; 143 of the top 200 TargetScan miR-124-3p targets remain in it.</w:t>
-      </w:r>
-    </w:p>
-    <w:p>
-      <w:pPr/>
-      <w:r>
-        <w:t xml:space="preserve">The ground truth used so far is eGFP expression from the same Smart-seq3 libraries (scran-normalized). Each method's activity score is correlated with it by Spearman rho, after excluding cells above the 99th GFP percentile (745 cells remain). This is GFP mRNA, not protein fluorescence, so it shares technical variation with the mRNA-based predictors, which matters for the confound findings below.</w:t>
-      </w:r>
-    </w:p>
-    <w:p>
-      <w:pPr/>
-      <w:r>
-        <w:t xml:space="preserve">Three further data sources exist but are not yet in the HEK293 comparisons:</w:t>
+        <w:t>Data and ground truth</w:t>
+      </w:r>
+    </w:p>
+    <w:p>
+      <w:r>
+        <w:t xml:space="preserve">The main dataset is 753 HEK293 cells sequenced with Smart-seq3 across three plates (101, 103, 105), expressing miR-124 and </w:t>
+      </w:r>
+      <w:proofErr w:type="spellStart"/>
+      <w:r>
+        <w:t>eGFP</w:t>
+      </w:r>
+      <w:proofErr w:type="spellEnd"/>
+      <w:r>
+        <w:t xml:space="preserve"> from a bidirectional promoter. Counts are UMI-deduplicated intron-plus-exon counts from </w:t>
+      </w:r>
+      <w:proofErr w:type="spellStart"/>
+      <w:r>
+        <w:t>zUMIs</w:t>
+      </w:r>
+      <w:proofErr w:type="spellEnd"/>
+      <w:r>
+        <w:t xml:space="preserve">. After scran normalization, restricted to protein-coding genes with under 75% zeros, the matrix holds 10,785 genes; 143 of the top 200 </w:t>
+      </w:r>
+      <w:proofErr w:type="spellStart"/>
+      <w:r>
+        <w:t>TargetScan</w:t>
+      </w:r>
+      <w:proofErr w:type="spellEnd"/>
+      <w:r>
+        <w:t xml:space="preserve"> miR-124-3p targets remain in it.</w:t>
+      </w:r>
+    </w:p>
+    <w:p>
+      <w:r>
+        <w:t xml:space="preserve">The ground truth used so far is </w:t>
+      </w:r>
+      <w:proofErr w:type="spellStart"/>
+      <w:r>
+        <w:t>eGFP</w:t>
+      </w:r>
+      <w:proofErr w:type="spellEnd"/>
+      <w:r>
+        <w:t xml:space="preserve"> expression from the same Smart-seq3 libraries (scran-normalized). Each method's activity score is correlated with it by Spearman rho, after excluding cells above the 99th GFP percentile (745 cells remain). This is GFP mRNA, not protein fluorescence, so it shares technical variation with the mRNA-based predictors, which matters for the confound findings below.</w:t>
+      </w:r>
+    </w:p>
+    <w:p>
+      <w:r>
+        <w:t>Three further data sources exist but are not yet in the HEK293 comparisons:</w:t>
       </w:r>
     </w:p>
     <w:p>
@@ -239,10 +469,18 @@
         <w:rPr>
           <w:b/>
         </w:rPr>
-        <w:t xml:space="preserve">GFP fluorescence</w:t>
-      </w:r>
-      <w:r>
-        <w:t xml:space="preserve">: FACS index-sort values (FITC-A channel, read with flowCore) for the 384-well Smart-seq3 plates; fluorescence files exist for plates 101, 103 and 105.</w:t>
+        <w:t>GFP fluorescence</w:t>
+      </w:r>
+      <w:r>
+        <w:t xml:space="preserve">: FACS index-sort values (FITC-A channel, read with </w:t>
+      </w:r>
+      <w:proofErr w:type="spellStart"/>
+      <w:r>
+        <w:t>flowCore</w:t>
+      </w:r>
+      <w:proofErr w:type="spellEnd"/>
+      <w:r>
+        <w:t>) for the 384-well Smart-seq3 plates; fluorescence files exist for plates 101, 103 and 105.</w:t>
       </w:r>
     </w:p>
     <w:p>
@@ -257,10 +495,10 @@
         <w:rPr>
           <w:b/>
         </w:rPr>
-        <w:t xml:space="preserve">Direct miRNA sequencing</w:t>
-      </w:r>
-      <w:r>
-        <w:t xml:space="preserve">: a separate 96-well plate, with columns 7 to 12 sequenced in run 2 and miR-124-3p counts extracted per well.</w:t>
+        <w:t>Direct miRNA sequencing</w:t>
+      </w:r>
+      <w:r>
+        <w:t>: a separate 96-well plate, with columns 7 to 12 sequenced in run 2 and miR-124-3p counts extracted per well.</w:t>
       </w:r>
     </w:p>
     <w:p>
@@ -275,10 +513,10 @@
         <w:rPr>
           <w:b/>
         </w:rPr>
-        <w:t xml:space="preserve">Mouse ESC data</w:t>
-      </w:r>
-      <w:r>
-        <w:t xml:space="preserve">: control and Drosha-knockout cells with a phenotype table, used for the knockout separation test.</w:t>
+        <w:t>Mouse ESC data</w:t>
+      </w:r>
+      <w:r>
+        <w:t>: control and Drosha-knockout cells with a phenotype table, used for the knockout separation test.</w:t>
       </w:r>
     </w:p>
     <w:p>
@@ -286,13 +524,12 @@
         <w:pStyle w:val="Heading2"/>
       </w:pPr>
       <w:r>
-        <w:t xml:space="preserve">The tools compared and how they differ</w:t>
-      </w:r>
-    </w:p>
-    <w:p>
-      <w:pPr/>
-      <w:r>
-        <w:t xml:space="preserve">The tools differ mainly in how they define targets and in whether they sum expression or use ranks, so they answer slightly different questions.</w:t>
+        <w:t>The tools compared and how they differ</w:t>
+      </w:r>
+    </w:p>
+    <w:p>
+      <w:r>
+        <w:t>The tools differ mainly in how they define targets and in whether they sum expression or use ranks, so they answer slightly different questions.</w:t>
       </w:r>
     </w:p>
     <w:tbl>
@@ -300,7 +537,7 @@
         <w:tblStyle w:val="TableGrid"/>
         <w:tblW w:w="0" w:type="auto"/>
         <w:tblLayout w:type="fixed"/>
-        <w:tblLook w:val="04A0" w:firstRow="1" w:lastRow="0" w:firstColumn="0" w:lastColumn="0" w:noHBand="0" w:noVBand="1"/>
+        <w:tblLook w:val="0420" w:firstRow="1" w:lastRow="0" w:firstColumn="0" w:lastColumn="0" w:noHBand="0" w:noVBand="1"/>
       </w:tblPr>
       <w:tblGrid>
         <w:gridCol w:w="2340"/>
@@ -318,9 +555,8 @@
             <w:shd w:val="clear" w:color="auto" w:fill="F2F2F2"/>
           </w:tcPr>
           <w:p>
-            <w:pPr/>
-            <w:r>
-              <w:t xml:space="preserve">Tool</w:t>
+            <w:r>
+              <w:t>Tool</w:t>
             </w:r>
           </w:p>
         </w:tc>
@@ -330,9 +566,8 @@
             <w:shd w:val="clear" w:color="auto" w:fill="F2F2F2"/>
           </w:tcPr>
           <w:p>
-            <w:pPr/>
-            <w:r>
-              <w:t xml:space="preserve">What it computes per cell</w:t>
+            <w:r>
+              <w:t>What it computes per cell</w:t>
             </w:r>
           </w:p>
         </w:tc>
@@ -342,9 +577,8 @@
             <w:shd w:val="clear" w:color="auto" w:fill="F2F2F2"/>
           </w:tcPr>
           <w:p>
-            <w:pPr/>
-            <w:r>
-              <w:t xml:space="preserve">How targets are defined</w:t>
+            <w:r>
+              <w:t>How targets are defined</w:t>
             </w:r>
           </w:p>
         </w:tc>
@@ -354,9 +588,8 @@
             <w:shd w:val="clear" w:color="auto" w:fill="F2F2F2"/>
           </w:tcPr>
           <w:p>
-            <w:pPr/>
-            <w:r>
-              <w:t xml:space="preserve">Setup and compute notes</w:t>
+            <w:r>
+              <w:t>Setup and compute notes</w:t>
             </w:r>
           </w:p>
         </w:tc>
@@ -367,9 +600,8 @@
             <w:tcW w:w="2340" w:type="dxa"/>
           </w:tcPr>
           <w:p>
-            <w:pPr/>
-            <w:r>
-              <w:t xml:space="preserve">Our method (aggregative)</w:t>
+            <w:r>
+              <w:t>Our method (aggregative)</w:t>
             </w:r>
           </w:p>
         </w:tc>
@@ -378,9 +610,12 @@
             <w:tcW w:w="2340" w:type="dxa"/>
           </w:tcPr>
           <w:p>
-            <w:pPr/>
-            <w:r>
-              <w:t xml:space="preserve">Sum of target expression, divided by the cell mean, then -log2</w:t>
+            <w:r>
+              <w:t xml:space="preserve">Sum of target expression, divided by </w:t>
+            </w:r>
+            <w:r>
+              <w:lastRenderedPageBreak/>
+              <w:t>the cell mean, then -log2</w:t>
             </w:r>
           </w:p>
         </w:tc>
@@ -389,9 +624,29 @@
             <w:tcW w:w="2340" w:type="dxa"/>
           </w:tcPr>
           <w:p>
-            <w:pPr/>
-            <w:r>
-              <w:t xml:space="preserve">Any gene list; TargetScan ranked by context score (TarBase and miRTarBase also tested)</w:t>
+            <w:r>
+              <w:lastRenderedPageBreak/>
+              <w:t xml:space="preserve">Any gene list; </w:t>
+            </w:r>
+            <w:proofErr w:type="spellStart"/>
+            <w:r>
+              <w:t>TargetScan</w:t>
+            </w:r>
+            <w:proofErr w:type="spellEnd"/>
+            <w:r>
+              <w:t xml:space="preserve"> ranked by </w:t>
+            </w:r>
+            <w:r>
+              <w:lastRenderedPageBreak/>
+              <w:t xml:space="preserve">context score (TarBase and </w:t>
+            </w:r>
+            <w:proofErr w:type="spellStart"/>
+            <w:r>
+              <w:t>miRTarBase</w:t>
+            </w:r>
+            <w:proofErr w:type="spellEnd"/>
+            <w:r>
+              <w:t xml:space="preserve"> also tested)</w:t>
             </w:r>
           </w:p>
         </w:tc>
@@ -400,9 +655,9 @@
             <w:tcW w:w="2340" w:type="dxa"/>
           </w:tcPr>
           <w:p>
-            <w:pPr/>
-            <w:r>
-              <w:t xml:space="preserve">Trivial compute; every target weighted equally</w:t>
+            <w:r>
+              <w:lastRenderedPageBreak/>
+              <w:t>Trivial compute; every target weighted equally</w:t>
             </w:r>
           </w:p>
         </w:tc>
@@ -413,17 +668,18 @@
             <w:tcW w:w="2340" w:type="dxa"/>
           </w:tcPr>
           <w:p>
-            <w:pPr/>
-            <w:hyperlink r:id="rId3" w:history="1">
+            <w:hyperlink r:id="rId5" w:history="1">
+              <w:proofErr w:type="spellStart"/>
               <w:r>
                 <w:rPr>
                   <w:rStyle w:val="Hyperlink"/>
                 </w:rPr>
-                <w:t xml:space="preserve">miReact</w:t>
+                <w:t>miReact</w:t>
               </w:r>
+              <w:proofErr w:type="spellEnd"/>
             </w:hyperlink>
             <w:r>
-              <w:t xml:space="preserve">, TarBase mode</w:t>
+              <w:t>, TarBase mode</w:t>
             </w:r>
           </w:p>
         </w:tc>
@@ -432,9 +688,18 @@
             <w:tcW w:w="2340" w:type="dxa"/>
           </w:tcPr>
           <w:p>
-            <w:pPr/>
-            <w:r>
-              <w:t xml:space="preserve">Modified Wilcoxon rank-sum statistic (wcmod.p) on genes ranked by expression relative to each gene's median</w:t>
+            <w:r>
+              <w:t>Modified Wilcoxon rank-sum statistic (</w:t>
+            </w:r>
+            <w:proofErr w:type="spellStart"/>
+            <w:proofErr w:type="gramStart"/>
+            <w:r>
+              <w:t>wcmod.p</w:t>
+            </w:r>
+            <w:proofErr w:type="spellEnd"/>
+            <w:proofErr w:type="gramEnd"/>
+            <w:r>
+              <w:t>) on genes ranked by expression relative to each gene's median</w:t>
             </w:r>
           </w:p>
         </w:tc>
@@ -443,9 +708,8 @@
             <w:tcW w:w="2340" w:type="dxa"/>
           </w:tcPr>
           <w:p>
-            <w:pPr/>
-            <w:r>
-              <w:t xml:space="preserve">Curated, experimentally supported interactions from TarBase, bundled in the repo</w:t>
+            <w:r>
+              <w:t>Curated, experimentally supported interactions from TarBase, bundled in the repo</w:t>
             </w:r>
           </w:p>
         </w:tc>
@@ -454,9 +718,8 @@
             <w:tcW w:w="2340" w:type="dxa"/>
           </w:tcPr>
           <w:p>
-            <w:pPr/>
-            <w:r>
-              <w:t xml:space="preserve">Its SLURM step is bypassed by calling the functions directly</w:t>
+            <w:r>
+              <w:t>Its SLURM step is bypassed by calling the functions directly</w:t>
             </w:r>
           </w:p>
         </w:tc>
@@ -467,9 +730,13 @@
             <w:tcW w:w="2340" w:type="dxa"/>
           </w:tcPr>
           <w:p>
-            <w:pPr/>
-            <w:r>
-              <w:t xml:space="preserve">miReact, motif mode</w:t>
+            <w:proofErr w:type="spellStart"/>
+            <w:r>
+              <w:t>miReact</w:t>
+            </w:r>
+            <w:proofErr w:type="spellEnd"/>
+            <w:r>
+              <w:t>, motif mode</w:t>
             </w:r>
           </w:p>
         </w:tc>
@@ -478,9 +745,8 @@
             <w:tcW w:w="2340" w:type="dxa"/>
           </w:tcPr>
           <w:p>
-            <w:pPr/>
-            <w:r>
-              <w:t xml:space="preserve">Same statistic, applied to all 16,384 7-mer motifs</w:t>
+            <w:r>
+              <w:t>Same statistic, applied to all 16,384 7-mer motifs</w:t>
             </w:r>
           </w:p>
         </w:tc>
@@ -489,9 +755,8 @@
             <w:tcW w:w="2340" w:type="dxa"/>
           </w:tcPr>
           <w:p>
-            <w:pPr/>
-            <w:r>
-              <w:t xml:space="preserve">Sequence-based: precomputed probability of each 7-mer in each 3'UTR under a Markov background model; we read the seed-match motif (GTGCCTT for miR-124-3p)</w:t>
+            <w:r>
+              <w:t>Sequence-based: precomputed probability of each 7-mer in each 3'UTR under a Markov background model; we read the seed-match motif (GTGCCTT for miR-124-3p)</w:t>
             </w:r>
           </w:p>
         </w:tc>
@@ -500,9 +765,8 @@
             <w:tcW w:w="2340" w:type="dxa"/>
           </w:tcPr>
           <w:p>
-            <w:pPr/>
-            <w:r>
-              <w:t xml:space="preserve">Needs species-specific precomputed files from Synapse (human file about 1.2 GB); runs asynchronously on SLURM, one job per 20 cells</w:t>
+            <w:r>
+              <w:t>Needs species-specific precomputed files from Synapse (human file about 1.2 GB); runs asynchronously on SLURM, one job per 20 cells</w:t>
             </w:r>
           </w:p>
         </w:tc>
@@ -513,14 +777,15 @@
             <w:tcW w:w="2340" w:type="dxa"/>
           </w:tcPr>
           <w:p>
-            <w:pPr/>
-            <w:hyperlink r:id="rId4" w:history="1">
+            <w:hyperlink r:id="rId6" w:history="1">
+              <w:proofErr w:type="spellStart"/>
               <w:r>
                 <w:rPr>
                   <w:rStyle w:val="Hyperlink"/>
                 </w:rPr>
-                <w:t xml:space="preserve">bayesReact</w:t>
+                <w:t>bayesReact</w:t>
               </w:r>
+              <w:proofErr w:type="spellEnd"/>
             </w:hyperlink>
           </w:p>
         </w:tc>
@@ -529,9 +794,8 @@
             <w:tcW w:w="2340" w:type="dxa"/>
           </w:tcPr>
           <w:p>
-            <w:pPr/>
-            <w:r>
-              <w:t xml:space="preserve">Bayesian model fitted by MCMC: per-cell activity with posterior mean, SD and credible interval</w:t>
+            <w:r>
+              <w:t>Bayesian model fitted by MCMC: per-cell activity with posterior mean, SD and credible interval</w:t>
             </w:r>
           </w:p>
         </w:tc>
@@ -540,9 +804,8 @@
             <w:tcW w:w="2340" w:type="dxa"/>
           </w:tcPr>
           <w:p>
-            <w:pPr/>
-            <w:r>
-              <w:t xml:space="preserve">Sequence-based: seed-match motif searched in 3'UTRs with a Markov background model; no target database</w:t>
+            <w:r>
+              <w:t>Sequence-based: seed-match motif searched in 3'UTRs with a Markov background model; no target database</w:t>
             </w:r>
           </w:p>
         </w:tc>
@@ -551,9 +814,16 @@
             <w:tcW w:w="2340" w:type="dxa"/>
           </w:tcPr>
           <w:p>
-            <w:pPr/>
-            <w:r>
-              <w:t xml:space="preserve">R package; reports MCMC diagnostics (Rhat, effective sample size); one run per motif; input is log2(x+1) transformed</w:t>
+            <w:r>
+              <w:t>R package; reports MCMC diagnostics (</w:t>
+            </w:r>
+            <w:proofErr w:type="spellStart"/>
+            <w:r>
+              <w:t>Rhat</w:t>
+            </w:r>
+            <w:proofErr w:type="spellEnd"/>
+            <w:r>
+              <w:t>, effective sample size); one run per motif; input is log2(x+1) transformed</w:t>
             </w:r>
           </w:p>
         </w:tc>
@@ -564,14 +834,15 @@
             <w:tcW w:w="2340" w:type="dxa"/>
           </w:tcPr>
           <w:p>
-            <w:pPr/>
-            <w:hyperlink r:id="rId5" w:history="1">
+            <w:hyperlink r:id="rId7" w:history="1">
+              <w:proofErr w:type="spellStart"/>
               <w:r>
                 <w:rPr>
                   <w:rStyle w:val="Hyperlink"/>
                 </w:rPr>
-                <w:t xml:space="preserve">miTEA-HiRes</w:t>
+                <w:t>miTEA-HiRes</w:t>
               </w:r>
+              <w:proofErr w:type="spellEnd"/>
             </w:hyperlink>
           </w:p>
         </w:tc>
@@ -580,9 +851,16 @@
             <w:tcW w:w="2340" w:type="dxa"/>
           </w:tcPr>
           <w:p>
-            <w:pPr/>
-            <w:r>
-              <w:t xml:space="preserve">XL-mHG rank-enrichment test of targets among the lowest-expressed genes; score is -log10 p</w:t>
+            <w:r>
+              <w:t>XL-</w:t>
+            </w:r>
+            <w:proofErr w:type="spellStart"/>
+            <w:r>
+              <w:t>mHG</w:t>
+            </w:r>
+            <w:proofErr w:type="spellEnd"/>
+            <w:r>
+              <w:t xml:space="preserve"> rank-enrichment test of targets among the lowest-expressed genes; score is -log10 p</w:t>
             </w:r>
           </w:p>
         </w:tc>
@@ -591,9 +869,21 @@
             <w:tcW w:w="2340" w:type="dxa"/>
           </w:tcPr>
           <w:p>
-            <w:pPr/>
-            <w:r>
-              <w:t xml:space="preserve">miRTarBase by default (bundled, human); we substitute TarBase or TargetScan lists</w:t>
+            <w:proofErr w:type="spellStart"/>
+            <w:r>
+              <w:t>miRTarBase</w:t>
+            </w:r>
+            <w:proofErr w:type="spellEnd"/>
+            <w:r>
+              <w:t xml:space="preserve"> by default (bundled, human); we substitute TarBase or </w:t>
+            </w:r>
+            <w:proofErr w:type="spellStart"/>
+            <w:r>
+              <w:t>TargetScan</w:t>
+            </w:r>
+            <w:proofErr w:type="spellEnd"/>
+            <w:r>
+              <w:t xml:space="preserve"> lists</w:t>
             </w:r>
           </w:p>
         </w:tc>
@@ -602,72 +892,240 @@
             <w:tcW w:w="2340" w:type="dxa"/>
           </w:tcPr>
           <w:p>
-            <w:pPr/>
-            <w:r>
-              <w:t xml:space="preserve">Python 3.8 conda environment; normalizes internally (CP10K rescale, per-gene z-score)</w:t>
+            <w:r>
+              <w:t xml:space="preserve">Python 3.8 </w:t>
+            </w:r>
+            <w:proofErr w:type="spellStart"/>
+            <w:r>
+              <w:t>conda</w:t>
+            </w:r>
+            <w:proofErr w:type="spellEnd"/>
+            <w:r>
+              <w:t xml:space="preserve"> environment; normalizes internally (CP10K rescale, per-gene z-score)</w:t>
             </w:r>
           </w:p>
         </w:tc>
       </w:tr>
     </w:tbl>
     <w:p>
-      <w:pPr/>
       <w:r>
         <w:rPr>
           <w:b/>
         </w:rPr>
-        <w:t xml:space="preserve">Targets.</w:t>
-      </w:r>
-      <w:r>
-        <w:t xml:space="preserve"> Our method and miTEA-HiRes take a gene list, miReact's TarBase mode takes curated interactions, and miReact's motif mode and bayesReact take no list at all and search 3'UTR sequences for the seed match. Only the list-based tools can be matched on identical targets.</w:t>
-      </w:r>
-    </w:p>
-    <w:p>
-      <w:pPr/>
+        <w:t>Targets.</w:t>
+      </w:r>
+      <w:r>
+        <w:t xml:space="preserve"> Our method and </w:t>
+      </w:r>
+      <w:proofErr w:type="spellStart"/>
+      <w:r>
+        <w:t>miTEA-HiRes</w:t>
+      </w:r>
+      <w:proofErr w:type="spellEnd"/>
+      <w:r>
+        <w:t xml:space="preserve"> take a gene list, </w:t>
+      </w:r>
+      <w:proofErr w:type="spellStart"/>
+      <w:r>
+        <w:t>miReact's</w:t>
+      </w:r>
+      <w:proofErr w:type="spellEnd"/>
+      <w:r>
+        <w:t xml:space="preserve"> TarBase mode takes curated interactions, and </w:t>
+      </w:r>
+      <w:proofErr w:type="spellStart"/>
+      <w:r>
+        <w:t>miReact's</w:t>
+      </w:r>
+      <w:proofErr w:type="spellEnd"/>
+      <w:r>
+        <w:t xml:space="preserve"> motif mode and </w:t>
+      </w:r>
+      <w:proofErr w:type="spellStart"/>
+      <w:r>
+        <w:t>bayesReact</w:t>
+      </w:r>
+      <w:proofErr w:type="spellEnd"/>
+      <w:r>
+        <w:t xml:space="preserve"> take no list at all and search 3'UTR sequences for the seed match. Only the list-based tools can be matched on identical targets.</w:t>
+      </w:r>
+    </w:p>
+    <w:p>
       <w:r>
         <w:rPr>
           <w:b/>
         </w:rPr>
-        <w:t xml:space="preserve">Summation versus ranks.</w:t>
-      </w:r>
-      <w:r>
-        <w:t xml:space="preserve"> Our score adds expression, so every target contributes in proportion to its level and false or weak targets dilute the sum. miReact's statistic uses each gene's position in the cell's expression ranking. miTEA-HiRes scans for the ranking cutoff where targets are most enriched, and its p-value is analytically corrected for that search.</w:t>
-      </w:r>
-    </w:p>
-    <w:p>
-      <w:pPr/>
+        <w:t>Summation versus ranks.</w:t>
+      </w:r>
+      <w:r>
+        <w:t xml:space="preserve"> Our score adds expression, so every target contributes in proportion to its level and false or weak targets dilute the sum. </w:t>
+      </w:r>
+      <w:proofErr w:type="spellStart"/>
+      <w:r>
+        <w:t>miReact's</w:t>
+      </w:r>
+      <w:proofErr w:type="spellEnd"/>
+      <w:r>
+        <w:t xml:space="preserve"> statistic uses each gene's position in the cell's expression ranking. </w:t>
+      </w:r>
+      <w:proofErr w:type="spellStart"/>
+      <w:r>
+        <w:t>miTEA-HiRes</w:t>
+      </w:r>
+      <w:proofErr w:type="spellEnd"/>
+      <w:r>
+        <w:t xml:space="preserve"> scans for the ranking cutoff where targets are most enriched, and its p-value is analytically corrected for that search.</w:t>
+      </w:r>
+    </w:p>
+    <w:p>
       <w:r>
         <w:rPr>
           <w:b/>
         </w:rPr>
-        <w:t xml:space="preserve">Normalization.</w:t>
-      </w:r>
-      <w:r>
-        <w:t xml:space="preserve"> Our method and miReact accept any per-cell-normalized matrix, bayesReact log-transforms its input, and miTEA-HiRes re-normalizes internally. We gave all of them scran-normalized data, and each script checks that the tool's score correlates positively with ours.</w:t>
-      </w:r>
-    </w:p>
-    <w:p>
-      <w:pPr/>
+        <w:lastRenderedPageBreak/>
+        <w:t>Normalization.</w:t>
+      </w:r>
+      <w:r>
+        <w:t xml:space="preserve"> Our method and </w:t>
+      </w:r>
+      <w:proofErr w:type="spellStart"/>
+      <w:r>
+        <w:t>miReact</w:t>
+      </w:r>
+      <w:proofErr w:type="spellEnd"/>
+      <w:r>
+        <w:t xml:space="preserve"> accept any per-cell-normalized matrix, </w:t>
+      </w:r>
+      <w:proofErr w:type="spellStart"/>
+      <w:r>
+        <w:t>bayesReact</w:t>
+      </w:r>
+      <w:proofErr w:type="spellEnd"/>
+      <w:r>
+        <w:t xml:space="preserve"> log-transforms its input, and </w:t>
+      </w:r>
+      <w:proofErr w:type="spellStart"/>
+      <w:r>
+        <w:t>miTEA-HiRes</w:t>
+      </w:r>
+      <w:proofErr w:type="spellEnd"/>
+      <w:r>
+        <w:t xml:space="preserve"> re-normalizes internally. We gave all of them scran-normalized data, and each script checks that the tool's score correlates positively with ours.</w:t>
+      </w:r>
+    </w:p>
+    <w:p>
       <w:r>
         <w:rPr>
           <w:b/>
         </w:rPr>
-        <w:t xml:space="preserve">Species and compute.</w:t>
-      </w:r>
-      <w:r>
-        <w:t xml:space="preserve"> All tools run on human data. For mouse we used miReact's bundled mouse 3'UTR sequences, and miTEA-HiRes's custom-list route avoids its human-only bundled database. Ours runs in seconds; bayesReact needs an MCMC fit per motif; miReact's motif mode needs the precomputed files and cluster jobs.</w:t>
-      </w:r>
-    </w:p>
-    <w:p>
-      <w:pPr/>
+        <w:t>Species and compute.</w:t>
+      </w:r>
+      <w:r>
+        <w:t xml:space="preserve"> All tools run on human data. For mouse we used </w:t>
+      </w:r>
+      <w:proofErr w:type="spellStart"/>
+      <w:r>
+        <w:t>miReact's</w:t>
+      </w:r>
+      <w:proofErr w:type="spellEnd"/>
+      <w:r>
+        <w:t xml:space="preserve"> bundled mouse 3'UTR sequences, and </w:t>
+      </w:r>
+      <w:proofErr w:type="spellStart"/>
+      <w:r>
+        <w:t>miTEA</w:t>
+      </w:r>
+      <w:proofErr w:type="spellEnd"/>
+      <w:r>
+        <w:t xml:space="preserve">-HiRes's custom-list route avoids its human-only bundled database. Ours runs in seconds; </w:t>
+      </w:r>
+      <w:proofErr w:type="spellStart"/>
+      <w:r>
+        <w:t>bayesReact</w:t>
+      </w:r>
+      <w:proofErr w:type="spellEnd"/>
+      <w:r>
+        <w:t xml:space="preserve"> needs an MCMC fit per motif; </w:t>
+      </w:r>
+      <w:proofErr w:type="spellStart"/>
+      <w:r>
+        <w:t>miReact's</w:t>
+      </w:r>
+      <w:proofErr w:type="spellEnd"/>
+      <w:r>
+        <w:t xml:space="preserve"> motif mode needs the precomputed files and cluster jobs.</w:t>
+      </w:r>
+    </w:p>
+    <w:p>
       <w:r>
         <w:rPr>
           <w:b/>
         </w:rPr>
-        <w:t xml:space="preserve">Problems we worked around.</w:t>
-      </w:r>
-      <w:r>
-        <w:t xml:space="preserve"> miReact reads run parameters from the global environment in TarBase mode, hides sbatch errors, and its batch script ignores .Renviron library paths. bayesReact hard-codes a 50% gene-overlap check our data cannot meet. miTEA-HiRes pins old numpy and pandas versions and needs its CPU count set explicitly.</w:t>
+        <w:t>Problems we worked around.</w:t>
+      </w:r>
+      <w:r>
+        <w:t xml:space="preserve"> </w:t>
+      </w:r>
+      <w:proofErr w:type="spellStart"/>
+      <w:r>
+        <w:t>miReact</w:t>
+      </w:r>
+      <w:proofErr w:type="spellEnd"/>
+      <w:r>
+        <w:t xml:space="preserve"> reads run parameters from the global environment in TarBase mode, hides </w:t>
+      </w:r>
+      <w:proofErr w:type="spellStart"/>
+      <w:r>
+        <w:t>sbatch</w:t>
+      </w:r>
+      <w:proofErr w:type="spellEnd"/>
+      <w:r>
+        <w:t xml:space="preserve"> errors, and its batch script </w:t>
+      </w:r>
+      <w:proofErr w:type="gramStart"/>
+      <w:r>
+        <w:t>ignores .</w:t>
+      </w:r>
+      <w:proofErr w:type="spellStart"/>
+      <w:r>
+        <w:t>Renviron</w:t>
+      </w:r>
+      <w:proofErr w:type="spellEnd"/>
+      <w:proofErr w:type="gramEnd"/>
+      <w:r>
+        <w:t xml:space="preserve"> library paths. </w:t>
+      </w:r>
+      <w:proofErr w:type="spellStart"/>
+      <w:r>
+        <w:t>bayesReact</w:t>
+      </w:r>
+      <w:proofErr w:type="spellEnd"/>
+      <w:r>
+        <w:t xml:space="preserve"> hard-codes a 50% gene-overlap check our data cannot meet. </w:t>
+      </w:r>
+      <w:proofErr w:type="spellStart"/>
+      <w:r>
+        <w:t>miTEA-HiRes</w:t>
+      </w:r>
+      <w:proofErr w:type="spellEnd"/>
+      <w:r>
+        <w:t xml:space="preserve"> pins old </w:t>
+      </w:r>
+      <w:proofErr w:type="spellStart"/>
+      <w:r>
+        <w:t>numpy</w:t>
+      </w:r>
+      <w:proofErr w:type="spellEnd"/>
+      <w:r>
+        <w:t xml:space="preserve"> and </w:t>
+      </w:r>
+      <w:proofErr w:type="gramStart"/>
+      <w:r>
+        <w:t>pandas</w:t>
+      </w:r>
+      <w:proofErr w:type="gramEnd"/>
+      <w:r>
+        <w:t xml:space="preserve"> versions and needs its CPU count set explicitly.</w:t>
       </w:r>
     </w:p>
     <w:p>
@@ -675,34 +1133,39 @@
         <w:pStyle w:val="Heading2"/>
       </w:pPr>
       <w:r>
-        <w:t xml:space="preserve">Normalization and confound investigation</w:t>
-      </w:r>
-    </w:p>
-    <w:p>
-      <w:pPr/>
-      <w:r>
-        <w:t xml:space="preserve">Under CPM normalization, random gene sets that are not miR-124 targets correlated with GFP at rho 0.1 to 0.4, so raw correlations overstated accuracy. Switching to scran size factors cut this baseline to a median of 0.05 and left the real signal intact.</w:t>
-      </w:r>
-    </w:p>
-    <w:p>
-      <w:pPr/>
+        <w:t>Normalization and confound investigation</w:t>
+      </w:r>
+    </w:p>
+    <w:p>
+      <w:r>
+        <w:t>Under CPM normalization, random gene sets that are not miR-124 targets correlated with GFP at rho 0.1 to 0.4, so raw correlations overstated accuracy. Switching to scran size factors cut this baseline to a median of 0.05 and left the real signal intact.</w:t>
+      </w:r>
+    </w:p>
+    <w:p>
       <w:r>
         <w:rPr>
           <w:b/>
         </w:rPr>
-        <w:t xml:space="preserve">How it appeared.</w:t>
-      </w:r>
-      <w:r>
-        <w:t xml:space="preserve"> The target-count analysis compared ranked TargetScan targets (Ordered), the same genes in random order (Shuffled), and random non-target genes (Random). Ordered beat Shuffled at every list size, but Random sat well above zero (about 0.25 in the first version).</w:t>
-      </w:r>
-    </w:p>
-    <w:p>
-      <w:pPr/>
+        <w:t>How it appeared.</w:t>
+      </w:r>
+      <w:r>
+        <w:t xml:space="preserve"> The target-count analysis compared ranked </w:t>
+      </w:r>
+      <w:proofErr w:type="spellStart"/>
+      <w:r>
+        <w:t>TargetScan</w:t>
+      </w:r>
+      <w:proofErr w:type="spellEnd"/>
+      <w:r>
+        <w:t xml:space="preserve"> targets (Ordered), the same genes in random order (Shuffled), and random non-target genes (Random). Ordered beat Shuffled at every list size, but Random sat well above zero (about 0.25 in the first version).</w:t>
+      </w:r>
+    </w:p>
+    <w:p>
       <w:r>
         <w:rPr>
           <w:b/>
         </w:rPr>
-        <w:t xml:space="preserve">What we tested.</w:t>
+        <w:t>What we tested.</w:t>
       </w:r>
     </w:p>
     <w:p>
@@ -714,7 +1177,7 @@
         </w:numPr>
       </w:pPr>
       <w:r>
-        <w:t xml:space="preserve">Sequencing depth explains the generic floor. GFP correlated with library depth at rho -0.29 and a random-gene score at -0.17; after removing depth from both, the random-gene correlation with GFP fell to -0.05 (p = 0.17).</w:t>
+        <w:t>Sequencing depth explains the generic floor. GFP correlated with library depth at rho -0.29 and a random-gene score at -0.17; after removing depth from both, the random-gene correlation with GFP fell to -0.05 (p = 0.17).</w:t>
       </w:r>
     </w:p>
     <w:p>
@@ -726,7 +1189,7 @@
         </w:numPr>
       </w:pPr>
       <w:r>
-        <w:t xml:space="preserve">A separate signal survives depth correction. Random genes from the top expression tertile (all protein-coding) correlated with GFP at 0.31, and 0.29 after depth adjustment; low-expression genes gave about 0.</w:t>
+        <w:t>A separate signal survives depth correction. Random genes from the top expression tertile (all protein-coding) correlated with GFP at 0.31, and 0.29 after depth adjustment; low-expression genes gave about 0.</w:t>
       </w:r>
     </w:p>
     <w:p>
@@ -738,7 +1201,15 @@
         </w:numPr>
       </w:pPr>
       <w:r>
-        <w:t xml:space="preserve">Two candidate explanations were ruled out. A ribosomal gene set (95 genes) gave 0.009, and plate did not explain it: GFP does not vary by plate (p = 0.15) and the correlation stayed 0.32 after adjustment.</w:t>
+        <w:t>Two candidate explanations were ruled out. A ribosomal gene set (95 genes) gave 0.009, and plate did not explain it: GFP does not vary by plate (p = 0.15</w:t>
+      </w:r>
+      <w:proofErr w:type="gramStart"/>
+      <w:r>
+        <w:t>)</w:t>
+      </w:r>
+      <w:proofErr w:type="gramEnd"/>
+      <w:r>
+        <w:t xml:space="preserve"> and the correlation stayed 0.32 after adjustment.</w:t>
       </w:r>
     </w:p>
     <w:p>
@@ -750,40 +1221,62 @@
         </w:numPr>
       </w:pPr>
       <w:r>
-        <w:t xml:space="preserve">A protein-coding-only random pool kept rising with set size, to about 0.5 at the largest sizes, while a non-coding pool stayed low. The mechanism is unresolved.</w:t>
-      </w:r>
-    </w:p>
-    <w:p>
-      <w:pPr/>
+        <w:t>A protein-coding-only random pool kept rising with set size, to about 0.5 at the largest sizes, while a non-coding pool stayed low. The mechanism is unresolved.</w:t>
+      </w:r>
+    </w:p>
+    <w:p>
       <w:r>
         <w:rPr>
           <w:b/>
         </w:rPr>
-        <w:t xml:space="preserve">The fix.</w:t>
-      </w:r>
-      <w:r>
-        <w:t xml:space="preserve"> We replaced CPM with scran deconvolution size factors (pooled, on protein-coding genes with under 75% zeros). Across 30 random 200-gene draws, the median rho fell from 0.39 (CPM) to 0.05 (scran). For the real TargetScan top-200 targets it moved from roughly 0.72 to 0.77. All later comparisons use scran-normalized data.</w:t>
-      </w:r>
-    </w:p>
-    <w:p>
-      <w:pPr/>
+        <w:t>The fix.</w:t>
+      </w:r>
+      <w:r>
+        <w:t xml:space="preserve"> We replaced CPM with scran deconvolution size factors (pooled, on protein-coding genes with under 75% zeros). Across 30 random 200-gene draws, the median rho fell from 0.39 (CPM) to 0.05 (scran). For the real </w:t>
+      </w:r>
+      <w:proofErr w:type="spellStart"/>
+      <w:r>
+        <w:t>TargetScan</w:t>
+      </w:r>
+      <w:proofErr w:type="spellEnd"/>
+      <w:r>
+        <w:t xml:space="preserve"> </w:t>
+      </w:r>
+      <w:proofErr w:type="gramStart"/>
+      <w:r>
+        <w:t>top-200</w:t>
+      </w:r>
+      <w:proofErr w:type="gramEnd"/>
+      <w:r>
+        <w:t xml:space="preserve"> targets it moved from roughly 0.72 to 0.77. All later comparisons use scran-normalized data.</w:t>
+      </w:r>
+    </w:p>
+    <w:p>
       <w:r>
         <w:rPr>
           <w:b/>
         </w:rPr>
-        <w:t xml:space="preserve">A contrast between methods.</w:t>
-      </w:r>
-      <w:r>
-        <w:t xml:space="preserve"> Under CPM, miReact scored random gene sets at a small negative correlation (about -0.03 to -0.09), while ours was positive. This suggests our summation-based score is more susceptible to the confound than rank-based scoring.</w:t>
-      </w:r>
-    </w:p>
-    <w:p>
-      <w:pPr/>
+        <w:t>A contrast between methods.</w:t>
+      </w:r>
+      <w:r>
+        <w:t xml:space="preserve"> Under CPM, </w:t>
+      </w:r>
+      <w:proofErr w:type="spellStart"/>
+      <w:r>
+        <w:t>miReact</w:t>
+      </w:r>
+      <w:proofErr w:type="spellEnd"/>
+      <w:r>
+        <w:t xml:space="preserve"> scored random gene sets at a small negative correlation (about -0.03 to -0.09), while ours was positive. This suggests our summation-based score is more susceptible to the confound than rank-based scoring.</w:t>
+      </w:r>
+    </w:p>
+    <w:p>
       <w:r>
         <w:rPr>
           <w:b/>
         </w:rPr>
-        <w:t xml:space="preserve">Caveats.</w:t>
+        <w:lastRenderedPageBreak/>
+        <w:t>Caveats.</w:t>
       </w:r>
       <w:r>
         <w:t xml:space="preserve"> The scran matrix covers only 10,785 protein-coding genes, so 57 of the top 200 targets drop out. The residual scran median of 0.05 was not formally tested against zero, and the high-expression-tertile result was not repeated under scran.</w:t>
@@ -794,13 +1287,28 @@
         <w:pStyle w:val="Heading2"/>
       </w:pPr>
       <w:r>
-        <w:t xml:space="preserve">Tool comparison on the HEK293 data</w:t>
-      </w:r>
-    </w:p>
-    <w:p>
-      <w:pPr/>
-      <w:r>
-        <w:t xml:space="preserve">On scran-normalized data, our method with the top 200 TargetScan targets (rho 0.767) and miReact in TarBase mode (0.736) perform similarly; the other tools' results are computed but not yet reviewed.</w:t>
+        <w:t>Tool comparison on the HEK293 data</w:t>
+      </w:r>
+    </w:p>
+    <w:p>
+      <w:r>
+        <w:t xml:space="preserve">On scran-normalized data, our method with the top 200 </w:t>
+      </w:r>
+      <w:proofErr w:type="spellStart"/>
+      <w:r>
+        <w:t>TargetScan</w:t>
+      </w:r>
+      <w:proofErr w:type="spellEnd"/>
+      <w:r>
+        <w:t xml:space="preserve"> targets (rho 0.767) and </w:t>
+      </w:r>
+      <w:proofErr w:type="spellStart"/>
+      <w:r>
+        <w:t>miReact</w:t>
+      </w:r>
+      <w:proofErr w:type="spellEnd"/>
+      <w:r>
+        <w:t xml:space="preserve"> in TarBase mode (0.736) perform similarly; the other tools' results are computed but not yet reviewed.</w:t>
       </w:r>
     </w:p>
     <w:tbl>
@@ -808,7 +1316,7 @@
         <w:tblStyle w:val="TableGrid"/>
         <w:tblW w:w="0" w:type="auto"/>
         <w:tblLayout w:type="fixed"/>
-        <w:tblLook w:val="04A0" w:firstRow="1" w:lastRow="0" w:firstColumn="0" w:lastColumn="0" w:noHBand="0" w:noVBand="1"/>
+        <w:tblLook w:val="0420" w:firstRow="1" w:lastRow="0" w:firstColumn="0" w:lastColumn="0" w:noHBand="0" w:noVBand="1"/>
       </w:tblPr>
       <w:tblGrid>
         <w:gridCol w:w="3120"/>
@@ -825,9 +1333,8 @@
             <w:shd w:val="clear" w:color="auto" w:fill="F2F2F2"/>
           </w:tcPr>
           <w:p>
-            <w:pPr/>
-            <w:r>
-              <w:t xml:space="preserve">Method</w:t>
+            <w:r>
+              <w:t>Method</w:t>
             </w:r>
           </w:p>
         </w:tc>
@@ -837,9 +1344,8 @@
             <w:shd w:val="clear" w:color="auto" w:fill="F2F2F2"/>
           </w:tcPr>
           <w:p>
-            <w:pPr/>
-            <w:r>
-              <w:t xml:space="preserve">Targets used</w:t>
+            <w:r>
+              <w:t>Targets used</w:t>
             </w:r>
           </w:p>
         </w:tc>
@@ -849,9 +1355,8 @@
             <w:shd w:val="clear" w:color="auto" w:fill="F2F2F2"/>
           </w:tcPr>
           <w:p>
-            <w:pPr/>
-            <w:r>
-              <w:t xml:space="preserve">Spearman rho vs GFP</w:t>
+            <w:r>
+              <w:t>Spearman rho vs GFP</w:t>
             </w:r>
           </w:p>
         </w:tc>
@@ -862,9 +1367,8 @@
             <w:tcW w:w="3120" w:type="dxa"/>
           </w:tcPr>
           <w:p>
-            <w:pPr/>
-            <w:r>
-              <w:t xml:space="preserve">Our method</w:t>
+            <w:r>
+              <w:t>Our method</w:t>
             </w:r>
           </w:p>
         </w:tc>
@@ -873,9 +1377,13 @@
             <w:tcW w:w="3120" w:type="dxa"/>
           </w:tcPr>
           <w:p>
-            <w:pPr/>
-            <w:r>
-              <w:t xml:space="preserve">TargetScan top 200 (143 genes present)</w:t>
+            <w:proofErr w:type="spellStart"/>
+            <w:r>
+              <w:t>TargetScan</w:t>
+            </w:r>
+            <w:proofErr w:type="spellEnd"/>
+            <w:r>
+              <w:t xml:space="preserve"> top 200 (143 genes present)</w:t>
             </w:r>
           </w:p>
         </w:tc>
@@ -884,9 +1392,8 @@
             <w:tcW w:w="3120" w:type="dxa"/>
           </w:tcPr>
           <w:p>
-            <w:pPr/>
-            <w:r>
-              <w:t xml:space="preserve">0.767</w:t>
+            <w:r>
+              <w:t>0.767</w:t>
             </w:r>
           </w:p>
         </w:tc>
@@ -897,9 +1404,8 @@
             <w:tcW w:w="3120" w:type="dxa"/>
           </w:tcPr>
           <w:p>
-            <w:pPr/>
-            <w:r>
-              <w:t xml:space="preserve">Our method</w:t>
+            <w:r>
+              <w:t>Our method</w:t>
             </w:r>
           </w:p>
         </w:tc>
@@ -908,9 +1414,16 @@
             <w:tcW w:w="3120" w:type="dxa"/>
           </w:tcPr>
           <w:p>
-            <w:pPr/>
-            <w:r>
-              <w:t xml:space="preserve">All TargetScan candidates, unranked (1,534 genes)</w:t>
+            <w:r>
+              <w:t xml:space="preserve">All </w:t>
+            </w:r>
+            <w:proofErr w:type="spellStart"/>
+            <w:r>
+              <w:t>TargetScan</w:t>
+            </w:r>
+            <w:proofErr w:type="spellEnd"/>
+            <w:r>
+              <w:t xml:space="preserve"> candidates, unranked (1,534 genes)</w:t>
             </w:r>
           </w:p>
         </w:tc>
@@ -919,9 +1432,8 @@
             <w:tcW w:w="3120" w:type="dxa"/>
           </w:tcPr>
           <w:p>
-            <w:pPr/>
-            <w:r>
-              <w:t xml:space="preserve">0.560</w:t>
+            <w:r>
+              <w:t>0.560</w:t>
             </w:r>
           </w:p>
         </w:tc>
@@ -932,9 +1444,8 @@
             <w:tcW w:w="3120" w:type="dxa"/>
           </w:tcPr>
           <w:p>
-            <w:pPr/>
-            <w:r>
-              <w:t xml:space="preserve">Our method</w:t>
+            <w:r>
+              <w:t>Our method</w:t>
             </w:r>
           </w:p>
         </w:tc>
@@ -943,9 +1454,8 @@
             <w:tcW w:w="3120" w:type="dxa"/>
           </w:tcPr>
           <w:p>
-            <w:pPr/>
-            <w:r>
-              <w:t xml:space="preserve">TarBase, unranked (3,017 genes)</w:t>
+            <w:r>
+              <w:t>TarBase, unranked (3,017 genes)</w:t>
             </w:r>
           </w:p>
         </w:tc>
@@ -954,9 +1464,8 @@
             <w:tcW w:w="3120" w:type="dxa"/>
           </w:tcPr>
           <w:p>
-            <w:pPr/>
-            <w:r>
-              <w:t xml:space="preserve">0.156</w:t>
+            <w:r>
+              <w:t>0.156</w:t>
             </w:r>
           </w:p>
         </w:tc>
@@ -967,9 +1476,13 @@
             <w:tcW w:w="3120" w:type="dxa"/>
           </w:tcPr>
           <w:p>
-            <w:pPr/>
-            <w:r>
-              <w:t xml:space="preserve">miReact, TarBase mode</w:t>
+            <w:proofErr w:type="spellStart"/>
+            <w:r>
+              <w:t>miReact</w:t>
+            </w:r>
+            <w:proofErr w:type="spellEnd"/>
+            <w:r>
+              <w:t>, TarBase mode</w:t>
             </w:r>
           </w:p>
         </w:tc>
@@ -978,9 +1491,16 @@
             <w:tcW w:w="3120" w:type="dxa"/>
           </w:tcPr>
           <w:p>
-            <w:pPr/>
-            <w:r>
-              <w:t xml:space="preserve">TarBase (3,051 genes matched by miReact)</w:t>
+            <w:r>
+              <w:t xml:space="preserve">TarBase (3,051 genes matched by </w:t>
+            </w:r>
+            <w:proofErr w:type="spellStart"/>
+            <w:r>
+              <w:t>miReact</w:t>
+            </w:r>
+            <w:proofErr w:type="spellEnd"/>
+            <w:r>
+              <w:t>)</w:t>
             </w:r>
           </w:p>
         </w:tc>
@@ -989,9 +1509,8 @@
             <w:tcW w:w="3120" w:type="dxa"/>
           </w:tcPr>
           <w:p>
-            <w:pPr/>
-            <w:r>
-              <w:t xml:space="preserve">0.736</w:t>
+            <w:r>
+              <w:t>0.736</w:t>
             </w:r>
           </w:p>
         </w:tc>
@@ -1002,9 +1521,13 @@
             <w:tcW w:w="3120" w:type="dxa"/>
           </w:tcPr>
           <w:p>
-            <w:pPr/>
-            <w:r>
-              <w:t xml:space="preserve">miReact, motif mode</w:t>
+            <w:proofErr w:type="spellStart"/>
+            <w:r>
+              <w:t>miReact</w:t>
+            </w:r>
+            <w:proofErr w:type="spellEnd"/>
+            <w:r>
+              <w:t>, motif mode</w:t>
             </w:r>
           </w:p>
         </w:tc>
@@ -1013,9 +1536,8 @@
             <w:tcW w:w="3120" w:type="dxa"/>
           </w:tcPr>
           <w:p>
-            <w:pPr/>
-            <w:r>
-              <w:t xml:space="preserve">Seed-match motif GTGCCTT in 3'UTRs</w:t>
+            <w:r>
+              <w:t>Seed-match motif GTGCCTT in 3'UTRs</w:t>
             </w:r>
           </w:p>
         </w:tc>
@@ -1024,9 +1546,8 @@
             <w:tcW w:w="3120" w:type="dxa"/>
           </w:tcPr>
           <w:p>
-            <w:pPr/>
-            <w:r>
-              <w:t xml:space="preserve">Computed, not yet reviewed</w:t>
+            <w:r>
+              <w:t>Computed, not yet reviewed</w:t>
             </w:r>
           </w:p>
         </w:tc>
@@ -1037,10 +1558,11 @@
             <w:tcW w:w="3120" w:type="dxa"/>
           </w:tcPr>
           <w:p>
-            <w:pPr/>
-            <w:r>
-              <w:t xml:space="preserve">bayesReact</w:t>
-            </w:r>
+            <w:proofErr w:type="spellStart"/>
+            <w:r>
+              <w:t>bayesReact</w:t>
+            </w:r>
+            <w:proofErr w:type="spellEnd"/>
           </w:p>
         </w:tc>
         <w:tc>
@@ -1048,9 +1570,8 @@
             <w:tcW w:w="3120" w:type="dxa"/>
           </w:tcPr>
           <w:p>
-            <w:pPr/>
-            <w:r>
-              <w:t xml:space="preserve">Seed-match motif GTGCCTT in 3'UTRs</w:t>
+            <w:r>
+              <w:t>Seed-match motif GTGCCTT in 3'UTRs</w:t>
             </w:r>
           </w:p>
         </w:tc>
@@ -1059,9 +1580,8 @@
             <w:tcW w:w="3120" w:type="dxa"/>
           </w:tcPr>
           <w:p>
-            <w:pPr/>
-            <w:r>
-              <w:t xml:space="preserve">Computed, not yet reviewed</w:t>
+            <w:r>
+              <w:t>Computed, not yet reviewed</w:t>
             </w:r>
           </w:p>
         </w:tc>
@@ -1072,10 +1592,11 @@
             <w:tcW w:w="3120" w:type="dxa"/>
           </w:tcPr>
           <w:p>
-            <w:pPr/>
-            <w:r>
-              <w:t xml:space="preserve">miTEA-HiRes</w:t>
-            </w:r>
+            <w:proofErr w:type="spellStart"/>
+            <w:r>
+              <w:t>miTEA-HiRes</w:t>
+            </w:r>
+            <w:proofErr w:type="spellEnd"/>
           </w:p>
         </w:tc>
         <w:tc>
@@ -1083,9 +1604,29 @@
             <w:tcW w:w="3120" w:type="dxa"/>
           </w:tcPr>
           <w:p>
-            <w:pPr/>
-            <w:r>
-              <w:t xml:space="preserve">miRTarBase, TarBase, TargetScan all, TargetScan top 200</w:t>
+            <w:proofErr w:type="spellStart"/>
+            <w:r>
+              <w:t>miRTarBase</w:t>
+            </w:r>
+            <w:proofErr w:type="spellEnd"/>
+            <w:r>
+              <w:t xml:space="preserve">, TarBase, </w:t>
+            </w:r>
+            <w:proofErr w:type="spellStart"/>
+            <w:r>
+              <w:t>TargetScan</w:t>
+            </w:r>
+            <w:proofErr w:type="spellEnd"/>
+            <w:r>
+              <w:t xml:space="preserve"> all, </w:t>
+            </w:r>
+            <w:proofErr w:type="spellStart"/>
+            <w:r>
+              <w:t>TargetScan</w:t>
+            </w:r>
+            <w:proofErr w:type="spellEnd"/>
+            <w:r>
+              <w:t xml:space="preserve"> top 200</w:t>
             </w:r>
           </w:p>
         </w:tc>
@@ -1094,128 +1635,217 @@
             <w:tcW w:w="3120" w:type="dxa"/>
           </w:tcPr>
           <w:p>
-            <w:pPr/>
-            <w:r>
-              <w:t xml:space="preserve">Computed, not yet reviewed</w:t>
+            <w:r>
+              <w:t>Computed, not yet reviewed</w:t>
             </w:r>
           </w:p>
         </w:tc>
       </w:tr>
     </w:tbl>
     <w:p>
-      <w:pPr/>
       <w:r>
         <w:rPr>
           <w:b/>
         </w:rPr>
-        <w:t xml:space="preserve">Target-list quality, not just size.</w:t>
-      </w:r>
-      <w:r>
-        <w:t xml:space="preserve"> The fall from 0.767 to 0.156 is not only because TarBase is larger: a random 143-gene subset of TarBase gave rho 0.026, worse than the full list. TargetScan's context score pre-selects strong targets, whereas TarBase pools unranked interactions from many cell types, so many entries are probably irrelevant to HEK293.</w:t>
-      </w:r>
-    </w:p>
-    <w:p>
-      <w:pPr/>
+        <w:t>Target-list quality, not just size.</w:t>
+      </w:r>
+      <w:r>
+        <w:t xml:space="preserve"> The fall from 0.767 to 0.156 is not only because TarBase is larger: a random 143-gene subset of TarBase gave rho 0.026, worse than the full list. </w:t>
+      </w:r>
+      <w:proofErr w:type="spellStart"/>
+      <w:r>
+        <w:t>TargetScan's</w:t>
+      </w:r>
+      <w:proofErr w:type="spellEnd"/>
+      <w:r>
+        <w:t xml:space="preserve"> context </w:t>
+      </w:r>
+      <w:proofErr w:type="gramStart"/>
+      <w:r>
+        <w:t>score</w:t>
+      </w:r>
+      <w:proofErr w:type="gramEnd"/>
+      <w:r>
+        <w:t xml:space="preserve"> pre-selects strong targets, whereas TarBase pools unranked interactions from many cell types, so many entries are probably irrelevant to HEK293.</w:t>
+      </w:r>
+    </w:p>
+    <w:p>
       <w:r>
         <w:rPr>
           <w:b/>
         </w:rPr>
-        <w:t xml:space="preserve">Rank-based scoring is more forgiving.</w:t>
-      </w:r>
-      <w:r>
-        <w:t xml:space="preserve"> On the same TarBase list miReact still reaches 0.736. Summing expression gives every gene an equal vote, so a list dominated by irrelevant genes drowns the signal, whereas a rank statistic only needs a subset of targets to shift.</w:t>
-      </w:r>
-    </w:p>
-    <w:p>
-      <w:pPr/>
+        <w:t>Rank-based scoring is more forgiving.</w:t>
+      </w:r>
+      <w:r>
+        <w:t xml:space="preserve"> On the same TarBase list </w:t>
+      </w:r>
+      <w:proofErr w:type="spellStart"/>
+      <w:r>
+        <w:t>miReact</w:t>
+      </w:r>
+      <w:proofErr w:type="spellEnd"/>
+      <w:r>
+        <w:t xml:space="preserve"> still reaches 0.736. Summing expression gives every gene an equal vote, so a list dominated by irrelevant genes drowns the signal, whereas a rank statistic only needs a subset of targets to shift.</w:t>
+      </w:r>
+    </w:p>
+    <w:p>
       <w:r>
         <w:rPr>
           <w:b/>
         </w:rPr>
-        <w:t xml:space="preserve">The open counter-question.</w:t>
-      </w:r>
-      <w:r>
-        <w:t xml:space="preserve"> Being forgiving may also mean more false positives. The planned test feeds a large TarBase list for an unrelated miRNA, such as miR-122, through miReact and checks that the score stays near zero. It has not been run.</w:t>
-      </w:r>
-    </w:p>
-    <w:p>
-      <w:pPr/>
+        <w:t>The open counter-question.</w:t>
+      </w:r>
+      <w:r>
+        <w:t xml:space="preserve"> Being forgiving may also mean more false positives. The planned test feeds a large TarBase list for an unrelated miRNA, such as miR-122, through </w:t>
+      </w:r>
+      <w:proofErr w:type="spellStart"/>
+      <w:r>
+        <w:t>miReact</w:t>
+      </w:r>
+      <w:proofErr w:type="spellEnd"/>
+      <w:r>
+        <w:t xml:space="preserve"> and checks that the score stays near zero. It has not been run.</w:t>
+      </w:r>
+    </w:p>
+    <w:p>
+      <w:proofErr w:type="spellStart"/>
       <w:r>
         <w:rPr>
           <w:b/>
         </w:rPr>
-        <w:t xml:space="preserve">miTEA-HiRes design.</w:t>
-      </w:r>
-      <w:r>
-        <w:t xml:space="preserve"> It was run with four target sets (miRTarBase, TarBase, TargetScan all candidates, TargetScan top 200) so that the list-size question can also be asked of an XL-mHG test. Each script includes a check that the tool's score correlates positively with ours; it gave rho 0.39 for miReact TarBase mode and has not yet been reviewed for the others. A plotting script collects all result files into bar charts once the numbers have been reviewed.</w:t>
-      </w:r>
-    </w:p>
-    <w:p>
-      <w:pPr>
-        <w:pStyle w:val="Heading2"/>
-      </w:pPr>
-      <w:r>
-        <w:t xml:space="preserve">Depth analysis and co-expression target filtering</w:t>
-      </w:r>
-    </w:p>
-    <w:p>
-      <w:pPr/>
-      <w:r>
-        <w:t xml:space="preserve">Accuracy rises smoothly with sequencing depth and flattens above roughly 50,000 reads per cell, but the low-depth end is not comparable to the rest because few targets survive filtering.</w:t>
-      </w:r>
-    </w:p>
-    <w:p>
-      <w:pPr/>
+        <w:t>miTEA-HiRes</w:t>
+      </w:r>
+      <w:proofErr w:type="spellEnd"/>
       <w:r>
         <w:rPr>
           <w:b/>
         </w:rPr>
-        <w:t xml:space="preserve">Depth analysis.</w:t>
-      </w:r>
-      <w:r>
-        <w:t xml:space="preserve"> We thinned each cell's counts to a target depth, renormalized with scran, and recomputed the correlation with GFP, using 100 random cells per draw and 100 draws per depth. The median rho, read from the plot, is about 0.06 at 2,000 reads per cell, 0.59 at 10,000, 0.77 at 50,000 and 0.80 at 100,000. A CPM version with a matched-cell-number control, and a separate accuracy-versus-cell-number analysis, were also built.</w:t>
-      </w:r>
-    </w:p>
-    <w:p>
-      <w:pPr/>
+        <w:t xml:space="preserve"> design.</w:t>
+      </w:r>
+      <w:r>
+        <w:t xml:space="preserve"> It was run with four target sets (</w:t>
+      </w:r>
+      <w:proofErr w:type="spellStart"/>
+      <w:r>
+        <w:t>miRTarBase</w:t>
+      </w:r>
+      <w:proofErr w:type="spellEnd"/>
+      <w:r>
+        <w:t xml:space="preserve">, TarBase, </w:t>
+      </w:r>
+      <w:proofErr w:type="spellStart"/>
+      <w:r>
+        <w:t>TargetScan</w:t>
+      </w:r>
+      <w:proofErr w:type="spellEnd"/>
+      <w:r>
+        <w:t xml:space="preserve"> all candidates, </w:t>
+      </w:r>
+      <w:proofErr w:type="spellStart"/>
+      <w:r>
+        <w:t>TargetScan</w:t>
+      </w:r>
+      <w:proofErr w:type="spellEnd"/>
+      <w:r>
+        <w:t xml:space="preserve"> top 200) so that the list-size question can also be asked of an XL-</w:t>
+      </w:r>
+      <w:proofErr w:type="spellStart"/>
+      <w:r>
+        <w:t>mHG</w:t>
+      </w:r>
+      <w:proofErr w:type="spellEnd"/>
+      <w:r>
+        <w:t xml:space="preserve"> test. Each script includes a check that the tool's score correlates positively with ours; it gave rho 0.39 for </w:t>
+      </w:r>
+      <w:proofErr w:type="spellStart"/>
+      <w:r>
+        <w:t>miReact</w:t>
+      </w:r>
+      <w:proofErr w:type="spellEnd"/>
+      <w:r>
+        <w:t xml:space="preserve"> </w:t>
+      </w:r>
+      <w:r>
+        <w:lastRenderedPageBreak/>
+        <w:t>TarBase mode and has not yet been reviewed for the others. A plotting script collects all result files into bar charts once the numbers have been reviewed.</w:t>
+      </w:r>
+    </w:p>
+    <w:p>
+      <w:pPr>
+        <w:pStyle w:val="Heading2"/>
+      </w:pPr>
+      <w:r>
+        <w:t>Depth analysis and co-expression target filtering</w:t>
+      </w:r>
+    </w:p>
+    <w:p>
+      <w:r>
+        <w:t>Accuracy rises smoothly with sequencing depth and flattens above roughly 50,000 reads per cell, but the low-depth end is not comparable to the rest because few targets survive filtering.</w:t>
+      </w:r>
+    </w:p>
+    <w:p>
       <w:r>
         <w:rPr>
           <w:b/>
         </w:rPr>
-        <w:t xml:space="preserve">Target coverage at low depth.</w:t>
-      </w:r>
-      <w:r>
-        <w:t xml:space="preserve"> The protein-coding and zero-fraction filters are recomputed at each depth. The mean number of the 200 targets still usable is 0.55 at 2,000 reads, 10 at 4,000, 47 at 10,000, 88 at 20,000 and 163 at 100,000, and none at 1,000. Points below about 5,000 reads therefore measure a different, smaller gene set than points at high depth.</w:t>
-      </w:r>
-    </w:p>
-    <w:p>
-      <w:pPr/>
+        <w:t>Depth analysis.</w:t>
+      </w:r>
+      <w:r>
+        <w:t xml:space="preserve"> We thinned each cell's counts to a target depth, renormalized with scran, and recomputed the correlation with GFP, using 100 random cells per draw and 100 draws per depth. The median rho, read from the plot, is about 0.06 at 2,000 reads per cell, 0.59 at 10,000, 0.77 at 50,000 and 0.80 at 100,000. A CPM version with a matched-cell-number control, and a separate accuracy-versus-cell-number analysis, were also built.</w:t>
+      </w:r>
+    </w:p>
+    <w:p>
       <w:r>
         <w:rPr>
           <w:b/>
         </w:rPr>
-        <w:t xml:space="preserve">scran at small sample sizes.</w:t>
-      </w:r>
-      <w:r>
-        <w:t xml:space="preserve"> scran's pooled size factors need many cells. Its default clustering requires clusters of at least 100 cells, so with 50 cells it failed outright. We skipped clustering, used pool sizes of 20, 30 and 40 with 100 cells per draw, and left the random seed free, because fixing it had hidden large run-to-run variation. The spread across draws therefore includes scran's own estimation noise.</w:t>
-      </w:r>
-    </w:p>
-    <w:p>
-      <w:pPr/>
+        <w:t>Target coverage at low depth.</w:t>
+      </w:r>
+      <w:r>
+        <w:t xml:space="preserve"> The protein-coding and zero-fraction filters are recomputed at each depth. The mean number of the 200 targets still usable is 0.55 at 2,000 reads, 10 at 4,000, 47 at 10,000, 88 at 20,000 and 163 at 100,000, and none at 1,000. Points below about 5,000 reads therefore measure a different, smaller gene set than points at high depth.</w:t>
+      </w:r>
+    </w:p>
+    <w:p>
       <w:r>
         <w:rPr>
           <w:b/>
         </w:rPr>
-        <w:t xml:space="preserve">Co-expression filtering (preliminary).</w:t>
-      </w:r>
-      <w:r>
-        <w:t xml:space="preserve"> The idea is that true targets are repressed together by the same miRNA in the same cell, so they should correlate with each other more than false predictions do. We took the 1,534 TargetScan candidates present in the scran matrix, computed all pairwise Spearman correlations, kept pairs above rho 0.4 (245 edges), built a graph, and kept genes with at least three neighbors. The 35 genes that remain give rho 0.762, close to the top-200 result (0.767) and well above all candidates (0.560).</w:t>
-      </w:r>
-    </w:p>
-    <w:p>
-      <w:pPr/>
-      <w:r>
-        <w:t xml:space="preserve">Two reasons not to trust this yet:</w:t>
+        <w:t>scran at small sample sizes.</w:t>
+      </w:r>
+      <w:r>
+        <w:t xml:space="preserve"> scran's pooled size factors need many cells. Its default clustering requires clusters of at least 100 cells, so with 50 cells it failed outright. We skipped clustering, used pool sizes of 20, 30 and 40 with 100 cells per draw, and left the random seed free, because fixing it had hidden large run-to-run variation. The spread across draws therefore includes scran's own estimation noise.</w:t>
+      </w:r>
+    </w:p>
+    <w:p>
+      <w:r>
+        <w:rPr>
+          <w:b/>
+        </w:rPr>
+        <w:t>Co-expression filtering (preliminary).</w:t>
+      </w:r>
+      <w:r>
+        <w:t xml:space="preserve"> The idea is that true targets are repressed together by the same miRNA in the same cell, so they should correlate with each other more than false predictions do. We took the 1,534 </w:t>
+      </w:r>
+      <w:proofErr w:type="spellStart"/>
+      <w:r>
+        <w:t>TargetScan</w:t>
+      </w:r>
+      <w:proofErr w:type="spellEnd"/>
+      <w:r>
+        <w:t xml:space="preserve"> candidates present in the scran matrix, computed all pairwise Spearman correlations, kept pairs above rho 0.4 (245 edges), built a graph, and kept genes with at least three neighbors. The 35 genes that remain give rho 0.762, close to the </w:t>
+      </w:r>
+      <w:proofErr w:type="gramStart"/>
+      <w:r>
+        <w:t>top-200</w:t>
+      </w:r>
+      <w:proofErr w:type="gramEnd"/>
+      <w:r>
+        <w:t xml:space="preserve"> result (0.767) and well above all candidates (0.560).</w:t>
+      </w:r>
+    </w:p>
+    <w:p>
+      <w:r>
+        <w:t>Two reasons not to trust this yet:</w:t>
       </w:r>
     </w:p>
     <w:p>
@@ -1227,7 +1857,28 @@
         </w:numPr>
       </w:pPr>
       <w:r>
-        <w:t xml:space="preserve">The C++ ranking function used for the correlations did not average tied ranks and differed from R's cor() by up to 0.063 on a 10-gene check. Because edges are thresholded at 0.4, this can flip borderline pairs. The function is now fixed, but the analysis has not been rerun.</w:t>
+        <w:t xml:space="preserve">The C++ ranking function used for the correlations did not average tied ranks and differed from R's </w:t>
+      </w:r>
+      <w:proofErr w:type="spellStart"/>
+      <w:proofErr w:type="gramStart"/>
+      <w:r>
+        <w:t>cor</w:t>
+      </w:r>
+      <w:proofErr w:type="spellEnd"/>
+      <w:r>
+        <w:t>(</w:t>
+      </w:r>
+      <w:proofErr w:type="gramEnd"/>
+      <w:r>
+        <w:t xml:space="preserve">) by up to 0.063 on a 10-gene check. Because edges are </w:t>
+      </w:r>
+      <w:proofErr w:type="spellStart"/>
+      <w:r>
+        <w:t>thresholded</w:t>
+      </w:r>
+      <w:proofErr w:type="spellEnd"/>
+      <w:r>
+        <w:t xml:space="preserve"> at 0.4, this can flip borderline pairs. The function is now fixed, but the analysis has not been rerun.</w:t>
       </w:r>
     </w:p>
     <w:p>
@@ -1239,7 +1890,7 @@
         </w:numPr>
       </w:pPr>
       <w:r>
-        <w:t xml:space="preserve">Genes that correlate with each other may simply share the cell-state confound described above. The control is to run the identical filter on random non-target genes; if that also reaches a high rho, the method is selecting the confound rather than true targets.</w:t>
+        <w:t>Genes that correlate with each other may simply share the cell-state confound described above. The control is to run the identical filter on random non-target genes; if that also reaches a high rho, the method is selecting the confound rather than true targets.</w:t>
       </w:r>
     </w:p>
     <w:p>
@@ -1247,22 +1898,29 @@
         <w:pStyle w:val="Heading2"/>
       </w:pPr>
       <w:r>
-        <w:t xml:space="preserve">Mouse ESC Drosha-knockout validation</w:t>
-      </w:r>
-    </w:p>
-    <w:p>
-      <w:pPr/>
-      <w:r>
-        <w:t xml:space="preserve">As a second test, we ask how well each method separates Drosha-knockout mESCs, which lack mature miRNAs, from control cells. Scripts exist for all four methods; their numeric results are not included here.</w:t>
-      </w:r>
-    </w:p>
-    <w:p>
-      <w:pPr/>
+        <w:t>Mouse ESC Drosha-knockout validation</w:t>
+      </w:r>
+    </w:p>
+    <w:p>
+      <w:r>
+        <w:t xml:space="preserve">As a second test, we ask how well each method separates Drosha-knockout </w:t>
+      </w:r>
+      <w:proofErr w:type="spellStart"/>
+      <w:r>
+        <w:t>mESCs</w:t>
+      </w:r>
+      <w:proofErr w:type="spellEnd"/>
+      <w:r>
+        <w:t>, which lack mature miRNAs, from control cells. Scripts exist for all four methods; their numeric results are not included here.</w:t>
+      </w:r>
+    </w:p>
+    <w:p>
       <w:r>
         <w:rPr>
           <w:b/>
         </w:rPr>
-        <w:t xml:space="preserve">Logic.</w:t>
+        <w:lastRenderedPageBreak/>
+        <w:t>Logic.</w:t>
       </w:r>
       <w:r>
         <w:t xml:space="preserve"> Without mature miRNAs, targets are de-repressed, so a good activity score should be higher in controls than in knockouts. Separation is an effect size d, using the knockout group's own SD, converted to an overlap percentage. Lower overlap means better separation and 100% means none.</w:t>
@@ -1272,22 +1930,98 @@
       <w:pPr>
         <w:pStyle w:val="Code"/>
       </w:pPr>
-      <w:bookmarkStart w:id="2" w:name="bongo_lang_latex_2"/>
-      <w:bookmarkEnd w:id="2"/>
-      <w:r>
-        <w:t xml:space="preserve">d = \frac{\bar{a}_{KO} - \bar{a}_{ctrl}}{\mathrm{SD}(a_{KO})}, \qquad \mathrm{overlap} = 2\,\Phi\!\left(-\tfrac{|d|}{2}\right) \times 100\%</w:t>
-      </w:r>
-    </w:p>
-    <w:p>
-      <w:pPr/>
+      <w:bookmarkStart w:id="1" w:name="bongo_lang_latex_2"/>
+      <w:bookmarkEnd w:id="1"/>
+      <w:r>
+        <w:t>d = \frac{\bar{a}_{KO} - \bar{a}_{ctrl</w:t>
+      </w:r>
+      <w:proofErr w:type="gramStart"/>
+      <w:r>
+        <w:t>}}{</w:t>
+      </w:r>
+      <w:proofErr w:type="gramEnd"/>
+      <w:r>
+        <w:t>\</w:t>
+      </w:r>
+      <w:proofErr w:type="spellStart"/>
+      <w:proofErr w:type="gramStart"/>
+      <w:r>
+        <w:t>mathrm</w:t>
+      </w:r>
+      <w:proofErr w:type="spellEnd"/>
+      <w:r>
+        <w:t>{</w:t>
+      </w:r>
+      <w:proofErr w:type="gramEnd"/>
+      <w:r>
+        <w:t>SD}(a_{KO})}, \</w:t>
+      </w:r>
+      <w:proofErr w:type="spellStart"/>
+      <w:r>
+        <w:t>qquad</w:t>
+      </w:r>
+      <w:proofErr w:type="spellEnd"/>
+      <w:r>
+        <w:t xml:space="preserve"> \</w:t>
+      </w:r>
+      <w:proofErr w:type="spellStart"/>
+      <w:r>
+        <w:t>mathrm</w:t>
+      </w:r>
+      <w:proofErr w:type="spellEnd"/>
+      <w:r>
+        <w:t>{overlap} = 2</w:t>
+      </w:r>
+      <w:proofErr w:type="gramStart"/>
+      <w:r>
+        <w:t>\,\Phi\</w:t>
+      </w:r>
+      <w:proofErr w:type="gramEnd"/>
+      <w:r>
+        <w:t>!\left(-\</w:t>
+      </w:r>
+      <w:proofErr w:type="spellStart"/>
+      <w:r>
+        <w:t>tfrac</w:t>
+      </w:r>
+      <w:proofErr w:type="spellEnd"/>
+      <w:r>
+        <w:t>{|d|}{</w:t>
+      </w:r>
+      <w:proofErr w:type="gramStart"/>
+      <w:r>
+        <w:t>2}\</w:t>
+      </w:r>
+      <w:proofErr w:type="gramEnd"/>
+      <w:r>
+        <w:t>right) \times 100\%</w:t>
+      </w:r>
+    </w:p>
+    <w:p>
       <w:r>
         <w:rPr>
           <w:b/>
         </w:rPr>
-        <w:t xml:space="preserve">miRNA families.</w:t>
-      </w:r>
-      <w:r>
-        <w:t xml:space="preserve"> We used the three most abundant miRNA families in mESCs, taken from TargetScan family files. The target-site motif is the reverse complement of the seed, which is what appears in 3'UTRs and what motif-based tools search for. Families 2 and 3 belong to the classic embryonic-stem-cell-specific miR-290 to 295 cluster.</w:t>
+        <w:t>miRNA families.</w:t>
+      </w:r>
+      <w:r>
+        <w:t xml:space="preserve"> We used the three most abundant miRNA families in </w:t>
+      </w:r>
+      <w:proofErr w:type="spellStart"/>
+      <w:r>
+        <w:t>mESCs</w:t>
+      </w:r>
+      <w:proofErr w:type="spellEnd"/>
+      <w:r>
+        <w:t xml:space="preserve">, taken from </w:t>
+      </w:r>
+      <w:proofErr w:type="spellStart"/>
+      <w:r>
+        <w:t>TargetScan</w:t>
+      </w:r>
+      <w:proofErr w:type="spellEnd"/>
+      <w:r>
+        <w:t xml:space="preserve"> family files. The target-site motif is the reverse complement of the seed, which is what appears in 3'UTRs and what motif-based tools search for. Families 2 and 3 belong to the classic embryonic-stem-cell-specific miR-290 to 295 cluster.</w:t>
       </w:r>
     </w:p>
     <w:tbl>
@@ -1295,7 +2029,7 @@
         <w:tblStyle w:val="TableGrid"/>
         <w:tblW w:w="0" w:type="auto"/>
         <w:tblLayout w:type="fixed"/>
-        <w:tblLook w:val="04A0" w:firstRow="1" w:lastRow="0" w:firstColumn="0" w:lastColumn="0" w:noHBand="0" w:noVBand="1"/>
+        <w:tblLook w:val="0420" w:firstRow="1" w:lastRow="0" w:firstColumn="0" w:lastColumn="0" w:noHBand="0" w:noVBand="1"/>
       </w:tblPr>
       <w:tblGrid>
         <w:gridCol w:w="2340"/>
@@ -1313,9 +2047,8 @@
             <w:shd w:val="clear" w:color="auto" w:fill="F2F2F2"/>
           </w:tcPr>
           <w:p>
-            <w:pPr/>
-            <w:r>
-              <w:t xml:space="preserve">Family</w:t>
+            <w:r>
+              <w:t>Family</w:t>
             </w:r>
           </w:p>
         </w:tc>
@@ -1325,9 +2058,8 @@
             <w:shd w:val="clear" w:color="auto" w:fill="F2F2F2"/>
           </w:tcPr>
           <w:p>
-            <w:pPr/>
-            <w:r>
-              <w:t xml:space="preserve">Members</w:t>
+            <w:r>
+              <w:t>Members</w:t>
             </w:r>
           </w:p>
         </w:tc>
@@ -1337,9 +2069,8 @@
             <w:shd w:val="clear" w:color="auto" w:fill="F2F2F2"/>
           </w:tcPr>
           <w:p>
-            <w:pPr/>
-            <w:r>
-              <w:t xml:space="preserve">Seed (RNA)</w:t>
+            <w:r>
+              <w:t>Seed (RNA)</w:t>
             </w:r>
           </w:p>
         </w:tc>
@@ -1349,9 +2080,8 @@
             <w:shd w:val="clear" w:color="auto" w:fill="F2F2F2"/>
           </w:tcPr>
           <w:p>
-            <w:pPr/>
-            <w:r>
-              <w:t xml:space="preserve">Target-site motif (DNA)</w:t>
+            <w:r>
+              <w:t>Target-site motif (DNA)</w:t>
             </w:r>
           </w:p>
         </w:tc>
@@ -1362,9 +2092,8 @@
             <w:tcW w:w="2340" w:type="dxa"/>
           </w:tcPr>
           <w:p>
-            <w:pPr/>
-            <w:r>
-              <w:t xml:space="preserve">MIR-17</w:t>
+            <w:r>
+              <w:t>MIR-17</w:t>
             </w:r>
           </w:p>
         </w:tc>
@@ -1373,9 +2102,8 @@
             <w:tcW w:w="2340" w:type="dxa"/>
           </w:tcPr>
           <w:p>
-            <w:pPr/>
-            <w:r>
-              <w:t xml:space="preserve">miR-17-5p, 20-5p, 93-5p, 106-5p</w:t>
+            <w:r>
+              <w:t>miR-17-5p, 20-5p, 93-5p, 106-5p</w:t>
             </w:r>
           </w:p>
         </w:tc>
@@ -1384,9 +2112,8 @@
             <w:tcW w:w="2340" w:type="dxa"/>
           </w:tcPr>
           <w:p>
-            <w:pPr/>
-            <w:r>
-              <w:t xml:space="preserve">AAAGUGC</w:t>
+            <w:r>
+              <w:t>AAAGUGC</w:t>
             </w:r>
           </w:p>
         </w:tc>
@@ -1395,9 +2122,8 @@
             <w:tcW w:w="2340" w:type="dxa"/>
           </w:tcPr>
           <w:p>
-            <w:pPr/>
-            <w:r>
-              <w:t xml:space="preserve">GCACTTT</w:t>
+            <w:r>
+              <w:t>GCACTTT</w:t>
             </w:r>
           </w:p>
         </w:tc>
@@ -1408,9 +2134,8 @@
             <w:tcW w:w="2340" w:type="dxa"/>
           </w:tcPr>
           <w:p>
-            <w:pPr/>
-            <w:r>
-              <w:t xml:space="preserve">MIR-291</w:t>
+            <w:r>
+              <w:t>MIR-291</w:t>
             </w:r>
           </w:p>
         </w:tc>
@@ -1419,9 +2144,8 @@
             <w:tcW w:w="2340" w:type="dxa"/>
           </w:tcPr>
           <w:p>
-            <w:pPr/>
-            <w:r>
-              <w:t xml:space="preserve">miR-291-3p, 294-3p, 295-3p, 302-3p</w:t>
+            <w:r>
+              <w:t>miR-291-3p, 294-3p, 295-3p, 302-3p</w:t>
             </w:r>
           </w:p>
         </w:tc>
@@ -1430,9 +2154,8 @@
             <w:tcW w:w="2340" w:type="dxa"/>
           </w:tcPr>
           <w:p>
-            <w:pPr/>
-            <w:r>
-              <w:t xml:space="preserve">AAGUGCU</w:t>
+            <w:r>
+              <w:t>AAGUGCU</w:t>
             </w:r>
           </w:p>
         </w:tc>
@@ -1441,9 +2164,8 @@
             <w:tcW w:w="2340" w:type="dxa"/>
           </w:tcPr>
           <w:p>
-            <w:pPr/>
-            <w:r>
-              <w:t xml:space="preserve">AGCACTT</w:t>
+            <w:r>
+              <w:t>AGCACTT</w:t>
             </w:r>
           </w:p>
         </w:tc>
@@ -1454,9 +2176,8 @@
             <w:tcW w:w="2340" w:type="dxa"/>
           </w:tcPr>
           <w:p>
-            <w:pPr/>
-            <w:r>
-              <w:t xml:space="preserve">MIR-292</w:t>
+            <w:r>
+              <w:t>MIR-292</w:t>
             </w:r>
           </w:p>
         </w:tc>
@@ -1465,9 +2186,8 @@
             <w:tcW w:w="2340" w:type="dxa"/>
           </w:tcPr>
           <w:p>
-            <w:pPr/>
-            <w:r>
-              <w:t xml:space="preserve">miR-292a-3p, 467a-5p</w:t>
+            <w:r>
+              <w:t>miR-292a-3p, 467a-5p</w:t>
             </w:r>
           </w:p>
         </w:tc>
@@ -1476,9 +2196,8 @@
             <w:tcW w:w="2340" w:type="dxa"/>
           </w:tcPr>
           <w:p>
-            <w:pPr/>
-            <w:r>
-              <w:t xml:space="preserve">AAGUGCC</w:t>
+            <w:r>
+              <w:t>AAGUGCC</w:t>
             </w:r>
           </w:p>
         </w:tc>
@@ -1487,21 +2206,19 @@
             <w:tcW w:w="2340" w:type="dxa"/>
           </w:tcPr>
           <w:p>
-            <w:pPr/>
-            <w:r>
-              <w:t xml:space="preserve">GGCACTT</w:t>
+            <w:r>
+              <w:t>GGCACTT</w:t>
             </w:r>
           </w:p>
         </w:tc>
       </w:tr>
     </w:tbl>
     <w:p>
-      <w:pPr/>
       <w:r>
         <w:rPr>
           <w:b/>
         </w:rPr>
-        <w:t xml:space="preserve">What each method was run on.</w:t>
+        <w:t>What each method was run on.</w:t>
       </w:r>
     </w:p>
     <w:p>
@@ -1513,7 +2230,15 @@
         </w:numPr>
       </w:pPr>
       <w:r>
-        <w:t xml:space="preserve">Our method: all combined targets, top 200, a negative control (targets of miRNAs absent from mESCs), each family alone, and each family's top 200.</w:t>
+        <w:t xml:space="preserve">Our method: all combined targets, top 200, a negative control (targets of miRNAs absent from </w:t>
+      </w:r>
+      <w:proofErr w:type="spellStart"/>
+      <w:r>
+        <w:t>mESCs</w:t>
+      </w:r>
+      <w:proofErr w:type="spellEnd"/>
+      <w:r>
+        <w:t>), each family alone, and each family's top 200.</w:t>
       </w:r>
     </w:p>
     <w:p>
@@ -1524,8 +2249,13 @@
           <w:numId w:val="8"/>
         </w:numPr>
       </w:pPr>
-      <w:r>
-        <w:t xml:space="preserve">bayesReact: one run per family motif, with the three per-cell scores summed for a combined score.</w:t>
+      <w:proofErr w:type="spellStart"/>
+      <w:r>
+        <w:t>bayesReact</w:t>
+      </w:r>
+      <w:proofErr w:type="spellEnd"/>
+      <w:r>
+        <w:t>: one run per family motif, with the three per-cell scores summed for a combined score.</w:t>
       </w:r>
     </w:p>
     <w:p>
@@ -1536,8 +2266,13 @@
           <w:numId w:val="8"/>
         </w:numPr>
       </w:pPr>
-      <w:r>
-        <w:t xml:space="preserve">miReact motif mode: one run scores all motifs; the three family rows are extracted and summed.</w:t>
+      <w:proofErr w:type="spellStart"/>
+      <w:r>
+        <w:t>miReact</w:t>
+      </w:r>
+      <w:proofErr w:type="spellEnd"/>
+      <w:r>
+        <w:t xml:space="preserve"> motif mode: one run scores all motifs; the three family rows are extracted and summed.</w:t>
       </w:r>
     </w:p>
     <w:p>
@@ -1548,14 +2283,26 @@
           <w:numId w:val="8"/>
         </w:numPr>
       </w:pPr>
-      <w:r>
-        <w:t xml:space="preserve">miTEA-HiRes: combined and negative-control target lists through the custom-list route, so no mouse database is needed.</w:t>
-      </w:r>
-    </w:p>
-    <w:p>
-      <w:pPr/>
-      <w:r>
-        <w:t xml:space="preserve">Negative controls exist only for our method and miTEA-HiRes, because seed motifs for the negative-control miRNAs have not been derived. In this analysis our score is normalized to the knockout-cell mean, deliberately unlike the HEK293 analysis. A plotting script combines everything into three figures: the combined result per method, the negative controls, and the per-family breakdown.</w:t>
+      <w:proofErr w:type="spellStart"/>
+      <w:r>
+        <w:t>miTEA-HiRes</w:t>
+      </w:r>
+      <w:proofErr w:type="spellEnd"/>
+      <w:r>
+        <w:t>: combined and negative-control target lists through the custom-list route, so no mouse database is needed.</w:t>
+      </w:r>
+    </w:p>
+    <w:p>
+      <w:r>
+        <w:t xml:space="preserve">Negative controls exist only for our method and </w:t>
+      </w:r>
+      <w:proofErr w:type="spellStart"/>
+      <w:r>
+        <w:t>miTEA-HiRes</w:t>
+      </w:r>
+      <w:proofErr w:type="spellEnd"/>
+      <w:r>
+        <w:t>, because seed motifs for the negative-control miRNAs have not been derived. In this analysis our score is normalized to the knockout-cell mean, deliberately unlike the HEK293 analysis. A plotting script combines everything into three figures: the combined result per method, the negative controls, and the per-family breakdown.</w:t>
       </w:r>
     </w:p>
     <w:p>
@@ -1563,19 +2310,17 @@
         <w:pStyle w:val="Heading2"/>
       </w:pPr>
       <w:r>
-        <w:t xml:space="preserve">Direct miRNA sequencing and tools set aside</w:t>
-      </w:r>
-    </w:p>
-    <w:p>
-      <w:pPr/>
-      <w:r>
-        <w:t xml:space="preserve">The comparison of real miRNA sequencing with computed activity is blocked on matching data, not on analysis. We have miR-124-3p counts for wells in columns 7 to 12 of a separate 96-well plate, and the goal is two scatterplots: GFP fluorescence against computed activity, and GFP fluorescence against real miR-124 counts.</w:t>
-      </w:r>
-    </w:p>
-    <w:p>
-      <w:pPr/>
-      <w:r>
-        <w:t xml:space="preserve">Two questions are unresolved:</w:t>
+        <w:t>Direct miRNA sequencing and tools set aside</w:t>
+      </w:r>
+    </w:p>
+    <w:p>
+      <w:r>
+        <w:t>The comparison of real miRNA sequencing with computed activity is blocked on matching data, not on analysis. We have miR-124-3p counts for wells in columns 7 to 12 of a separate 96-well plate, and the goal is two scatterplots: GFP fluorescence against computed activity, and GFP fluorescence against real miR-124 counts.</w:t>
+      </w:r>
+    </w:p>
+    <w:p>
+      <w:r>
+        <w:t>Two questions are unresolved:</w:t>
       </w:r>
     </w:p>
     <w:p>
@@ -1587,7 +2332,7 @@
         </w:numPr>
       </w:pPr>
       <w:r>
-        <w:t xml:space="preserve">The fluorescence extraction script covers the 384-well Smart-seq3 plates, a different plate from the 96-well miRNA plate. Per-cell fluorescence for the 96-well cells needs a separate FACS index-sort file, if one exists.</w:t>
+        <w:t>The fluorescence extraction script covers the 384-well Smart-seq3 plates, a different plate from the 96-well miRNA plate. Per-cell fluorescence for the 96-well cells needs a separate FACS index-sort file, if one exists.</w:t>
       </w:r>
     </w:p>
     <w:p>
@@ -1599,22 +2344,29 @@
         </w:numPr>
       </w:pPr>
       <w:r>
-        <w:t xml:space="preserve">Computing our activity for those same cells needs mRNA data from the same 96-well wells. If it does not exist, the comparison can only be made at population level.</w:t>
-      </w:r>
-    </w:p>
-    <w:p>
-      <w:pPr/>
-      <w:r>
-        <w:t xml:space="preserve">The +6 column offset in the miRNA preprocessing script converts sequenced-column numbering to physical columns 7 to 12; this is our reading of the script, not a confirmed fact.</w:t>
-      </w:r>
-    </w:p>
-    <w:p>
-      <w:pPr/>
+        <w:lastRenderedPageBreak/>
+        <w:t>Computing our activity for those same cells needs mRNA data from the same 96-well wells. If it does not exist, the comparison can only be made at population level.</w:t>
+      </w:r>
+    </w:p>
+    <w:p>
+      <w:r>
+        <w:t xml:space="preserve">The </w:t>
+      </w:r>
+      <w:proofErr w:type="gramStart"/>
+      <w:r>
+        <w:t>+6 column</w:t>
+      </w:r>
+      <w:proofErr w:type="gramEnd"/>
+      <w:r>
+        <w:t xml:space="preserve"> offset in the miRNA preprocessing script converts sequenced-column numbering to physical columns 7 to 12; this is our reading of the script, not a confirmed fact.</w:t>
+      </w:r>
+    </w:p>
+    <w:p>
       <w:r>
         <w:rPr>
           <w:b/>
         </w:rPr>
-        <w:t xml:space="preserve">Tools investigated and set aside</w:t>
+        <w:t>Tools investigated and set aside</w:t>
       </w:r>
     </w:p>
     <w:p>
@@ -1625,28 +2377,46 @@
           <w:numId w:val="10"/>
         </w:numPr>
       </w:pPr>
-      <w:hyperlink r:id="rId6" w:history="1">
+      <w:hyperlink r:id="rId8" w:history="1">
+        <w:proofErr w:type="spellStart"/>
         <w:r>
           <w:rPr>
             <w:rStyle w:val="Hyperlink"/>
             <w:b/>
           </w:rPr>
-          <w:t xml:space="preserve">miDGD</w:t>
+          <w:t>miDGD</w:t>
         </w:r>
+        <w:proofErr w:type="spellEnd"/>
       </w:hyperlink>
       <w:r>
         <w:t xml:space="preserve">: a deep generative model that predicts miRNA expression from mRNA. A pretrained checkpoint that includes single-cell Smart-seq data is public on GitHub. It expects 15,625 genes and 156 miRNAs in a fixed order, but their names exist only in a 42.3 GB </w:t>
       </w:r>
-      <w:hyperlink r:id="rId7" w:history="1">
+      <w:hyperlink r:id="rId9" w:history="1">
+        <w:proofErr w:type="spellStart"/>
         <w:r>
           <w:rPr>
             <w:rStyle w:val="Hyperlink"/>
           </w:rPr>
-          <w:t xml:space="preserve">Zenodo dataset</w:t>
+          <w:t>Zenodo</w:t>
+        </w:r>
+        <w:proofErr w:type="spellEnd"/>
+        <w:r>
+          <w:rPr>
+            <w:rStyle w:val="Hyperlink"/>
+          </w:rPr>
+          <w:t xml:space="preserve"> dataset</w:t>
         </w:r>
       </w:hyperlink>
       <w:r>
-        <w:t xml:space="preserve"> whose files are restricted, so access must be requested from the authors. The repository README cites a different Zenodo record number, which appears to be a typo.</w:t>
+        <w:t xml:space="preserve"> whose files are restricted, so access must be requested from the authors. The repository README cites a different </w:t>
+      </w:r>
+      <w:proofErr w:type="spellStart"/>
+      <w:r>
+        <w:t>Zenodo</w:t>
+      </w:r>
+      <w:proofErr w:type="spellEnd"/>
+      <w:r>
+        <w:t xml:space="preserve"> record number, which appears to be a typo.</w:t>
       </w:r>
     </w:p>
     <w:p>
@@ -1657,17 +2427,35 @@
           <w:numId w:val="10"/>
         </w:numPr>
       </w:pPr>
-      <w:hyperlink r:id="rId8" w:history="1">
+      <w:hyperlink r:id="rId10" w:history="1">
+        <w:proofErr w:type="spellStart"/>
         <w:r>
           <w:rPr>
             <w:rStyle w:val="Hyperlink"/>
             <w:b/>
           </w:rPr>
-          <w:t xml:space="preserve">miRSCAPE</w:t>
+          <w:t>miRSCAPE</w:t>
         </w:r>
+        <w:proofErr w:type="spellEnd"/>
       </w:hyperlink>
       <w:r>
-        <w:t xml:space="preserve">: an XGBoost model trained on bulk mRNA and miRNA data. It predicts per cluster (pseudobulk), not per cell. Its bundled example holds only five miRNAs, none of them miR-124, and its code contains a hard-coded variable bug. Using it would need a bulk dataset that includes miR-124-3p, for example kidney TCGA data.</w:t>
+        <w:t xml:space="preserve">: an </w:t>
+      </w:r>
+      <w:proofErr w:type="spellStart"/>
+      <w:r>
+        <w:t>XGBoost</w:t>
+      </w:r>
+      <w:proofErr w:type="spellEnd"/>
+      <w:r>
+        <w:t xml:space="preserve"> model trained on bulk mRNA and miRNA data. It predicts per cluster (</w:t>
+      </w:r>
+      <w:proofErr w:type="spellStart"/>
+      <w:r>
+        <w:t>pseudobulk</w:t>
+      </w:r>
+      <w:proofErr w:type="spellEnd"/>
+      <w:r>
+        <w:t>), not per cell. Its bundled example holds only five miRNAs, none of them miR-124, and its code contains a hard-coded variable bug. Using it would need a bulk dataset that includes miR-124-3p, for example kidney TCGA data.</w:t>
       </w:r>
     </w:p>
     <w:p>
@@ -1675,22 +2463,20 @@
         <w:pStyle w:val="Heading2"/>
       </w:pPr>
       <w:r>
-        <w:t xml:space="preserve">Caveats, open questions and next steps</w:t>
-      </w:r>
-    </w:p>
-    <w:p>
-      <w:pPr/>
-      <w:r>
-        <w:t xml:space="preserve">The main scientific risk is that one miRNA in one reporter line, scored against GFP mRNA, may not generalize. These are the points to weigh before drawing conclusions.</w:t>
-      </w:r>
-    </w:p>
-    <w:p>
-      <w:pPr/>
+        <w:t>Caveats, open questions and next steps</w:t>
+      </w:r>
+    </w:p>
+    <w:p>
+      <w:r>
+        <w:t>The main scientific risk is that one miRNA in one reporter line, scored against GFP mRNA, may not generalize. These are the points to weigh before drawing conclusions.</w:t>
+      </w:r>
+    </w:p>
+    <w:p>
       <w:r>
         <w:rPr>
           <w:b/>
         </w:rPr>
-        <w:t xml:space="preserve">Caveats</w:t>
+        <w:t>Caveats</w:t>
       </w:r>
     </w:p>
     <w:p>
@@ -1702,7 +2488,15 @@
         </w:numPr>
       </w:pPr>
       <w:r>
-        <w:t xml:space="preserve">The ground truth is eGFP mRNA from the same libraries as the predictors, not protein fluorescence or measured miRNA, so shared technical variation can inflate agreement.</w:t>
+        <w:t xml:space="preserve">The ground truth is </w:t>
+      </w:r>
+      <w:proofErr w:type="spellStart"/>
+      <w:r>
+        <w:t>eGFP</w:t>
+      </w:r>
+      <w:proofErr w:type="spellEnd"/>
+      <w:r>
+        <w:t xml:space="preserve"> mRNA from the same libraries as the predictors, not protein fluorescence or measured miRNA, so shared technical variation can inflate agreement.</w:t>
       </w:r>
     </w:p>
     <w:p>
@@ -1714,7 +2508,7 @@
         </w:numPr>
       </w:pPr>
       <w:r>
-        <w:t xml:space="preserve">Everything so far concerns one miRNA (miR-124-3p) in one cell line and one reporter construct.</w:t>
+        <w:t>Everything so far concerns one miRNA (miR-124-3p) in one cell line and one reporter construct.</w:t>
       </w:r>
     </w:p>
     <w:p>
@@ -1726,7 +2520,7 @@
         </w:numPr>
       </w:pPr>
       <w:r>
-        <w:t xml:space="preserve">scran normalization limits the gene universe to protein-coding, low-dropout genes, so some targets are unavailable to every method.</w:t>
+        <w:t>scran normalization limits the gene universe to protein-coding, low-dropout genes, so some targets are unavailable to every method.</w:t>
       </w:r>
     </w:p>
     <w:p>
@@ -1738,7 +2532,15 @@
         </w:numPr>
       </w:pPr>
       <w:r>
-        <w:t xml:space="preserve">The tools are not scored on identical information: motif-based tools use no target list, and curated and predicted lists differ in size and quality.</w:t>
+        <w:t xml:space="preserve">The tools are not scored on identical information: motif-based tools use no target </w:t>
+      </w:r>
+      <w:proofErr w:type="gramStart"/>
+      <w:r>
+        <w:t>list, and</w:t>
+      </w:r>
+      <w:proofErr w:type="gramEnd"/>
+      <w:r>
+        <w:t xml:space="preserve"> curated and predicted lists differ in size and quality.</w:t>
       </w:r>
     </w:p>
     <w:p>
@@ -1750,16 +2552,15 @@
         </w:numPr>
       </w:pPr>
       <w:r>
-        <w:t xml:space="preserve">The original manuscript draft describes the in-house vector as expressing miR-122, whereas all analysis scripts and target files use miR-124-3p; this needs confirming before writing up.</w:t>
-      </w:r>
-    </w:p>
-    <w:p>
-      <w:pPr/>
+        <w:t>The original manuscript draft describes the in-house vector as expressing miR-122, whereas all analysis scripts and target files use miR-124-3p; this needs confirming before writing up.</w:t>
+      </w:r>
+    </w:p>
+    <w:p>
       <w:r>
         <w:rPr>
           <w:b/>
         </w:rPr>
-        <w:t xml:space="preserve">Next steps</w:t>
+        <w:t>Next steps</w:t>
       </w:r>
     </w:p>
     <w:p>
@@ -1771,7 +2572,31 @@
         </w:numPr>
       </w:pPr>
       <w:r>
-        <w:t xml:space="preserve">☐ Review the numeric results for bayesReact, miReact motif mode and miTEA-HiRes, then fill the HEK293 table above (the bar-plot script is ready).</w:t>
+        <w:t xml:space="preserve">☐ Review the numeric results for </w:t>
+      </w:r>
+      <w:proofErr w:type="spellStart"/>
+      <w:r>
+        <w:t>bayesReact</w:t>
+      </w:r>
+      <w:proofErr w:type="spellEnd"/>
+      <w:r>
+        <w:t xml:space="preserve">, </w:t>
+      </w:r>
+      <w:proofErr w:type="spellStart"/>
+      <w:r>
+        <w:t>miReact</w:t>
+      </w:r>
+      <w:proofErr w:type="spellEnd"/>
+      <w:r>
+        <w:t xml:space="preserve"> motif mode and </w:t>
+      </w:r>
+      <w:proofErr w:type="spellStart"/>
+      <w:r>
+        <w:t>miTEA-HiRes</w:t>
+      </w:r>
+      <w:proofErr w:type="spellEnd"/>
+      <w:r>
+        <w:t>, then fill the HEK293 table above (the bar-plot script is ready).</w:t>
       </w:r>
     </w:p>
     <w:p>
@@ -1783,7 +2608,15 @@
         </w:numPr>
       </w:pPr>
       <w:r>
-        <w:t xml:space="preserve">☐ Run the negative-control test for rank-based tools: an unrelated miRNA's large TarBase list through miReact.</w:t>
+        <w:t xml:space="preserve">☐ Run the negative-control test for rank-based tools: an unrelated miRNA's large TarBase list through </w:t>
+      </w:r>
+      <w:proofErr w:type="spellStart"/>
+      <w:r>
+        <w:t>miReact</w:t>
+      </w:r>
+      <w:proofErr w:type="spellEnd"/>
+      <w:r>
+        <w:t>.</w:t>
       </w:r>
     </w:p>
     <w:p>
@@ -1795,7 +2628,15 @@
         </w:numPr>
       </w:pPr>
       <w:r>
-        <w:t xml:space="preserve">☐ Rerun co-expression filtering with the corrected correlation function, and repeat it on random non-target genes.</w:t>
+        <w:t xml:space="preserve">☐ Rerun co-expression filtering with the corrected correlation </w:t>
+      </w:r>
+      <w:proofErr w:type="gramStart"/>
+      <w:r>
+        <w:t>function, and</w:t>
+      </w:r>
+      <w:proofErr w:type="gramEnd"/>
+      <w:r>
+        <w:t xml:space="preserve"> repeat it on random non-target genes.</w:t>
       </w:r>
     </w:p>
     <w:p>
@@ -1807,7 +2648,7 @@
         </w:numPr>
       </w:pPr>
       <w:r>
-        <w:t xml:space="preserve">☐ Resolve the FACS and mRNA matching questions for the 96-well plate, then build the two validation scatterplots.</w:t>
+        <w:t>☐ Resolve the FACS and mRNA matching questions for the 96-well plate, then build the two validation scatterplots.</w:t>
       </w:r>
     </w:p>
     <w:p>
@@ -1819,7 +2660,47 @@
         </w:numPr>
       </w:pPr>
       <w:r>
-        <w:t xml:space="preserve">☐ Extend the per-family and top-200 mESC variants to bayesReact, miReact and miTEA-HiRes.</w:t>
+        <w:t xml:space="preserve">☐ Extend the per-family and </w:t>
+      </w:r>
+      <w:proofErr w:type="gramStart"/>
+      <w:r>
+        <w:t>top-200</w:t>
+      </w:r>
+      <w:proofErr w:type="gramEnd"/>
+      <w:r>
+        <w:t xml:space="preserve"> </w:t>
+      </w:r>
+      <w:proofErr w:type="spellStart"/>
+      <w:r>
+        <w:t>mESC</w:t>
+      </w:r>
+      <w:proofErr w:type="spellEnd"/>
+      <w:r>
+        <w:t xml:space="preserve"> variants to </w:t>
+      </w:r>
+      <w:proofErr w:type="spellStart"/>
+      <w:r>
+        <w:t>bayesReact</w:t>
+      </w:r>
+      <w:proofErr w:type="spellEnd"/>
+      <w:r>
+        <w:t xml:space="preserve">, </w:t>
+      </w:r>
+      <w:proofErr w:type="spellStart"/>
+      <w:r>
+        <w:t>miReact</w:t>
+      </w:r>
+      <w:proofErr w:type="spellEnd"/>
+      <w:r>
+        <w:t xml:space="preserve"> and </w:t>
+      </w:r>
+      <w:proofErr w:type="spellStart"/>
+      <w:r>
+        <w:t>miTEA-HiRes</w:t>
+      </w:r>
+      <w:proofErr w:type="spellEnd"/>
+      <w:r>
+        <w:t>.</w:t>
       </w:r>
     </w:p>
     <w:p>
@@ -1831,7 +2712,7 @@
         </w:numPr>
       </w:pPr>
       <w:r>
-        <w:t xml:space="preserve">☐ Repeat the high-expression-gene test under scran normalization.</w:t>
+        <w:t>☐ Repeat the high-expression-gene test under scran normalization.</w:t>
       </w:r>
     </w:p>
     <w:p>
@@ -1843,16 +2724,32 @@
         </w:numPr>
       </w:pPr>
       <w:r>
-        <w:t xml:space="preserve">☐ Request access to miDGD's Zenodo data if that tool is still wanted.</w:t>
-      </w:r>
-    </w:p>
-    <w:p>
-      <w:pPr/>
+        <w:lastRenderedPageBreak/>
+        <w:t xml:space="preserve">☐ Request access to </w:t>
+      </w:r>
+      <w:proofErr w:type="spellStart"/>
+      <w:r>
+        <w:t>miDGD's</w:t>
+      </w:r>
+      <w:proofErr w:type="spellEnd"/>
+      <w:r>
+        <w:t xml:space="preserve"> </w:t>
+      </w:r>
+      <w:proofErr w:type="spellStart"/>
+      <w:r>
+        <w:t>Zenodo</w:t>
+      </w:r>
+      <w:proofErr w:type="spellEnd"/>
+      <w:r>
+        <w:t xml:space="preserve"> data if that tool is still wanted.</w:t>
+      </w:r>
+    </w:p>
+    <w:p>
       <w:r>
         <w:rPr>
           <w:b/>
         </w:rPr>
-        <w:t xml:space="preserve">Practical notes for reproducing</w:t>
+        <w:t>Practical notes for reproducing</w:t>
       </w:r>
     </w:p>
     <w:p>
@@ -1864,7 +2761,15 @@
         </w:numPr>
       </w:pPr>
       <w:r>
-        <w:t xml:space="preserve">Analyses run on the Dardel cluster under one project directory. External tools live in a shared tools folder built by a single setup script.</w:t>
+        <w:t xml:space="preserve">Analyses run on the </w:t>
+      </w:r>
+      <w:proofErr w:type="spellStart"/>
+      <w:r>
+        <w:t>Dardel</w:t>
+      </w:r>
+      <w:proofErr w:type="spellEnd"/>
+      <w:r>
+        <w:t xml:space="preserve"> cluster under one project directory. External tools live in a shared tools folder built by a single setup script.</w:t>
       </w:r>
     </w:p>
     <w:p>
@@ -1875,23 +2780,47 @@
           <w:numId w:val="13"/>
         </w:numPr>
       </w:pPr>
-      <w:r>
-        <w:t xml:space="preserve">miReact's motif mode needs the Synapse files, plus cluster settings (account, partition, R library path) passed as environment variables. miTEA-HiRes needs its own Python 3.8 environment, and live database queries (biomaRt) must run on the login node.</w:t>
+      <w:proofErr w:type="spellStart"/>
+      <w:r>
+        <w:t>miReact's</w:t>
+      </w:r>
+      <w:proofErr w:type="spellEnd"/>
+      <w:r>
+        <w:t xml:space="preserve"> motif mode needs the Synapse files, plus cluster settings (account, partition, R library path) passed as environment variables. </w:t>
+      </w:r>
+      <w:proofErr w:type="spellStart"/>
+      <w:r>
+        <w:t>miTEA-HiRes</w:t>
+      </w:r>
+      <w:proofErr w:type="spellEnd"/>
+      <w:r>
+        <w:t xml:space="preserve"> needs its own Python 3.8 environment, and live database queries (</w:t>
+      </w:r>
+      <w:proofErr w:type="spellStart"/>
+      <w:r>
+        <w:t>biomaRt</w:t>
+      </w:r>
+      <w:proofErr w:type="spellEnd"/>
+      <w:r>
+        <w:t>) must run on the login node.</w:t>
       </w:r>
     </w:p>
     <w:sectPr>
       <w:pgSz w:w="12240" w:h="15840"/>
       <w:pgMar w:top="1440" w:right="1440" w:bottom="1440" w:left="1440" w:header="720" w:footer="720" w:gutter="0"/>
+      <w:cols w:space="720"/>
     </w:sectPr>
   </w:body>
 </w:document>
 </file>
 
 <file path=word/numbering.xml><?xml version="1.0" encoding="utf-8"?>
-<w:numbering xmlns:w="http://schemas.openxmlformats.org/wordprocessingml/2006/main">
-  <w:abstractNum w:abstractNumId="0">
+<w:numbering xmlns:wpc="http://schemas.microsoft.com/office/word/2010/wordprocessingCanvas" xmlns:cx="http://schemas.microsoft.com/office/drawing/2014/chartex" xmlns:cx1="http://schemas.microsoft.com/office/drawing/2015/9/8/chartex" xmlns:cx2="http://schemas.microsoft.com/office/drawing/2015/10/21/chartex" xmlns:cx3="http://schemas.microsoft.com/office/drawing/2016/5/9/chartex" xmlns:cx4="http://schemas.microsoft.com/office/drawing/2016/5/10/chartex" xmlns:cx5="http://schemas.microsoft.com/office/drawing/2016/5/11/chartex" xmlns:cx6="http://schemas.microsoft.com/office/drawing/2016/5/12/chartex" xmlns:cx7="http://schemas.microsoft.com/office/drawing/2016/5/13/chartex" xmlns:cx8="http://schemas.microsoft.com/office/drawing/2016/5/14/chartex" xmlns:mc="http://schemas.openxmlformats.org/markup-compatibility/2006" xmlns:m="http://schemas.openxmlformats.org/officeDocument/2006/math" xmlns:aink="http://schemas.microsoft.com/office/drawing/2016/ink" xmlns:am3d="http://schemas.microsoft.com/office/drawing/2017/model3d" xmlns:oel="http://schemas.microsoft.com/office/2019/extlst" xmlns:r="http://schemas.openxmlformats.org/officeDocument/2006/relationships" xmlns:wp14="http://schemas.microsoft.com/office/word/2010/wordprocessingDrawing" xmlns:wp="http://schemas.openxmlformats.org/drawingml/2006/wordprocessingDrawing" xmlns:wpg="http://schemas.microsoft.com/office/word/2010/wordprocessingGroup" xmlns:wpi="http://schemas.microsoft.com/office/word/2010/wordprocessingInk" xmlns:wps="http://schemas.microsoft.com/office/word/2010/wordprocessingShape" xmlns:o="urn:schemas-microsoft-com:office:office" xmlns:v="urn:schemas-microsoft-com:vml" xmlns:w10="urn:schemas-microsoft-com:office:word" xmlns:w="http://schemas.openxmlformats.org/wordprocessingml/2006/main" xmlns:w14="http://schemas.microsoft.com/office/word/2010/wordml" xmlns:w15="http://schemas.microsoft.com/office/word/2012/wordml" xmlns:w16cex="http://schemas.microsoft.com/office/word/2018/wordml/cex" xmlns:w16cid="http://schemas.microsoft.com/office/word/2016/wordml/cid" xmlns:w16="http://schemas.microsoft.com/office/word/2018/wordml" xmlns:w16sdtdh="http://schemas.microsoft.com/office/word/2020/wordml/sdtdatahash" xmlns:w16sdtfl="http://schemas.microsoft.com/office/word/2024/wordml/sdtformatlock" xmlns:w16se="http://schemas.microsoft.com/office/word/2015/wordml/symex" xmlns:w16du="http://schemas.microsoft.com/office/word/2023/wordml/word16du" xmlns:wne="http://schemas.microsoft.com/office/word/2006/wordml" mc:Ignorable="w14 w15 w16se w16cid w16 w16cex w16sdtdh w16sdtfl w16du wp14">
+  <w:abstractNum w:abstractNumId="0" w15:restartNumberingAfterBreak="0">
+    <w:nsid w:val="349E5E56"/>
     <w:multiLevelType w:val="hybridMultilevel"/>
-    <w:lvl w:ilvl="0">
+    <w:tmpl w:val="AEB4BC22"/>
+    <w:lvl w:ilvl="0" w:tplc="FE7C76C2">
       <w:start w:val="1"/>
       <w:numFmt w:val="bullet"/>
       <w:lvlText w:val="•"/>
@@ -1900,7 +2829,7 @@
         <w:ind w:left="720" w:hanging="360"/>
       </w:pPr>
     </w:lvl>
-    <w:lvl w:ilvl="1">
+    <w:lvl w:ilvl="1" w:tplc="5164BAA8">
       <w:start w:val="1"/>
       <w:numFmt w:val="bullet"/>
       <w:lvlText w:val="o"/>
@@ -1909,7 +2838,7 @@
         <w:ind w:left="1440" w:hanging="360"/>
       </w:pPr>
     </w:lvl>
-    <w:lvl w:ilvl="2">
+    <w:lvl w:ilvl="2" w:tplc="4560EA56">
       <w:start w:val="1"/>
       <w:numFmt w:val="bullet"/>
       <w:lvlText w:val="▪"/>
@@ -1918,7 +2847,7 @@
         <w:ind w:left="2160" w:hanging="360"/>
       </w:pPr>
     </w:lvl>
-    <w:lvl w:ilvl="3">
+    <w:lvl w:ilvl="3" w:tplc="9F12E71A">
       <w:start w:val="1"/>
       <w:numFmt w:val="bullet"/>
       <w:lvlText w:val="•"/>
@@ -1927,7 +2856,7 @@
         <w:ind w:left="2880" w:hanging="360"/>
       </w:pPr>
     </w:lvl>
-    <w:lvl w:ilvl="4">
+    <w:lvl w:ilvl="4" w:tplc="67DAB5AA">
       <w:start w:val="1"/>
       <w:numFmt w:val="bullet"/>
       <w:lvlText w:val="o"/>
@@ -1936,7 +2865,7 @@
         <w:ind w:left="3600" w:hanging="360"/>
       </w:pPr>
     </w:lvl>
-    <w:lvl w:ilvl="5">
+    <w:lvl w:ilvl="5" w:tplc="C4EC38D6">
       <w:start w:val="1"/>
       <w:numFmt w:val="bullet"/>
       <w:lvlText w:val="▪"/>
@@ -1945,7 +2874,7 @@
         <w:ind w:left="4320" w:hanging="360"/>
       </w:pPr>
     </w:lvl>
-    <w:lvl w:ilvl="6">
+    <w:lvl w:ilvl="6" w:tplc="B1F6CC8E">
       <w:start w:val="1"/>
       <w:numFmt w:val="bullet"/>
       <w:lvlText w:val="•"/>
@@ -1954,7 +2883,7 @@
         <w:ind w:left="5040" w:hanging="360"/>
       </w:pPr>
     </w:lvl>
-    <w:lvl w:ilvl="7">
+    <w:lvl w:ilvl="7" w:tplc="F7865AAE">
       <w:start w:val="1"/>
       <w:numFmt w:val="bullet"/>
       <w:lvlText w:val="o"/>
@@ -1963,7 +2892,7 @@
         <w:ind w:left="5760" w:hanging="360"/>
       </w:pPr>
     </w:lvl>
-    <w:lvl w:ilvl="8">
+    <w:lvl w:ilvl="8" w:tplc="5366DEF4">
       <w:start w:val="1"/>
       <w:numFmt w:val="bullet"/>
       <w:lvlText w:val="▪"/>
@@ -1973,9 +2902,11 @@
       </w:pPr>
     </w:lvl>
   </w:abstractNum>
-  <w:abstractNum w:abstractNumId="1">
+  <w:abstractNum w:abstractNumId="1" w15:restartNumberingAfterBreak="0">
+    <w:nsid w:val="58A16D86"/>
     <w:multiLevelType w:val="hybridMultilevel"/>
-    <w:lvl w:ilvl="0">
+    <w:tmpl w:val="FFF63914"/>
+    <w:lvl w:ilvl="0" w:tplc="3C9A420C">
       <w:start w:val="1"/>
       <w:numFmt w:val="decimal"/>
       <w:lvlText w:val="%1."/>
@@ -1984,7 +2915,7 @@
         <w:ind w:left="720" w:hanging="360"/>
       </w:pPr>
     </w:lvl>
-    <w:lvl w:ilvl="1">
+    <w:lvl w:ilvl="1" w:tplc="1332BB8A">
       <w:start w:val="1"/>
       <w:numFmt w:val="lowerLetter"/>
       <w:lvlText w:val="%2."/>
@@ -1993,7 +2924,7 @@
         <w:ind w:left="1440" w:hanging="360"/>
       </w:pPr>
     </w:lvl>
-    <w:lvl w:ilvl="2">
+    <w:lvl w:ilvl="2" w:tplc="459267BE">
       <w:start w:val="1"/>
       <w:numFmt w:val="lowerRoman"/>
       <w:lvlText w:val="%3."/>
@@ -2002,7 +2933,7 @@
         <w:ind w:left="2160" w:hanging="360"/>
       </w:pPr>
     </w:lvl>
-    <w:lvl w:ilvl="3">
+    <w:lvl w:ilvl="3" w:tplc="794CC9B4">
       <w:start w:val="1"/>
       <w:numFmt w:val="decimal"/>
       <w:lvlText w:val="%4."/>
@@ -2011,7 +2942,7 @@
         <w:ind w:left="2880" w:hanging="360"/>
       </w:pPr>
     </w:lvl>
-    <w:lvl w:ilvl="4">
+    <w:lvl w:ilvl="4" w:tplc="7E32E0FE">
       <w:start w:val="1"/>
       <w:numFmt w:val="lowerLetter"/>
       <w:lvlText w:val="%5."/>
@@ -2020,7 +2951,7 @@
         <w:ind w:left="3600" w:hanging="360"/>
       </w:pPr>
     </w:lvl>
-    <w:lvl w:ilvl="5">
+    <w:lvl w:ilvl="5" w:tplc="2D8E0386">
       <w:start w:val="1"/>
       <w:numFmt w:val="lowerRoman"/>
       <w:lvlText w:val="%6."/>
@@ -2029,7 +2960,7 @@
         <w:ind w:left="4320" w:hanging="360"/>
       </w:pPr>
     </w:lvl>
-    <w:lvl w:ilvl="6">
+    <w:lvl w:ilvl="6" w:tplc="AB3CB0BE">
       <w:start w:val="1"/>
       <w:numFmt w:val="decimal"/>
       <w:lvlText w:val="%7."/>
@@ -2038,7 +2969,7 @@
         <w:ind w:left="5040" w:hanging="360"/>
       </w:pPr>
     </w:lvl>
-    <w:lvl w:ilvl="7">
+    <w:lvl w:ilvl="7" w:tplc="F11C77E4">
       <w:start w:val="1"/>
       <w:numFmt w:val="lowerLetter"/>
       <w:lvlText w:val="%8."/>
@@ -2047,7 +2978,7 @@
         <w:ind w:left="5760" w:hanging="360"/>
       </w:pPr>
     </w:lvl>
-    <w:lvl w:ilvl="8">
+    <w:lvl w:ilvl="8" w:tplc="DB9223FE">
       <w:start w:val="1"/>
       <w:numFmt w:val="lowerRoman"/>
       <w:lvlText w:val="%9."/>
@@ -2057,63 +2988,63 @@
       </w:pPr>
     </w:lvl>
   </w:abstractNum>
-  <w:num w:numId="1">
+  <w:num w:numId="1" w16cid:durableId="79064419">
     <w:abstractNumId w:val="0"/>
   </w:num>
-  <w:num w:numId="2">
+  <w:num w:numId="2" w16cid:durableId="1295477711">
     <w:abstractNumId w:val="0"/>
   </w:num>
-  <w:num w:numId="3">
+  <w:num w:numId="3" w16cid:durableId="2073505230">
     <w:abstractNumId w:val="0"/>
   </w:num>
-  <w:num w:numId="4">
+  <w:num w:numId="4" w16cid:durableId="1352877946">
     <w:abstractNumId w:val="0"/>
   </w:num>
-  <w:num w:numId="5">
+  <w:num w:numId="5" w16cid:durableId="1451319875">
     <w:abstractNumId w:val="0"/>
   </w:num>
-  <w:num w:numId="6">
+  <w:num w:numId="6" w16cid:durableId="251745444">
     <w:abstractNumId w:val="1"/>
     <w:lvlOverride w:ilvl="0">
       <w:startOverride w:val="1"/>
     </w:lvlOverride>
   </w:num>
-  <w:num w:numId="7">
+  <w:num w:numId="7" w16cid:durableId="8071407">
     <w:abstractNumId w:val="1"/>
     <w:lvlOverride w:ilvl="0">
       <w:startOverride w:val="1"/>
     </w:lvlOverride>
   </w:num>
-  <w:num w:numId="8">
+  <w:num w:numId="8" w16cid:durableId="650673709">
     <w:abstractNumId w:val="0"/>
   </w:num>
-  <w:num w:numId="9">
+  <w:num w:numId="9" w16cid:durableId="191765442">
     <w:abstractNumId w:val="0"/>
   </w:num>
-  <w:num w:numId="10">
+  <w:num w:numId="10" w16cid:durableId="1186752783">
     <w:abstractNumId w:val="0"/>
   </w:num>
-  <w:num w:numId="11">
+  <w:num w:numId="11" w16cid:durableId="1435131820">
     <w:abstractNumId w:val="0"/>
   </w:num>
-  <w:num w:numId="12">
+  <w:num w:numId="12" w16cid:durableId="1724518244">
     <w:abstractNumId w:val="0"/>
   </w:num>
-  <w:num w:numId="13">
+  <w:num w:numId="13" w16cid:durableId="1316763246">
     <w:abstractNumId w:val="0"/>
   </w:num>
 </w:numbering>
 </file>
 
 <file path=word/styles.xml><?xml version="1.0" encoding="utf-8"?>
-<w:styles xmlns:w="http://schemas.openxmlformats.org/wordprocessingml/2006/main">
+<w:styles xmlns:mc="http://schemas.openxmlformats.org/markup-compatibility/2006" xmlns:r="http://schemas.openxmlformats.org/officeDocument/2006/relationships" xmlns:w="http://schemas.openxmlformats.org/wordprocessingml/2006/main" xmlns:w14="http://schemas.microsoft.com/office/word/2010/wordml" xmlns:w15="http://schemas.microsoft.com/office/word/2012/wordml" xmlns:w16cex="http://schemas.microsoft.com/office/word/2018/wordml/cex" xmlns:w16cid="http://schemas.microsoft.com/office/word/2016/wordml/cid" xmlns:w16="http://schemas.microsoft.com/office/word/2018/wordml" xmlns:w16sdtdh="http://schemas.microsoft.com/office/word/2020/wordml/sdtdatahash" xmlns:w16sdtfl="http://schemas.microsoft.com/office/word/2024/wordml/sdtformatlock" xmlns:w16se="http://schemas.microsoft.com/office/word/2015/wordml/symex" xmlns:w16du="http://schemas.microsoft.com/office/word/2023/wordml/word16du" mc:Ignorable="w14 w15 w16se w16cid w16 w16cex w16sdtdh w16sdtfl w16du">
   <w:docDefaults>
     <w:rPrDefault>
       <w:rPr>
-        <w:rFonts w:ascii="Calibri" w:hAnsi="Calibri" w:eastAsia="Calibri" w:cs="Calibri"/>
+        <w:rFonts w:ascii="Calibri" w:eastAsia="Calibri" w:hAnsi="Calibri" w:cs="Calibri"/>
         <w:sz w:val="22"/>
         <w:szCs w:val="22"/>
-        <w:lang w:val="en-US"/>
+        <w:lang w:val="en-US" w:eastAsia="en-US" w:bidi="ar-SA"/>
       </w:rPr>
     </w:rPrDefault>
     <w:pPrDefault>
@@ -2122,6 +3053,384 @@
       </w:pPr>
     </w:pPrDefault>
   </w:docDefaults>
+  <w:latentStyles w:defLockedState="0" w:defUIPriority="99" w:defSemiHidden="0" w:defUnhideWhenUsed="0" w:defQFormat="0" w:count="376">
+    <w:lsdException w:name="Normal" w:uiPriority="0" w:qFormat="1"/>
+    <w:lsdException w:name="heading 1" w:uiPriority="9" w:qFormat="1"/>
+    <w:lsdException w:name="heading 2" w:semiHidden="1" w:uiPriority="9" w:unhideWhenUsed="1" w:qFormat="1"/>
+    <w:lsdException w:name="heading 3" w:semiHidden="1" w:uiPriority="9" w:unhideWhenUsed="1" w:qFormat="1"/>
+    <w:lsdException w:name="heading 4" w:semiHidden="1" w:uiPriority="9" w:unhideWhenUsed="1" w:qFormat="1"/>
+    <w:lsdException w:name="heading 5" w:semiHidden="1" w:uiPriority="9" w:unhideWhenUsed="1" w:qFormat="1"/>
+    <w:lsdException w:name="heading 6" w:semiHidden="1" w:uiPriority="9" w:unhideWhenUsed="1" w:qFormat="1"/>
+    <w:lsdException w:name="heading 7" w:semiHidden="1" w:uiPriority="9" w:unhideWhenUsed="1" w:qFormat="1"/>
+    <w:lsdException w:name="heading 8" w:semiHidden="1" w:uiPriority="9" w:unhideWhenUsed="1" w:qFormat="1"/>
+    <w:lsdException w:name="heading 9" w:semiHidden="1" w:uiPriority="9" w:unhideWhenUsed="1" w:qFormat="1"/>
+    <w:lsdException w:name="index 1" w:semiHidden="1" w:unhideWhenUsed="1"/>
+    <w:lsdException w:name="index 2" w:semiHidden="1" w:unhideWhenUsed="1"/>
+    <w:lsdException w:name="index 3" w:semiHidden="1" w:unhideWhenUsed="1"/>
+    <w:lsdException w:name="index 4" w:semiHidden="1" w:unhideWhenUsed="1"/>
+    <w:lsdException w:name="index 5" w:semiHidden="1" w:unhideWhenUsed="1"/>
+    <w:lsdException w:name="index 6" w:semiHidden="1" w:unhideWhenUsed="1"/>
+    <w:lsdException w:name="index 7" w:semiHidden="1" w:unhideWhenUsed="1"/>
+    <w:lsdException w:name="index 8" w:semiHidden="1" w:unhideWhenUsed="1"/>
+    <w:lsdException w:name="index 9" w:semiHidden="1" w:unhideWhenUsed="1"/>
+    <w:lsdException w:name="toc 1" w:semiHidden="1" w:uiPriority="39" w:unhideWhenUsed="1"/>
+    <w:lsdException w:name="toc 2" w:semiHidden="1" w:uiPriority="39" w:unhideWhenUsed="1"/>
+    <w:lsdException w:name="toc 3" w:semiHidden="1" w:uiPriority="39" w:unhideWhenUsed="1"/>
+    <w:lsdException w:name="toc 4" w:semiHidden="1" w:uiPriority="39" w:unhideWhenUsed="1"/>
+    <w:lsdException w:name="toc 5" w:semiHidden="1" w:uiPriority="39" w:unhideWhenUsed="1"/>
+    <w:lsdException w:name="toc 6" w:semiHidden="1" w:uiPriority="39" w:unhideWhenUsed="1"/>
+    <w:lsdException w:name="toc 7" w:semiHidden="1" w:uiPriority="39" w:unhideWhenUsed="1"/>
+    <w:lsdException w:name="toc 8" w:semiHidden="1" w:uiPriority="39" w:unhideWhenUsed="1"/>
+    <w:lsdException w:name="toc 9" w:semiHidden="1" w:uiPriority="39" w:unhideWhenUsed="1"/>
+    <w:lsdException w:name="Normal Indent" w:semiHidden="1" w:unhideWhenUsed="1"/>
+    <w:lsdException w:name="footnote text" w:semiHidden="1" w:unhideWhenUsed="1"/>
+    <w:lsdException w:name="annotation text" w:semiHidden="1" w:unhideWhenUsed="1"/>
+    <w:lsdException w:name="header" w:semiHidden="1" w:unhideWhenUsed="1"/>
+    <w:lsdException w:name="footer" w:semiHidden="1" w:unhideWhenUsed="1"/>
+    <w:lsdException w:name="index heading" w:semiHidden="1" w:unhideWhenUsed="1"/>
+    <w:lsdException w:name="caption" w:semiHidden="1" w:uiPriority="35" w:unhideWhenUsed="1" w:qFormat="1"/>
+    <w:lsdException w:name="table of figures" w:semiHidden="1" w:unhideWhenUsed="1"/>
+    <w:lsdException w:name="envelope address" w:semiHidden="1" w:unhideWhenUsed="1"/>
+    <w:lsdException w:name="envelope return" w:semiHidden="1" w:unhideWhenUsed="1"/>
+    <w:lsdException w:name="footnote reference" w:semiHidden="1" w:unhideWhenUsed="1"/>
+    <w:lsdException w:name="annotation reference" w:semiHidden="1" w:unhideWhenUsed="1"/>
+    <w:lsdException w:name="line number" w:semiHidden="1" w:unhideWhenUsed="1"/>
+    <w:lsdException w:name="page number" w:semiHidden="1" w:unhideWhenUsed="1"/>
+    <w:lsdException w:name="endnote reference" w:semiHidden="1" w:unhideWhenUsed="1"/>
+    <w:lsdException w:name="endnote text" w:semiHidden="1" w:unhideWhenUsed="1"/>
+    <w:lsdException w:name="table of authorities" w:semiHidden="1" w:unhideWhenUsed="1"/>
+    <w:lsdException w:name="macro" w:semiHidden="1" w:unhideWhenUsed="1"/>
+    <w:lsdException w:name="toa heading" w:semiHidden="1" w:unhideWhenUsed="1"/>
+    <w:lsdException w:name="List" w:semiHidden="1" w:unhideWhenUsed="1"/>
+    <w:lsdException w:name="List Bullet" w:semiHidden="1" w:unhideWhenUsed="1"/>
+    <w:lsdException w:name="List Number" w:semiHidden="1" w:unhideWhenUsed="1"/>
+    <w:lsdException w:name="List 2" w:semiHidden="1" w:unhideWhenUsed="1"/>
+    <w:lsdException w:name="List 3" w:semiHidden="1" w:unhideWhenUsed="1"/>
+    <w:lsdException w:name="List 4" w:semiHidden="1" w:unhideWhenUsed="1"/>
+    <w:lsdException w:name="List 5" w:semiHidden="1" w:unhideWhenUsed="1"/>
+    <w:lsdException w:name="List Bullet 2" w:semiHidden="1" w:unhideWhenUsed="1"/>
+    <w:lsdException w:name="List Bullet 3" w:semiHidden="1" w:unhideWhenUsed="1"/>
+    <w:lsdException w:name="List Bullet 4" w:semiHidden="1" w:unhideWhenUsed="1"/>
+    <w:lsdException w:name="List Bullet 5" w:semiHidden="1" w:unhideWhenUsed="1"/>
+    <w:lsdException w:name="List Number 2" w:semiHidden="1" w:unhideWhenUsed="1"/>
+    <w:lsdException w:name="List Number 3" w:semiHidden="1" w:unhideWhenUsed="1"/>
+    <w:lsdException w:name="List Number 4" w:semiHidden="1" w:unhideWhenUsed="1"/>
+    <w:lsdException w:name="List Number 5" w:semiHidden="1" w:unhideWhenUsed="1"/>
+    <w:lsdException w:name="Title" w:uiPriority="10" w:qFormat="1"/>
+    <w:lsdException w:name="Closing" w:semiHidden="1" w:unhideWhenUsed="1"/>
+    <w:lsdException w:name="Signature" w:semiHidden="1" w:unhideWhenUsed="1"/>
+    <w:lsdException w:name="Default Paragraph Font" w:semiHidden="1" w:uiPriority="1" w:unhideWhenUsed="1"/>
+    <w:lsdException w:name="Body Text" w:semiHidden="1" w:unhideWhenUsed="1"/>
+    <w:lsdException w:name="Body Text Indent" w:semiHidden="1" w:unhideWhenUsed="1"/>
+    <w:lsdException w:name="List Continue" w:semiHidden="1" w:unhideWhenUsed="1"/>
+    <w:lsdException w:name="List Continue 2" w:semiHidden="1" w:unhideWhenUsed="1"/>
+    <w:lsdException w:name="List Continue 3" w:semiHidden="1" w:unhideWhenUsed="1"/>
+    <w:lsdException w:name="List Continue 4" w:semiHidden="1" w:unhideWhenUsed="1"/>
+    <w:lsdException w:name="List Continue 5" w:semiHidden="1" w:unhideWhenUsed="1"/>
+    <w:lsdException w:name="Message Header" w:semiHidden="1" w:unhideWhenUsed="1"/>
+    <w:lsdException w:name="Subtitle" w:uiPriority="11" w:qFormat="1"/>
+    <w:lsdException w:name="Salutation" w:semiHidden="1" w:unhideWhenUsed="1"/>
+    <w:lsdException w:name="Date" w:semiHidden="1" w:unhideWhenUsed="1"/>
+    <w:lsdException w:name="Body Text First Indent" w:semiHidden="1" w:unhideWhenUsed="1"/>
+    <w:lsdException w:name="Body Text First Indent 2" w:semiHidden="1" w:unhideWhenUsed="1"/>
+    <w:lsdException w:name="Note Heading" w:semiHidden="1" w:unhideWhenUsed="1"/>
+    <w:lsdException w:name="Body Text 2" w:semiHidden="1" w:unhideWhenUsed="1"/>
+    <w:lsdException w:name="Body Text 3" w:semiHidden="1" w:unhideWhenUsed="1"/>
+    <w:lsdException w:name="Body Text Indent 2" w:semiHidden="1" w:unhideWhenUsed="1"/>
+    <w:lsdException w:name="Body Text Indent 3" w:semiHidden="1" w:unhideWhenUsed="1"/>
+    <w:lsdException w:name="Block Text" w:semiHidden="1" w:unhideWhenUsed="1"/>
+    <w:lsdException w:name="Hyperlink" w:semiHidden="1" w:unhideWhenUsed="1"/>
+    <w:lsdException w:name="FollowedHyperlink" w:semiHidden="1" w:unhideWhenUsed="1"/>
+    <w:lsdException w:name="Strong" w:uiPriority="22" w:qFormat="1"/>
+    <w:lsdException w:name="Emphasis" w:uiPriority="20" w:qFormat="1"/>
+    <w:lsdException w:name="Document Map" w:semiHidden="1" w:unhideWhenUsed="1"/>
+    <w:lsdException w:name="Plain Text" w:semiHidden="1" w:unhideWhenUsed="1"/>
+    <w:lsdException w:name="E-mail Signature" w:semiHidden="1" w:unhideWhenUsed="1"/>
+    <w:lsdException w:name="HTML Top of Form" w:semiHidden="1" w:unhideWhenUsed="1"/>
+    <w:lsdException w:name="HTML Bottom of Form" w:semiHidden="1" w:unhideWhenUsed="1"/>
+    <w:lsdException w:name="Normal (Web)" w:semiHidden="1" w:unhideWhenUsed="1"/>
+    <w:lsdException w:name="HTML Acronym" w:semiHidden="1" w:unhideWhenUsed="1"/>
+    <w:lsdException w:name="HTML Address" w:semiHidden="1" w:unhideWhenUsed="1"/>
+    <w:lsdException w:name="HTML Cite" w:semiHidden="1" w:unhideWhenUsed="1"/>
+    <w:lsdException w:name="HTML Code" w:semiHidden="1" w:unhideWhenUsed="1"/>
+    <w:lsdException w:name="HTML Definition" w:semiHidden="1" w:unhideWhenUsed="1"/>
+    <w:lsdException w:name="HTML Keyboard" w:semiHidden="1" w:unhideWhenUsed="1"/>
+    <w:lsdException w:name="HTML Preformatted" w:semiHidden="1" w:unhideWhenUsed="1"/>
+    <w:lsdException w:name="HTML Sample" w:semiHidden="1" w:unhideWhenUsed="1"/>
+    <w:lsdException w:name="HTML Typewriter" w:semiHidden="1" w:unhideWhenUsed="1"/>
+    <w:lsdException w:name="HTML Variable" w:semiHidden="1" w:unhideWhenUsed="1"/>
+    <w:lsdException w:name="Normal Table" w:semiHidden="1" w:unhideWhenUsed="1"/>
+    <w:lsdException w:name="annotation subject" w:semiHidden="1" w:unhideWhenUsed="1"/>
+    <w:lsdException w:name="No List" w:semiHidden="1" w:unhideWhenUsed="1"/>
+    <w:lsdException w:name="Outline List 1" w:semiHidden="1" w:unhideWhenUsed="1"/>
+    <w:lsdException w:name="Outline List 2" w:semiHidden="1" w:unhideWhenUsed="1"/>
+    <w:lsdException w:name="Outline List 3" w:semiHidden="1" w:unhideWhenUsed="1"/>
+    <w:lsdException w:name="Table Simple 1" w:semiHidden="1" w:unhideWhenUsed="1"/>
+    <w:lsdException w:name="Table Simple 2" w:semiHidden="1" w:unhideWhenUsed="1"/>
+    <w:lsdException w:name="Table Simple 3" w:semiHidden="1" w:unhideWhenUsed="1"/>
+    <w:lsdException w:name="Table Classic 1" w:semiHidden="1" w:unhideWhenUsed="1"/>
+    <w:lsdException w:name="Table Classic 2" w:semiHidden="1" w:unhideWhenUsed="1"/>
+    <w:lsdException w:name="Table Classic 3" w:semiHidden="1" w:unhideWhenUsed="1"/>
+    <w:lsdException w:name="Table Classic 4" w:semiHidden="1" w:unhideWhenUsed="1"/>
+    <w:lsdException w:name="Table Colorful 1" w:semiHidden="1" w:unhideWhenUsed="1"/>
+    <w:lsdException w:name="Table Colorful 2" w:semiHidden="1" w:unhideWhenUsed="1"/>
+    <w:lsdException w:name="Table Colorful 3" w:semiHidden="1" w:unhideWhenUsed="1"/>
+    <w:lsdException w:name="Table Columns 1" w:semiHidden="1" w:unhideWhenUsed="1"/>
+    <w:lsdException w:name="Table Columns 2" w:semiHidden="1" w:unhideWhenUsed="1"/>
+    <w:lsdException w:name="Table Columns 3" w:semiHidden="1" w:unhideWhenUsed="1"/>
+    <w:lsdException w:name="Table Columns 4" w:semiHidden="1" w:unhideWhenUsed="1"/>
+    <w:lsdException w:name="Table Columns 5" w:semiHidden="1" w:unhideWhenUsed="1"/>
+    <w:lsdException w:name="Table Grid 1" w:semiHidden="1" w:unhideWhenUsed="1"/>
+    <w:lsdException w:name="Table Grid 2" w:semiHidden="1" w:unhideWhenUsed="1"/>
+    <w:lsdException w:name="Table Grid 3" w:semiHidden="1" w:unhideWhenUsed="1"/>
+    <w:lsdException w:name="Table Grid 4" w:semiHidden="1" w:unhideWhenUsed="1"/>
+    <w:lsdException w:name="Table Grid 5" w:semiHidden="1" w:unhideWhenUsed="1"/>
+    <w:lsdException w:name="Table Grid 6" w:semiHidden="1" w:unhideWhenUsed="1"/>
+    <w:lsdException w:name="Table Grid 7" w:semiHidden="1" w:unhideWhenUsed="1"/>
+    <w:lsdException w:name="Table Grid 8" w:semiHidden="1" w:unhideWhenUsed="1"/>
+    <w:lsdException w:name="Table List 1" w:semiHidden="1" w:unhideWhenUsed="1"/>
+    <w:lsdException w:name="Table List 2" w:semiHidden="1" w:unhideWhenUsed="1"/>
+    <w:lsdException w:name="Table List 3" w:semiHidden="1" w:unhideWhenUsed="1"/>
+    <w:lsdException w:name="Table List 4" w:semiHidden="1" w:unhideWhenUsed="1"/>
+    <w:lsdException w:name="Table List 5" w:semiHidden="1" w:unhideWhenUsed="1"/>
+    <w:lsdException w:name="Table List 6" w:semiHidden="1" w:unhideWhenUsed="1"/>
+    <w:lsdException w:name="Table List 7" w:semiHidden="1" w:unhideWhenUsed="1"/>
+    <w:lsdException w:name="Table List 8" w:semiHidden="1" w:unhideWhenUsed="1"/>
+    <w:lsdException w:name="Table 3D effects 1" w:semiHidden="1" w:unhideWhenUsed="1"/>
+    <w:lsdException w:name="Table 3D effects 2" w:semiHidden="1" w:unhideWhenUsed="1"/>
+    <w:lsdException w:name="Table 3D effects 3" w:semiHidden="1" w:unhideWhenUsed="1"/>
+    <w:lsdException w:name="Table Contemporary" w:semiHidden="1" w:unhideWhenUsed="1"/>
+    <w:lsdException w:name="Table Elegant" w:semiHidden="1" w:unhideWhenUsed="1"/>
+    <w:lsdException w:name="Table Professional" w:semiHidden="1" w:unhideWhenUsed="1"/>
+    <w:lsdException w:name="Table Subtle 1" w:semiHidden="1" w:unhideWhenUsed="1"/>
+    <w:lsdException w:name="Table Subtle 2" w:semiHidden="1" w:unhideWhenUsed="1"/>
+    <w:lsdException w:name="Table Web 1" w:semiHidden="1" w:unhideWhenUsed="1"/>
+    <w:lsdException w:name="Table Web 2" w:semiHidden="1" w:unhideWhenUsed="1"/>
+    <w:lsdException w:name="Table Web 3" w:semiHidden="1" w:unhideWhenUsed="1"/>
+    <w:lsdException w:name="Balloon Text" w:semiHidden="1" w:unhideWhenUsed="1"/>
+    <w:lsdException w:name="Table Grid" w:uiPriority="39"/>
+    <w:lsdException w:name="Table Theme" w:semiHidden="1" w:unhideWhenUsed="1"/>
+    <w:lsdException w:name="Placeholder Text" w:semiHidden="1"/>
+    <w:lsdException w:name="No Spacing" w:uiPriority="1" w:qFormat="1"/>
+    <w:lsdException w:name="Light Shading" w:uiPriority="60"/>
+    <w:lsdException w:name="Light List" w:uiPriority="61"/>
+    <w:lsdException w:name="Light Grid" w:uiPriority="62"/>
+    <w:lsdException w:name="Medium Shading 1" w:uiPriority="63"/>
+    <w:lsdException w:name="Medium Shading 2" w:uiPriority="64"/>
+    <w:lsdException w:name="Medium List 1" w:uiPriority="65"/>
+    <w:lsdException w:name="Medium List 2" w:uiPriority="66"/>
+    <w:lsdException w:name="Medium Grid 1" w:uiPriority="67"/>
+    <w:lsdException w:name="Medium Grid 2" w:uiPriority="68"/>
+    <w:lsdException w:name="Medium Grid 3" w:uiPriority="69"/>
+    <w:lsdException w:name="Dark List" w:uiPriority="70"/>
+    <w:lsdException w:name="Colorful Shading" w:uiPriority="71"/>
+    <w:lsdException w:name="Colorful List" w:uiPriority="72"/>
+    <w:lsdException w:name="Colorful Grid" w:uiPriority="73"/>
+    <w:lsdException w:name="Light Shading Accent 1" w:uiPriority="60"/>
+    <w:lsdException w:name="Light List Accent 1" w:uiPriority="61"/>
+    <w:lsdException w:name="Light Grid Accent 1" w:uiPriority="62"/>
+    <w:lsdException w:name="Medium Shading 1 Accent 1" w:uiPriority="63"/>
+    <w:lsdException w:name="Medium Shading 2 Accent 1" w:uiPriority="64"/>
+    <w:lsdException w:name="Medium List 1 Accent 1" w:uiPriority="65"/>
+    <w:lsdException w:name="Revision" w:semiHidden="1"/>
+    <w:lsdException w:name="List Paragraph" w:uiPriority="34" w:qFormat="1"/>
+    <w:lsdException w:name="Quote" w:uiPriority="29" w:qFormat="1"/>
+    <w:lsdException w:name="Intense Quote" w:uiPriority="30" w:qFormat="1"/>
+    <w:lsdException w:name="Medium List 2 Accent 1" w:uiPriority="66"/>
+    <w:lsdException w:name="Medium Grid 1 Accent 1" w:uiPriority="67"/>
+    <w:lsdException w:name="Medium Grid 2 Accent 1" w:uiPriority="68"/>
+    <w:lsdException w:name="Medium Grid 3 Accent 1" w:uiPriority="69"/>
+    <w:lsdException w:name="Dark List Accent 1" w:uiPriority="70"/>
+    <w:lsdException w:name="Colorful Shading Accent 1" w:uiPriority="71"/>
+    <w:lsdException w:name="Colorful List Accent 1" w:uiPriority="72"/>
+    <w:lsdException w:name="Colorful Grid Accent 1" w:uiPriority="73"/>
+    <w:lsdException w:name="Light Shading Accent 2" w:uiPriority="60"/>
+    <w:lsdException w:name="Light List Accent 2" w:uiPriority="61"/>
+    <w:lsdException w:name="Light Grid Accent 2" w:uiPriority="62"/>
+    <w:lsdException w:name="Medium Shading 1 Accent 2" w:uiPriority="63"/>
+    <w:lsdException w:name="Medium Shading 2 Accent 2" w:uiPriority="64"/>
+    <w:lsdException w:name="Medium List 1 Accent 2" w:uiPriority="65"/>
+    <w:lsdException w:name="Medium List 2 Accent 2" w:uiPriority="66"/>
+    <w:lsdException w:name="Medium Grid 1 Accent 2" w:uiPriority="67"/>
+    <w:lsdException w:name="Medium Grid 2 Accent 2" w:uiPriority="68"/>
+    <w:lsdException w:name="Medium Grid 3 Accent 2" w:uiPriority="69"/>
+    <w:lsdException w:name="Dark List Accent 2" w:uiPriority="70"/>
+    <w:lsdException w:name="Colorful Shading Accent 2" w:uiPriority="71"/>
+    <w:lsdException w:name="Colorful List Accent 2" w:uiPriority="72"/>
+    <w:lsdException w:name="Colorful Grid Accent 2" w:uiPriority="73"/>
+    <w:lsdException w:name="Light Shading Accent 3" w:uiPriority="60"/>
+    <w:lsdException w:name="Light List Accent 3" w:uiPriority="61"/>
+    <w:lsdException w:name="Light Grid Accent 3" w:uiPriority="62"/>
+    <w:lsdException w:name="Medium Shading 1 Accent 3" w:uiPriority="63"/>
+    <w:lsdException w:name="Medium Shading 2 Accent 3" w:uiPriority="64"/>
+    <w:lsdException w:name="Medium List 1 Accent 3" w:uiPriority="65"/>
+    <w:lsdException w:name="Medium List 2 Accent 3" w:uiPriority="66"/>
+    <w:lsdException w:name="Medium Grid 1 Accent 3" w:uiPriority="67"/>
+    <w:lsdException w:name="Medium Grid 2 Accent 3" w:uiPriority="68"/>
+    <w:lsdException w:name="Medium Grid 3 Accent 3" w:uiPriority="69"/>
+    <w:lsdException w:name="Dark List Accent 3" w:uiPriority="70"/>
+    <w:lsdException w:name="Colorful Shading Accent 3" w:uiPriority="71"/>
+    <w:lsdException w:name="Colorful List Accent 3" w:uiPriority="72"/>
+    <w:lsdException w:name="Colorful Grid Accent 3" w:uiPriority="73"/>
+    <w:lsdException w:name="Light Shading Accent 4" w:uiPriority="60"/>
+    <w:lsdException w:name="Light List Accent 4" w:uiPriority="61"/>
+    <w:lsdException w:name="Light Grid Accent 4" w:uiPriority="62"/>
+    <w:lsdException w:name="Medium Shading 1 Accent 4" w:uiPriority="63"/>
+    <w:lsdException w:name="Medium Shading 2 Accent 4" w:uiPriority="64"/>
+    <w:lsdException w:name="Medium List 1 Accent 4" w:uiPriority="65"/>
+    <w:lsdException w:name="Medium List 2 Accent 4" w:uiPriority="66"/>
+    <w:lsdException w:name="Medium Grid 1 Accent 4" w:uiPriority="67"/>
+    <w:lsdException w:name="Medium Grid 2 Accent 4" w:uiPriority="68"/>
+    <w:lsdException w:name="Medium Grid 3 Accent 4" w:uiPriority="69"/>
+    <w:lsdException w:name="Dark List Accent 4" w:uiPriority="70"/>
+    <w:lsdException w:name="Colorful Shading Accent 4" w:uiPriority="71"/>
+    <w:lsdException w:name="Colorful List Accent 4" w:uiPriority="72"/>
+    <w:lsdException w:name="Colorful Grid Accent 4" w:uiPriority="73"/>
+    <w:lsdException w:name="Light Shading Accent 5" w:uiPriority="60"/>
+    <w:lsdException w:name="Light List Accent 5" w:uiPriority="61"/>
+    <w:lsdException w:name="Light Grid Accent 5" w:uiPriority="62"/>
+    <w:lsdException w:name="Medium Shading 1 Accent 5" w:uiPriority="63"/>
+    <w:lsdException w:name="Medium Shading 2 Accent 5" w:uiPriority="64"/>
+    <w:lsdException w:name="Medium List 1 Accent 5" w:uiPriority="65"/>
+    <w:lsdException w:name="Medium List 2 Accent 5" w:uiPriority="66"/>
+    <w:lsdException w:name="Medium Grid 1 Accent 5" w:uiPriority="67"/>
+    <w:lsdException w:name="Medium Grid 2 Accent 5" w:uiPriority="68"/>
+    <w:lsdException w:name="Medium Grid 3 Accent 5" w:uiPriority="69"/>
+    <w:lsdException w:name="Dark List Accent 5" w:uiPriority="70"/>
+    <w:lsdException w:name="Colorful Shading Accent 5" w:uiPriority="71"/>
+    <w:lsdException w:name="Colorful List Accent 5" w:uiPriority="72"/>
+    <w:lsdException w:name="Colorful Grid Accent 5" w:uiPriority="73"/>
+    <w:lsdException w:name="Light Shading Accent 6" w:uiPriority="60"/>
+    <w:lsdException w:name="Light List Accent 6" w:uiPriority="61"/>
+    <w:lsdException w:name="Light Grid Accent 6" w:uiPriority="62"/>
+    <w:lsdException w:name="Medium Shading 1 Accent 6" w:uiPriority="63"/>
+    <w:lsdException w:name="Medium Shading 2 Accent 6" w:uiPriority="64"/>
+    <w:lsdException w:name="Medium List 1 Accent 6" w:uiPriority="65"/>
+    <w:lsdException w:name="Medium List 2 Accent 6" w:uiPriority="66"/>
+    <w:lsdException w:name="Medium Grid 1 Accent 6" w:uiPriority="67"/>
+    <w:lsdException w:name="Medium Grid 2 Accent 6" w:uiPriority="68"/>
+    <w:lsdException w:name="Medium Grid 3 Accent 6" w:uiPriority="69"/>
+    <w:lsdException w:name="Dark List Accent 6" w:uiPriority="70"/>
+    <w:lsdException w:name="Colorful Shading Accent 6" w:uiPriority="71"/>
+    <w:lsdException w:name="Colorful List Accent 6" w:uiPriority="72"/>
+    <w:lsdException w:name="Colorful Grid Accent 6" w:uiPriority="73"/>
+    <w:lsdException w:name="Subtle Emphasis" w:uiPriority="19" w:qFormat="1"/>
+    <w:lsdException w:name="Intense Emphasis" w:uiPriority="21" w:qFormat="1"/>
+    <w:lsdException w:name="Subtle Reference" w:uiPriority="31" w:qFormat="1"/>
+    <w:lsdException w:name="Intense Reference" w:uiPriority="32" w:qFormat="1"/>
+    <w:lsdException w:name="Book Title" w:uiPriority="33" w:qFormat="1"/>
+    <w:lsdException w:name="Bibliography" w:semiHidden="1" w:uiPriority="37" w:unhideWhenUsed="1"/>
+    <w:lsdException w:name="TOC Heading" w:semiHidden="1" w:uiPriority="39" w:unhideWhenUsed="1" w:qFormat="1"/>
+    <w:lsdException w:name="Plain Table 1" w:uiPriority="41"/>
+    <w:lsdException w:name="Plain Table 2" w:uiPriority="42"/>
+    <w:lsdException w:name="Plain Table 3" w:uiPriority="43"/>
+    <w:lsdException w:name="Plain Table 4" w:uiPriority="44"/>
+    <w:lsdException w:name="Plain Table 5" w:uiPriority="45"/>
+    <w:lsdException w:name="Grid Table Light" w:uiPriority="40"/>
+    <w:lsdException w:name="Grid Table 1 Light" w:uiPriority="46"/>
+    <w:lsdException w:name="Grid Table 2" w:uiPriority="47"/>
+    <w:lsdException w:name="Grid Table 3" w:uiPriority="48"/>
+    <w:lsdException w:name="Grid Table 4" w:uiPriority="49"/>
+    <w:lsdException w:name="Grid Table 5 Dark" w:uiPriority="50"/>
+    <w:lsdException w:name="Grid Table 6 Colorful" w:uiPriority="51"/>
+    <w:lsdException w:name="Grid Table 7 Colorful" w:uiPriority="52"/>
+    <w:lsdException w:name="Grid Table 1 Light Accent 1" w:uiPriority="46"/>
+    <w:lsdException w:name="Grid Table 2 Accent 1" w:uiPriority="47"/>
+    <w:lsdException w:name="Grid Table 3 Accent 1" w:uiPriority="48"/>
+    <w:lsdException w:name="Grid Table 4 Accent 1" w:uiPriority="49"/>
+    <w:lsdException w:name="Grid Table 5 Dark Accent 1" w:uiPriority="50"/>
+    <w:lsdException w:name="Grid Table 6 Colorful Accent 1" w:uiPriority="51"/>
+    <w:lsdException w:name="Grid Table 7 Colorful Accent 1" w:uiPriority="52"/>
+    <w:lsdException w:name="Grid Table 1 Light Accent 2" w:uiPriority="46"/>
+    <w:lsdException w:name="Grid Table 2 Accent 2" w:uiPriority="47"/>
+    <w:lsdException w:name="Grid Table 3 Accent 2" w:uiPriority="48"/>
+    <w:lsdException w:name="Grid Table 4 Accent 2" w:uiPriority="49"/>
+    <w:lsdException w:name="Grid Table 5 Dark Accent 2" w:uiPriority="50"/>
+    <w:lsdException w:name="Grid Table 6 Colorful Accent 2" w:uiPriority="51"/>
+    <w:lsdException w:name="Grid Table 7 Colorful Accent 2" w:uiPriority="52"/>
+    <w:lsdException w:name="Grid Table 1 Light Accent 3" w:uiPriority="46"/>
+    <w:lsdException w:name="Grid Table 2 Accent 3" w:uiPriority="47"/>
+    <w:lsdException w:name="Grid Table 3 Accent 3" w:uiPriority="48"/>
+    <w:lsdException w:name="Grid Table 4 Accent 3" w:uiPriority="49"/>
+    <w:lsdException w:name="Grid Table 5 Dark Accent 3" w:uiPriority="50"/>
+    <w:lsdException w:name="Grid Table 6 Colorful Accent 3" w:uiPriority="51"/>
+    <w:lsdException w:name="Grid Table 7 Colorful Accent 3" w:uiPriority="52"/>
+    <w:lsdException w:name="Grid Table 1 Light Accent 4" w:uiPriority="46"/>
+    <w:lsdException w:name="Grid Table 2 Accent 4" w:uiPriority="47"/>
+    <w:lsdException w:name="Grid Table 3 Accent 4" w:uiPriority="48"/>
+    <w:lsdException w:name="Grid Table 4 Accent 4" w:uiPriority="49"/>
+    <w:lsdException w:name="Grid Table 5 Dark Accent 4" w:uiPriority="50"/>
+    <w:lsdException w:name="Grid Table 6 Colorful Accent 4" w:uiPriority="51"/>
+    <w:lsdException w:name="Grid Table 7 Colorful Accent 4" w:uiPriority="52"/>
+    <w:lsdException w:name="Grid Table 1 Light Accent 5" w:uiPriority="46"/>
+    <w:lsdException w:name="Grid Table 2 Accent 5" w:uiPriority="47"/>
+    <w:lsdException w:name="Grid Table 3 Accent 5" w:uiPriority="48"/>
+    <w:lsdException w:name="Grid Table 4 Accent 5" w:uiPriority="49"/>
+    <w:lsdException w:name="Grid Table 5 Dark Accent 5" w:uiPriority="50"/>
+    <w:lsdException w:name="Grid Table 6 Colorful Accent 5" w:uiPriority="51"/>
+    <w:lsdException w:name="Grid Table 7 Colorful Accent 5" w:uiPriority="52"/>
+    <w:lsdException w:name="Grid Table 1 Light Accent 6" w:uiPriority="46"/>
+    <w:lsdException w:name="Grid Table 2 Accent 6" w:uiPriority="47"/>
+    <w:lsdException w:name="Grid Table 3 Accent 6" w:uiPriority="48"/>
+    <w:lsdException w:name="Grid Table 4 Accent 6" w:uiPriority="49"/>
+    <w:lsdException w:name="Grid Table 5 Dark Accent 6" w:uiPriority="50"/>
+    <w:lsdException w:name="Grid Table 6 Colorful Accent 6" w:uiPriority="51"/>
+    <w:lsdException w:name="Grid Table 7 Colorful Accent 6" w:uiPriority="52"/>
+    <w:lsdException w:name="List Table 1 Light" w:uiPriority="46"/>
+    <w:lsdException w:name="List Table 2" w:uiPriority="47"/>
+    <w:lsdException w:name="List Table 3" w:uiPriority="48"/>
+    <w:lsdException w:name="List Table 4" w:uiPriority="49"/>
+    <w:lsdException w:name="List Table 5 Dark" w:uiPriority="50"/>
+    <w:lsdException w:name="List Table 6 Colorful" w:uiPriority="51"/>
+    <w:lsdException w:name="List Table 7 Colorful" w:uiPriority="52"/>
+    <w:lsdException w:name="List Table 1 Light Accent 1" w:uiPriority="46"/>
+    <w:lsdException w:name="List Table 2 Accent 1" w:uiPriority="47"/>
+    <w:lsdException w:name="List Table 3 Accent 1" w:uiPriority="48"/>
+    <w:lsdException w:name="List Table 4 Accent 1" w:uiPriority="49"/>
+    <w:lsdException w:name="List Table 5 Dark Accent 1" w:uiPriority="50"/>
+    <w:lsdException w:name="List Table 6 Colorful Accent 1" w:uiPriority="51"/>
+    <w:lsdException w:name="List Table 7 Colorful Accent 1" w:uiPriority="52"/>
+    <w:lsdException w:name="List Table 1 Light Accent 2" w:uiPriority="46"/>
+    <w:lsdException w:name="List Table 2 Accent 2" w:uiPriority="47"/>
+    <w:lsdException w:name="List Table 3 Accent 2" w:uiPriority="48"/>
+    <w:lsdException w:name="List Table 4 Accent 2" w:uiPriority="49"/>
+    <w:lsdException w:name="List Table 5 Dark Accent 2" w:uiPriority="50"/>
+    <w:lsdException w:name="List Table 6 Colorful Accent 2" w:uiPriority="51"/>
+    <w:lsdException w:name="List Table 7 Colorful Accent 2" w:uiPriority="52"/>
+    <w:lsdException w:name="List Table 1 Light Accent 3" w:uiPriority="46"/>
+    <w:lsdException w:name="List Table 2 Accent 3" w:uiPriority="47"/>
+    <w:lsdException w:name="List Table 3 Accent 3" w:uiPriority="48"/>
+    <w:lsdException w:name="List Table 4 Accent 3" w:uiPriority="49"/>
+    <w:lsdException w:name="List Table 5 Dark Accent 3" w:uiPriority="50"/>
+    <w:lsdException w:name="List Table 6 Colorful Accent 3" w:uiPriority="51"/>
+    <w:lsdException w:name="List Table 7 Colorful Accent 3" w:uiPriority="52"/>
+    <w:lsdException w:name="List Table 1 Light Accent 4" w:uiPriority="46"/>
+    <w:lsdException w:name="List Table 2 Accent 4" w:uiPriority="47"/>
+    <w:lsdException w:name="List Table 3 Accent 4" w:uiPriority="48"/>
+    <w:lsdException w:name="List Table 4 Accent 4" w:uiPriority="49"/>
+    <w:lsdException w:name="List Table 5 Dark Accent 4" w:uiPriority="50"/>
+    <w:lsdException w:name="List Table 6 Colorful Accent 4" w:uiPriority="51"/>
+    <w:lsdException w:name="List Table 7 Colorful Accent 4" w:uiPriority="52"/>
+    <w:lsdException w:name="List Table 1 Light Accent 5" w:uiPriority="46"/>
+    <w:lsdException w:name="List Table 2 Accent 5" w:uiPriority="47"/>
+    <w:lsdException w:name="List Table 3 Accent 5" w:uiPriority="48"/>
+    <w:lsdException w:name="List Table 4 Accent 5" w:uiPriority="49"/>
+    <w:lsdException w:name="List Table 5 Dark Accent 5" w:uiPriority="50"/>
+    <w:lsdException w:name="List Table 6 Colorful Accent 5" w:uiPriority="51"/>
+    <w:lsdException w:name="List Table 7 Colorful Accent 5" w:uiPriority="52"/>
+    <w:lsdException w:name="List Table 1 Light Accent 6" w:uiPriority="46"/>
+    <w:lsdException w:name="List Table 2 Accent 6" w:uiPriority="47"/>
+    <w:lsdException w:name="List Table 3 Accent 6" w:uiPriority="48"/>
+    <w:lsdException w:name="List Table 4 Accent 6" w:uiPriority="49"/>
+    <w:lsdException w:name="List Table 5 Dark Accent 6" w:uiPriority="50"/>
+    <w:lsdException w:name="List Table 6 Colorful Accent 6" w:uiPriority="51"/>
+    <w:lsdException w:name="List Table 7 Colorful Accent 6" w:uiPriority="52"/>
+    <w:lsdException w:name="Mention" w:semiHidden="1" w:unhideWhenUsed="1"/>
+    <w:lsdException w:name="Smart Hyperlink" w:semiHidden="1" w:unhideWhenUsed="1"/>
+    <w:lsdException w:name="Hashtag" w:semiHidden="1" w:unhideWhenUsed="1"/>
+    <w:lsdException w:name="Unresolved Mention" w:semiHidden="1" w:unhideWhenUsed="1"/>
+    <w:lsdException w:name="Smart Link" w:semiHidden="1" w:unhideWhenUsed="1"/>
+  </w:latentStyles>
   <w:style w:type="paragraph" w:default="1" w:styleId="Normal">
     <w:name w:val="Normal"/>
     <w:qFormat/>
@@ -2130,6 +3439,7 @@
     <w:name w:val="heading 1"/>
     <w:basedOn w:val="Normal"/>
     <w:next w:val="Normal"/>
+    <w:uiPriority w:val="9"/>
     <w:qFormat/>
     <w:pPr>
       <w:keepNext/>
@@ -2145,6 +3455,8 @@
     <w:name w:val="heading 2"/>
     <w:basedOn w:val="Normal"/>
     <w:next w:val="Normal"/>
+    <w:uiPriority w:val="9"/>
+    <w:unhideWhenUsed/>
     <w:qFormat/>
     <w:pPr>
       <w:keepNext/>
@@ -2160,6 +3472,9 @@
     <w:name w:val="heading 3"/>
     <w:basedOn w:val="Normal"/>
     <w:next w:val="Normal"/>
+    <w:uiPriority w:val="9"/>
+    <w:semiHidden/>
+    <w:unhideWhenUsed/>
     <w:qFormat/>
     <w:pPr>
       <w:keepNext/>
@@ -2175,6 +3490,9 @@
     <w:name w:val="heading 4"/>
     <w:basedOn w:val="Normal"/>
     <w:next w:val="Normal"/>
+    <w:uiPriority w:val="9"/>
+    <w:semiHidden/>
+    <w:unhideWhenUsed/>
     <w:qFormat/>
     <w:pPr>
       <w:keepNext/>
@@ -2182,13 +3500,15 @@
     </w:pPr>
     <w:rPr>
       <w:b/>
-      <w:sz w:val="22"/>
     </w:rPr>
   </w:style>
   <w:style w:type="paragraph" w:styleId="Heading5">
     <w:name w:val="heading 5"/>
     <w:basedOn w:val="Normal"/>
     <w:next w:val="Normal"/>
+    <w:uiPriority w:val="9"/>
+    <w:semiHidden/>
+    <w:unhideWhenUsed/>
     <w:qFormat/>
     <w:pPr>
       <w:keepNext/>
@@ -2196,13 +3516,15 @@
     </w:pPr>
     <w:rPr>
       <w:b/>
-      <w:sz w:val="22"/>
     </w:rPr>
   </w:style>
   <w:style w:type="paragraph" w:styleId="Heading6">
     <w:name w:val="heading 6"/>
     <w:basedOn w:val="Normal"/>
     <w:next w:val="Normal"/>
+    <w:uiPriority w:val="9"/>
+    <w:semiHidden/>
+    <w:unhideWhenUsed/>
     <w:qFormat/>
     <w:pPr>
       <w:keepNext/>
@@ -2210,13 +3532,40 @@
     </w:pPr>
     <w:rPr>
       <w:i/>
-      <w:sz w:val="22"/>
     </w:rPr>
+  </w:style>
+  <w:style w:type="character" w:default="1" w:styleId="DefaultParagraphFont">
+    <w:name w:val="Default Paragraph Font"/>
+    <w:uiPriority w:val="1"/>
+    <w:semiHidden/>
+    <w:unhideWhenUsed/>
+  </w:style>
+  <w:style w:type="table" w:default="1" w:styleId="TableNormal">
+    <w:name w:val="Normal Table"/>
+    <w:uiPriority w:val="99"/>
+    <w:semiHidden/>
+    <w:unhideWhenUsed/>
+    <w:tblPr>
+      <w:tblInd w:w="0" w:type="dxa"/>
+      <w:tblCellMar>
+        <w:top w:w="0" w:type="dxa"/>
+        <w:left w:w="108" w:type="dxa"/>
+        <w:bottom w:w="0" w:type="dxa"/>
+        <w:right w:w="108" w:type="dxa"/>
+      </w:tblCellMar>
+    </w:tblPr>
+  </w:style>
+  <w:style w:type="numbering" w:default="1" w:styleId="NoList">
+    <w:name w:val="No List"/>
+    <w:uiPriority w:val="99"/>
+    <w:semiHidden/>
+    <w:unhideWhenUsed/>
   </w:style>
   <w:style w:type="paragraph" w:styleId="Title">
     <w:name w:val="Title"/>
     <w:basedOn w:val="Normal"/>
     <w:next w:val="Normal"/>
+    <w:uiPriority w:val="10"/>
     <w:qFormat/>
     <w:pPr>
       <w:spacing w:after="80"/>
@@ -2231,35 +3580,35 @@
     <w:basedOn w:val="Normal"/>
     <w:qFormat/>
     <w:pPr>
-      <w:ind w:left="720" w:right="720"/>
       <w:pBdr>
         <w:left w:val="single" w:sz="12" w:space="8" w:color="A0A0A0"/>
       </w:pBdr>
+      <w:ind w:left="720" w:right="720"/>
     </w:pPr>
     <w:rPr>
       <w:i/>
       <w:color w:val="404040"/>
     </w:rPr>
   </w:style>
-  <w:style w:type="paragraph" w:styleId="Code">
+  <w:style w:type="paragraph" w:customStyle="1" w:styleId="Code">
     <w:name w:val="Code"/>
     <w:basedOn w:val="Normal"/>
     <w:link w:val="CodeChar"/>
     <w:pPr>
+      <w:shd w:val="clear" w:color="auto" w:fill="F5F5F5"/>
       <w:spacing w:after="0" w:line="240" w:lineRule="auto"/>
       <w:contextualSpacing/>
-      <w:shd w:val="clear" w:color="auto" w:fill="F5F5F5"/>
     </w:pPr>
     <w:rPr>
-      <w:rFonts w:ascii="Consolas" w:hAnsi="Consolas" w:eastAsia="Consolas" w:cs="Consolas"/>
+      <w:rFonts w:ascii="Consolas" w:eastAsia="Consolas" w:hAnsi="Consolas" w:cs="Consolas"/>
       <w:sz w:val="20"/>
     </w:rPr>
   </w:style>
-  <w:style w:type="character" w:styleId="CodeChar">
+  <w:style w:type="character" w:customStyle="1" w:styleId="CodeChar">
     <w:name w:val="Code Char"/>
     <w:link w:val="Code"/>
     <w:rPr>
-      <w:rFonts w:ascii="Consolas" w:hAnsi="Consolas" w:eastAsia="Consolas" w:cs="Consolas"/>
+      <w:rFonts w:ascii="Consolas" w:eastAsia="Consolas" w:hAnsi="Consolas" w:cs="Consolas"/>
       <w:sz w:val="20"/>
       <w:shd w:val="clear" w:color="auto" w:fill="F5F5F5"/>
     </w:rPr>
@@ -2283,7 +3632,6 @@
   <w:style w:type="paragraph" w:styleId="CommentText">
     <w:name w:val="annotation text"/>
     <w:basedOn w:val="Normal"/>
-    <w:link w:val="CommentTextChar"/>
     <w:pPr>
       <w:spacing w:line="240" w:lineRule="auto"/>
     </w:pPr>
@@ -2298,18 +3646,6 @@
       <w:sz w:val="16"/>
       <w:szCs w:val="16"/>
     </w:rPr>
-  </w:style>
-  <w:style w:type="table" w:default="1" w:styleId="TableNormal">
-    <w:name w:val="Normal Table"/>
-    <w:tblPr>
-      <w:tblInd w:w="0" w:type="dxa"/>
-      <w:tblCellMar>
-        <w:top w:w="0" w:type="dxa"/>
-        <w:left w:w="108" w:type="dxa"/>
-        <w:bottom w:w="0" w:type="dxa"/>
-        <w:right w:w="108" w:type="dxa"/>
-      </w:tblCellMar>
-    </w:tblPr>
   </w:style>
   <w:style w:type="table" w:styleId="TableGrid">
     <w:name w:val="Table Grid"/>
@@ -2326,4 +3662,325 @@
     </w:tblPr>
   </w:style>
 </w:styles>
+</file>
+
+<file path=word/theme/theme1.xml><?xml version="1.0" encoding="utf-8"?>
+<a:theme xmlns:a="http://schemas.openxmlformats.org/drawingml/2006/main" name="Office Theme">
+  <a:themeElements>
+    <a:clrScheme name="Office">
+      <a:dk1>
+        <a:sysClr val="windowText" lastClr="000000"/>
+      </a:dk1>
+      <a:lt1>
+        <a:sysClr val="window" lastClr="FFFFFF"/>
+      </a:lt1>
+      <a:dk2>
+        <a:srgbClr val="0E2841"/>
+      </a:dk2>
+      <a:lt2>
+        <a:srgbClr val="E8E8E8"/>
+      </a:lt2>
+      <a:accent1>
+        <a:srgbClr val="156082"/>
+      </a:accent1>
+      <a:accent2>
+        <a:srgbClr val="E97132"/>
+      </a:accent2>
+      <a:accent3>
+        <a:srgbClr val="196B24"/>
+      </a:accent3>
+      <a:accent4>
+        <a:srgbClr val="0F9ED5"/>
+      </a:accent4>
+      <a:accent5>
+        <a:srgbClr val="A02B93"/>
+      </a:accent5>
+      <a:accent6>
+        <a:srgbClr val="4EA72E"/>
+      </a:accent6>
+      <a:hlink>
+        <a:srgbClr val="467886"/>
+      </a:hlink>
+      <a:folHlink>
+        <a:srgbClr val="96607D"/>
+      </a:folHlink>
+    </a:clrScheme>
+    <a:fontScheme name="Office">
+      <a:majorFont>
+        <a:latin typeface="Aptos Display" panose="02110004020202020204"/>
+        <a:ea typeface=""/>
+        <a:cs typeface=""/>
+        <a:font script="Jpan" typeface="游ゴシック Light"/>
+        <a:font script="Hang" typeface="맑은 고딕"/>
+        <a:font script="Hans" typeface="等线 Light"/>
+        <a:font script="Hant" typeface="新細明體"/>
+        <a:font script="Arab" typeface="Times New Roman"/>
+        <a:font script="Hebr" typeface="Times New Roman"/>
+        <a:font script="Thai" typeface="Angsana New"/>
+        <a:font script="Ethi" typeface="Nyala"/>
+        <a:font script="Beng" typeface="Vrinda"/>
+        <a:font script="Gujr" typeface="Shruti"/>
+        <a:font script="Khmr" typeface="MoolBoran"/>
+        <a:font script="Knda" typeface="Tunga"/>
+        <a:font script="Guru" typeface="Raavi"/>
+        <a:font script="Cans" typeface="Euphemia"/>
+        <a:font script="Cher" typeface="Plantagenet Cherokee"/>
+        <a:font script="Yiii" typeface="Microsoft Yi Baiti"/>
+        <a:font script="Tibt" typeface="Microsoft Himalaya"/>
+        <a:font script="Thaa" typeface="MV Boli"/>
+        <a:font script="Deva" typeface="Mangal"/>
+        <a:font script="Telu" typeface="Gautami"/>
+        <a:font script="Taml" typeface="Latha"/>
+        <a:font script="Syrc" typeface="Estrangelo Edessa"/>
+        <a:font script="Orya" typeface="Kalinga"/>
+        <a:font script="Mlym" typeface="Kartika"/>
+        <a:font script="Laoo" typeface="DokChampa"/>
+        <a:font script="Sinh" typeface="Iskoola Pota"/>
+        <a:font script="Mong" typeface="Mongolian Baiti"/>
+        <a:font script="Viet" typeface="Times New Roman"/>
+        <a:font script="Uigh" typeface="Microsoft Uighur"/>
+        <a:font script="Geor" typeface="Sylfaen"/>
+        <a:font script="Armn" typeface="Arial"/>
+        <a:font script="Bugi" typeface="Leelawadee UI"/>
+        <a:font script="Bopo" typeface="Microsoft JhengHei"/>
+        <a:font script="Java" typeface="Javanese Text"/>
+        <a:font script="Lisu" typeface="Segoe UI"/>
+        <a:font script="Mymr" typeface="Myanmar Text"/>
+        <a:font script="Nkoo" typeface="Ebrima"/>
+        <a:font script="Olck" typeface="Nirmala UI"/>
+        <a:font script="Osma" typeface="Ebrima"/>
+        <a:font script="Phag" typeface="Phagspa"/>
+        <a:font script="Syrn" typeface="Estrangelo Edessa"/>
+        <a:font script="Syrj" typeface="Estrangelo Edessa"/>
+        <a:font script="Syre" typeface="Estrangelo Edessa"/>
+        <a:font script="Sora" typeface="Nirmala UI"/>
+        <a:font script="Tale" typeface="Microsoft Tai Le"/>
+        <a:font script="Talu" typeface="Microsoft New Tai Lue"/>
+        <a:font script="Tfng" typeface="Ebrima"/>
+      </a:majorFont>
+      <a:minorFont>
+        <a:latin typeface="Aptos" panose="02110004020202020204"/>
+        <a:ea typeface=""/>
+        <a:cs typeface=""/>
+        <a:font script="Jpan" typeface="游明朝"/>
+        <a:font script="Hang" typeface="맑은 고딕"/>
+        <a:font script="Hans" typeface="等线"/>
+        <a:font script="Hant" typeface="新細明體"/>
+        <a:font script="Arab" typeface="Arial"/>
+        <a:font script="Hebr" typeface="Arial"/>
+        <a:font script="Thai" typeface="Cordia New"/>
+        <a:font script="Ethi" typeface="Nyala"/>
+        <a:font script="Beng" typeface="Vrinda"/>
+        <a:font script="Gujr" typeface="Shruti"/>
+        <a:font script="Khmr" typeface="DaunPenh"/>
+        <a:font script="Knda" typeface="Tunga"/>
+        <a:font script="Guru" typeface="Raavi"/>
+        <a:font script="Cans" typeface="Euphemia"/>
+        <a:font script="Cher" typeface="Plantagenet Cherokee"/>
+        <a:font script="Yiii" typeface="Microsoft Yi Baiti"/>
+        <a:font script="Tibt" typeface="Microsoft Himalaya"/>
+        <a:font script="Thaa" typeface="MV Boli"/>
+        <a:font script="Deva" typeface="Mangal"/>
+        <a:font script="Telu" typeface="Gautami"/>
+        <a:font script="Taml" typeface="Latha"/>
+        <a:font script="Syrc" typeface="Estrangelo Edessa"/>
+        <a:font script="Orya" typeface="Kalinga"/>
+        <a:font script="Mlym" typeface="Kartika"/>
+        <a:font script="Laoo" typeface="DokChampa"/>
+        <a:font script="Sinh" typeface="Iskoola Pota"/>
+        <a:font script="Mong" typeface="Mongolian Baiti"/>
+        <a:font script="Viet" typeface="Arial"/>
+        <a:font script="Uigh" typeface="Microsoft Uighur"/>
+        <a:font script="Geor" typeface="Sylfaen"/>
+        <a:font script="Armn" typeface="Arial"/>
+        <a:font script="Bugi" typeface="Leelawadee UI"/>
+        <a:font script="Bopo" typeface="Microsoft JhengHei"/>
+        <a:font script="Java" typeface="Javanese Text"/>
+        <a:font script="Lisu" typeface="Segoe UI"/>
+        <a:font script="Mymr" typeface="Myanmar Text"/>
+        <a:font script="Nkoo" typeface="Ebrima"/>
+        <a:font script="Olck" typeface="Nirmala UI"/>
+        <a:font script="Osma" typeface="Ebrima"/>
+        <a:font script="Phag" typeface="Phagspa"/>
+        <a:font script="Syrn" typeface="Estrangelo Edessa"/>
+        <a:font script="Syrj" typeface="Estrangelo Edessa"/>
+        <a:font script="Syre" typeface="Estrangelo Edessa"/>
+        <a:font script="Sora" typeface="Nirmala UI"/>
+        <a:font script="Tale" typeface="Microsoft Tai Le"/>
+        <a:font script="Talu" typeface="Microsoft New Tai Lue"/>
+        <a:font script="Tfng" typeface="Ebrima"/>
+      </a:minorFont>
+    </a:fontScheme>
+    <a:fmtScheme name="Office">
+      <a:fillStyleLst>
+        <a:solidFill>
+          <a:schemeClr val="phClr"/>
+        </a:solidFill>
+        <a:gradFill rotWithShape="1">
+          <a:gsLst>
+            <a:gs pos="0">
+              <a:schemeClr val="phClr">
+                <a:lumMod val="110000"/>
+                <a:satMod val="105000"/>
+                <a:tint val="67000"/>
+              </a:schemeClr>
+            </a:gs>
+            <a:gs pos="50000">
+              <a:schemeClr val="phClr">
+                <a:lumMod val="105000"/>
+                <a:satMod val="103000"/>
+                <a:tint val="73000"/>
+              </a:schemeClr>
+            </a:gs>
+            <a:gs pos="100000">
+              <a:schemeClr val="phClr">
+                <a:lumMod val="105000"/>
+                <a:satMod val="109000"/>
+                <a:tint val="81000"/>
+              </a:schemeClr>
+            </a:gs>
+          </a:gsLst>
+          <a:lin ang="5400000" scaled="0"/>
+        </a:gradFill>
+        <a:gradFill rotWithShape="1">
+          <a:gsLst>
+            <a:gs pos="0">
+              <a:schemeClr val="phClr">
+                <a:satMod val="103000"/>
+                <a:lumMod val="102000"/>
+                <a:tint val="94000"/>
+              </a:schemeClr>
+            </a:gs>
+            <a:gs pos="50000">
+              <a:schemeClr val="phClr">
+                <a:satMod val="110000"/>
+                <a:lumMod val="100000"/>
+                <a:shade val="100000"/>
+              </a:schemeClr>
+            </a:gs>
+            <a:gs pos="100000">
+              <a:schemeClr val="phClr">
+                <a:lumMod val="99000"/>
+                <a:satMod val="120000"/>
+                <a:shade val="78000"/>
+              </a:schemeClr>
+            </a:gs>
+          </a:gsLst>
+          <a:lin ang="5400000" scaled="0"/>
+        </a:gradFill>
+      </a:fillStyleLst>
+      <a:lnStyleLst>
+        <a:ln w="12700" cap="flat" cmpd="sng" algn="ctr">
+          <a:solidFill>
+            <a:schemeClr val="phClr"/>
+          </a:solidFill>
+          <a:prstDash val="solid"/>
+          <a:miter lim="800000"/>
+        </a:ln>
+        <a:ln w="19050" cap="flat" cmpd="sng" algn="ctr">
+          <a:solidFill>
+            <a:schemeClr val="phClr"/>
+          </a:solidFill>
+          <a:prstDash val="solid"/>
+          <a:miter lim="800000"/>
+        </a:ln>
+        <a:ln w="25400" cap="flat" cmpd="sng" algn="ctr">
+          <a:solidFill>
+            <a:schemeClr val="phClr"/>
+          </a:solidFill>
+          <a:prstDash val="solid"/>
+          <a:miter lim="800000"/>
+        </a:ln>
+      </a:lnStyleLst>
+      <a:effectStyleLst>
+        <a:effectStyle>
+          <a:effectLst/>
+        </a:effectStyle>
+        <a:effectStyle>
+          <a:effectLst/>
+        </a:effectStyle>
+        <a:effectStyle>
+          <a:effectLst>
+            <a:outerShdw blurRad="57150" dist="19050" dir="5400000" algn="ctr" rotWithShape="0">
+              <a:srgbClr val="000000">
+                <a:alpha val="63000"/>
+              </a:srgbClr>
+            </a:outerShdw>
+          </a:effectLst>
+        </a:effectStyle>
+      </a:effectStyleLst>
+      <a:bgFillStyleLst>
+        <a:solidFill>
+          <a:schemeClr val="phClr"/>
+        </a:solidFill>
+        <a:solidFill>
+          <a:schemeClr val="phClr">
+            <a:tint val="95000"/>
+            <a:satMod val="170000"/>
+          </a:schemeClr>
+        </a:solidFill>
+        <a:gradFill rotWithShape="1">
+          <a:gsLst>
+            <a:gs pos="0">
+              <a:schemeClr val="phClr">
+                <a:tint val="93000"/>
+                <a:satMod val="150000"/>
+                <a:shade val="98000"/>
+                <a:lumMod val="102000"/>
+              </a:schemeClr>
+            </a:gs>
+            <a:gs pos="50000">
+              <a:schemeClr val="phClr">
+                <a:tint val="98000"/>
+                <a:satMod val="130000"/>
+                <a:shade val="90000"/>
+                <a:lumMod val="103000"/>
+              </a:schemeClr>
+            </a:gs>
+            <a:gs pos="100000">
+              <a:schemeClr val="phClr">
+                <a:shade val="63000"/>
+                <a:satMod val="120000"/>
+              </a:schemeClr>
+            </a:gs>
+          </a:gsLst>
+          <a:lin ang="5400000" scaled="0"/>
+        </a:gradFill>
+      </a:bgFillStyleLst>
+    </a:fmtScheme>
+  </a:themeElements>
+  <a:objectDefaults>
+    <a:lnDef>
+      <a:spPr/>
+      <a:bodyPr/>
+      <a:lstStyle/>
+      <a:style>
+        <a:lnRef idx="2">
+          <a:schemeClr val="accent1"/>
+        </a:lnRef>
+        <a:fillRef idx="0">
+          <a:schemeClr val="accent1"/>
+        </a:fillRef>
+        <a:effectRef idx="1">
+          <a:schemeClr val="accent1"/>
+        </a:effectRef>
+        <a:fontRef idx="minor">
+          <a:schemeClr val="tx1"/>
+        </a:fontRef>
+      </a:style>
+    </a:lnDef>
+  </a:objectDefaults>
+  <a:extraClrSchemeLst/>
+  <a:extLst>
+    <a:ext uri="{05A4C25C-085E-4340-85A3-A5531E510DB2}">
+      <thm15:themeFamily xmlns:thm15="http://schemas.microsoft.com/office/thememl/2012/main" name="Office Theme" id="{2E142A2C-CD16-42D6-873A-C26D2A0506FA}" vid="{1BDDFF52-6CD6-40A5-AB3C-68EB2F1E4D0A}"/>
+    </a:ext>
+  </a:extLst>
+</a:theme>
+</file>
+
+<file path=docMetadata/LabelInfo.xml><?xml version="1.0" encoding="utf-8"?>
+<clbl:labelList xmlns:clbl="http://schemas.microsoft.com/office/2020/mipLabelMetadata">
+  <clbl:label id="{35b66c34-d3f7-4b74-a2f5-5e46d77d2b05}" enabled="1" method="Privileged" siteId="{1e586649-7317-42fb-8949-66923d34ba7e}" contentBits="0" removed="0"/>
+</clbl:labelList>
 </file>
</xml_diff>